<commit_message>
Add interpretation to manual: the African water paradox, worked and named
</commit_message>
<xml_diff>
--- a/manual/qrfactor_manual.docx
+++ b/manual/qrfactor_manual.docx
@@ -882,7 +882,233 @@
     </w:p>
     <w:p>
       <w:pPr>
-        <w:pStyle w:val="BodyText"/>
+        <w:pStyle w:val="BlockText"/>
+      </w:pPr>
+      <w:r>
+        <w:rPr>
+          <w:bCs/>
+          <w:b/>
+        </w:rPr>
+        <w:t xml:space="preserve">The problem this manual solves — Africa’s water paradox.</w:t>
+      </w:r>
+      <w:r>
+        <w:t xml:space="preserve"> </w:t>
+      </w:r>
+      <w:r>
+        <w:t xml:space="preserve">Africa is described, in the same breath, as</w:t>
+      </w:r>
+      <w:r>
+        <w:t xml:space="preserve"> </w:t>
+      </w:r>
+      <w:r>
+        <w:rPr>
+          <w:iCs/>
+          <w:i/>
+        </w:rPr>
+        <w:t xml:space="preserve">water-rich</w:t>
+      </w:r>
+      <w:r>
+        <w:t xml:space="preserve"> </w:t>
+      </w:r>
+      <w:r>
+        <w:t xml:space="preserve">and</w:t>
+      </w:r>
+      <w:r>
+        <w:t xml:space="preserve"> </w:t>
+      </w:r>
+      <w:r>
+        <w:rPr>
+          <w:iCs/>
+          <w:i/>
+        </w:rPr>
+        <w:t xml:space="preserve">water-stressed</w:t>
+      </w:r>
+      <w:r>
+        <w:t xml:space="preserve">.</w:t>
+      </w:r>
+      <w:r>
+        <w:t xml:space="preserve"> </w:t>
+      </w:r>
+      <w:r>
+        <w:t xml:space="preserve">Both cannot be true everywhere. The question has two sides that a single</w:t>
+      </w:r>
+      <w:r>
+        <w:t xml:space="preserve"> </w:t>
+      </w:r>
+      <w:r>
+        <w:t xml:space="preserve">method rarely answers together:</w:t>
+      </w:r>
+      <w:r>
+        <w:t xml:space="preserve"> </w:t>
+      </w:r>
+      <w:r>
+        <w:rPr>
+          <w:bCs/>
+          <w:b/>
+        </w:rPr>
+        <w:t xml:space="preserve">(R-mode)</w:t>
+      </w:r>
+      <w:r>
+        <w:t xml:space="preserve"> </w:t>
+      </w:r>
+      <w:r>
+        <w:t xml:space="preserve">which measurements define how a</w:t>
+      </w:r>
+      <w:r>
+        <w:t xml:space="preserve"> </w:t>
+      </w:r>
+      <w:r>
+        <w:t xml:space="preserve">country uses water, and</w:t>
+      </w:r>
+      <w:r>
+        <w:t xml:space="preserve"> </w:t>
+      </w:r>
+      <w:r>
+        <w:rPr>
+          <w:bCs/>
+          <w:b/>
+        </w:rPr>
+        <w:t xml:space="preserve">(Q-mode)</w:t>
+      </w:r>
+      <w:r>
+        <w:t xml:space="preserve"> </w:t>
+      </w:r>
+      <w:r>
+        <w:t xml:space="preserve">which countries resemble each other in</w:t>
+      </w:r>
+      <w:r>
+        <w:t xml:space="preserve"> </w:t>
+      </w:r>
+      <w:r>
+        <w:t xml:space="preserve">that use? We put the bundled data — domestic, industrial and agricultural</w:t>
+      </w:r>
+      <w:r>
+        <w:t xml:space="preserve"> </w:t>
+      </w:r>
+      <w:r>
+        <w:t xml:space="preserve">withdrawal, renewable resources, total and per-capita withdrawal for 50</w:t>
+      </w:r>
+      <w:r>
+        <w:t xml:space="preserve"> </w:t>
+      </w:r>
+      <w:r>
+        <w:t xml:space="preserve">African countries — through one</w:t>
+      </w:r>
+      <w:r>
+        <w:t xml:space="preserve"> </w:t>
+      </w:r>
+      <w:r>
+        <w:rPr>
+          <w:rStyle w:val="VerbatimChar"/>
+        </w:rPr>
+        <w:t xml:space="preserve">qrfactor()</w:t>
+      </w:r>
+      <w:r>
+        <w:t xml:space="preserve"> </w:t>
+      </w:r>
+      <w:r>
+        <w:t xml:space="preserve">call and read the answer off the</w:t>
+      </w:r>
+      <w:r>
+        <w:t xml:space="preserve"> </w:t>
+      </w:r>
+      <w:r>
+        <w:t xml:space="preserve">biplot and the map. The finding, developed across this manual:</w:t>
+      </w:r>
+      <w:r>
+        <w:t xml:space="preserve"> </w:t>
+      </w:r>
+      <w:r>
+        <w:rPr>
+          <w:bCs/>
+          <w:b/>
+        </w:rPr>
+        <w:t xml:space="preserve">water</w:t>
+      </w:r>
+      <w:r>
+        <w:rPr>
+          <w:bCs/>
+          <w:b/>
+        </w:rPr>
+        <w:t xml:space="preserve"> </w:t>
+      </w:r>
+      <w:r>
+        <w:rPr>
+          <w:iCs/>
+          <w:i/>
+          <w:bCs/>
+          <w:b/>
+        </w:rPr>
+        <w:t xml:space="preserve">use</w:t>
+      </w:r>
+      <w:r>
+        <w:rPr>
+          <w:bCs/>
+          <w:b/>
+        </w:rPr>
+        <w:t xml:space="preserve"> </w:t>
+      </w:r>
+      <w:r>
+        <w:rPr>
+          <w:bCs/>
+          <w:b/>
+        </w:rPr>
+        <w:t xml:space="preserve">and water</w:t>
+      </w:r>
+      <w:r>
+        <w:rPr>
+          <w:bCs/>
+          <w:b/>
+        </w:rPr>
+        <w:t xml:space="preserve"> </w:t>
+      </w:r>
+      <w:r>
+        <w:rPr>
+          <w:iCs/>
+          <w:i/>
+          <w:bCs/>
+          <w:b/>
+        </w:rPr>
+        <w:t xml:space="preserve">availability</w:t>
+      </w:r>
+      <w:r>
+        <w:rPr>
+          <w:bCs/>
+          <w:b/>
+        </w:rPr>
+        <w:t xml:space="preserve"> </w:t>
+      </w:r>
+      <w:r>
+        <w:rPr>
+          <w:bCs/>
+          <w:b/>
+        </w:rPr>
+        <w:t xml:space="preserve">are almost independent, and the heaviest users are</w:t>
+      </w:r>
+      <w:r>
+        <w:rPr>
+          <w:bCs/>
+          <w:b/>
+        </w:rPr>
+        <w:t xml:space="preserve"> </w:t>
+      </w:r>
+      <w:r>
+        <w:rPr>
+          <w:bCs/>
+          <w:b/>
+        </w:rPr>
+        <w:t xml:space="preserve">on average the least resource-endowed.</w:t>
+      </w:r>
+      <w:r>
+        <w:t xml:space="preserve"> </w:t>
+      </w:r>
+      <w:r>
+        <w:t xml:space="preserve">That is the paradox, quantified.</w:t>
+      </w:r>
+    </w:p>
+    <w:p>
+      <w:pPr>
+        <w:pStyle w:val="FirstParagraph"/>
       </w:pPr>
       <w:r>
         <w:t xml:space="preserve">Six analyses come out of the one function:</w:t>
@@ -2210,6 +2436,146 @@
         <w:t xml:space="preserve">)</w:t>
       </w:r>
     </w:p>
+    <w:p>
+      <w:pPr>
+        <w:pStyle w:val="FirstParagraph"/>
+      </w:pPr>
+      <w:r>
+        <w:rPr>
+          <w:bCs/>
+          <w:b/>
+        </w:rPr>
+        <w:t xml:space="preserve">Reading the raw data.</w:t>
+      </w:r>
+      <w:r>
+        <w:t xml:space="preserve"> </w:t>
+      </w:r>
+      <w:r>
+        <w:t xml:space="preserve">Even before any analysis, the extremes hint at the</w:t>
+      </w:r>
+      <w:r>
+        <w:t xml:space="preserve"> </w:t>
+      </w:r>
+      <w:r>
+        <w:t xml:space="preserve">paradox. The largest</w:t>
+      </w:r>
+      <w:r>
+        <w:t xml:space="preserve"> </w:t>
+      </w:r>
+      <w:r>
+        <w:rPr>
+          <w:iCs/>
+          <w:i/>
+        </w:rPr>
+        <w:t xml:space="preserve">agricultural</w:t>
+      </w:r>
+      <w:r>
+        <w:t xml:space="preserve"> </w:t>
+      </w:r>
+      <w:r>
+        <w:t xml:space="preserve">users are</w:t>
+      </w:r>
+      <w:r>
+        <w:t xml:space="preserve"> </w:t>
+      </w:r>
+      <w:r>
+        <w:rPr>
+          <w:bCs/>
+          <w:b/>
+        </w:rPr>
+        <w:t xml:space="preserve">Swaziland (839), Sudan (835),</w:t>
+      </w:r>
+      <w:r>
+        <w:rPr>
+          <w:bCs/>
+          <w:b/>
+        </w:rPr>
+        <w:t xml:space="preserve"> </w:t>
+      </w:r>
+      <w:r>
+        <w:rPr>
+          <w:bCs/>
+          <w:b/>
+        </w:rPr>
+        <w:t xml:space="preserve">Madagascar (710) and Egypt (695)</w:t>
+      </w:r>
+      <w:r>
+        <w:t xml:space="preserve"> </w:t>
+      </w:r>
+      <w:r>
+        <w:t xml:space="preserve">— arid or irrigation-dependent economies.</w:t>
+      </w:r>
+      <w:r>
+        <w:t xml:space="preserve"> </w:t>
+      </w:r>
+      <w:r>
+        <w:t xml:space="preserve">The largest</w:t>
+      </w:r>
+      <w:r>
+        <w:t xml:space="preserve"> </w:t>
+      </w:r>
+      <w:r>
+        <w:rPr>
+          <w:iCs/>
+          <w:i/>
+        </w:rPr>
+        <w:t xml:space="preserve">renewable resource</w:t>
+      </w:r>
+      <w:r>
+        <w:t xml:space="preserve"> </w:t>
+      </w:r>
+      <w:r>
+        <w:t xml:space="preserve">holders are</w:t>
+      </w:r>
+      <w:r>
+        <w:t xml:space="preserve"> </w:t>
+      </w:r>
+      <w:r>
+        <w:rPr>
+          <w:bCs/>
+          <w:b/>
+        </w:rPr>
+        <w:t xml:space="preserve">Congo (1283) and the Democratic</w:t>
+      </w:r>
+      <w:r>
+        <w:rPr>
+          <w:bCs/>
+          <w:b/>
+        </w:rPr>
+        <w:t xml:space="preserve"> </w:t>
+      </w:r>
+      <w:r>
+        <w:rPr>
+          <w:bCs/>
+          <w:b/>
+        </w:rPr>
+        <w:t xml:space="preserve">Republic of the Congo (832)</w:t>
+      </w:r>
+      <w:r>
+        <w:t xml:space="preserve"> </w:t>
+      </w:r>
+      <w:r>
+        <w:t xml:space="preserve">— equatorial, water-abundant, yet with tiny</w:t>
+      </w:r>
+      <w:r>
+        <w:t xml:space="preserve"> </w:t>
+      </w:r>
+      <w:r>
+        <w:t xml:space="preserve">withdrawals (Congo’s total is 0.03). So the countries with the most water are</w:t>
+      </w:r>
+      <w:r>
+        <w:t xml:space="preserve"> </w:t>
+      </w:r>
+      <w:r>
+        <w:t xml:space="preserve">not the ones using the most. Factor analysis turns that eyeball impression into</w:t>
+      </w:r>
+      <w:r>
+        <w:t xml:space="preserve"> </w:t>
+      </w:r>
+      <w:r>
+        <w:t xml:space="preserve">measured axes.</w:t>
+      </w:r>
+    </w:p>
     <w:bookmarkEnd w:id="25"/>
     <w:bookmarkStart w:id="26" w:name="qrfactor-the-one-call"/>
     <w:p>
@@ -2749,6 +3115,389 @@
       </w:r>
       <w:r>
         <w:t xml:space="preserve">29).</w:t>
+      </w:r>
+    </w:p>
+    <w:p>
+      <w:pPr>
+        <w:pStyle w:val="BodyText"/>
+      </w:pPr>
+      <w:r>
+        <w:rPr>
+          <w:bCs/>
+          <w:b/>
+        </w:rPr>
+        <w:t xml:space="preserve">Where those axes come from — the correlations.</w:t>
+      </w:r>
+      <w:r>
+        <w:t xml:space="preserve"> </w:t>
+      </w:r>
+      <w:r>
+        <w:t xml:space="preserve">The decomposition is driven</w:t>
+      </w:r>
+      <w:r>
+        <w:t xml:space="preserve"> </w:t>
+      </w:r>
+      <w:r>
+        <w:t xml:space="preserve">by the correlation matrix (</w:t>
+      </w:r>
+      <w:r>
+        <w:rPr>
+          <w:rStyle w:val="VerbatimChar"/>
+        </w:rPr>
+        <w:t xml:space="preserve">round(mod$correlation, 2)</w:t>
+      </w:r>
+      <w:r>
+        <w:t xml:space="preserve">):</w:t>
+      </w:r>
+    </w:p>
+    <w:p>
+      <w:pPr>
+        <w:pStyle w:val="SourceCode"/>
+      </w:pPr>
+      <w:r>
+        <w:rPr>
+          <w:rStyle w:val="VerbatimChar"/>
+        </w:rPr>
+        <w:t xml:space="preserve">           Domestic Industry Agricultur Resources withdrawal perCapitaW</w:t>
+      </w:r>
+      <w:r>
+        <w:br/>
+      </w:r>
+      <w:r>
+        <w:rPr>
+          <w:rStyle w:val="VerbatimChar"/>
+        </w:rPr>
+        <w:t xml:space="preserve">Domestic      1.00     0.75       0.33     -0.19       0.29       0.44</w:t>
+      </w:r>
+      <w:r>
+        <w:br/>
+      </w:r>
+      <w:r>
+        <w:rPr>
+          <w:rStyle w:val="VerbatimChar"/>
+        </w:rPr>
+        <w:t xml:space="preserve">Industry      0.75     1.00       0.47     -0.15       0.65       0.55</w:t>
+      </w:r>
+      <w:r>
+        <w:br/>
+      </w:r>
+      <w:r>
+        <w:rPr>
+          <w:rStyle w:val="VerbatimChar"/>
+        </w:rPr>
+        <w:t xml:space="preserve">Agricultur    0.33     0.47       1.00     -0.12       0.63       0.99</w:t>
+      </w:r>
+      <w:r>
+        <w:br/>
+      </w:r>
+      <w:r>
+        <w:rPr>
+          <w:rStyle w:val="VerbatimChar"/>
+        </w:rPr>
+        <w:t xml:space="preserve">Resources    -0.19    -0.15      -0.12      1.00      -0.04      -0.14</w:t>
+      </w:r>
+      <w:r>
+        <w:br/>
+      </w:r>
+      <w:r>
+        <w:rPr>
+          <w:rStyle w:val="VerbatimChar"/>
+        </w:rPr>
+        <w:t xml:space="preserve">withdrawal    0.29     0.65       0.63     -0.04       1.00       0.65</w:t>
+      </w:r>
+      <w:r>
+        <w:br/>
+      </w:r>
+      <w:r>
+        <w:rPr>
+          <w:rStyle w:val="VerbatimChar"/>
+        </w:rPr>
+        <w:t xml:space="preserve">perCapitaW    0.44     0.55       0.99     -0.14       0.65       1.00</w:t>
+      </w:r>
+    </w:p>
+    <w:p>
+      <w:pPr>
+        <w:pStyle w:val="FirstParagraph"/>
+      </w:pPr>
+      <w:r>
+        <w:t xml:space="preserve">Three facts jump out, and together they</w:t>
+      </w:r>
+      <w:r>
+        <w:t xml:space="preserve"> </w:t>
+      </w:r>
+      <w:r>
+        <w:rPr>
+          <w:iCs/>
+          <w:i/>
+        </w:rPr>
+        <w:t xml:space="preserve">are</w:t>
+      </w:r>
+      <w:r>
+        <w:t xml:space="preserve"> </w:t>
+      </w:r>
+      <w:r>
+        <w:t xml:space="preserve">the paradox:</w:t>
+      </w:r>
+      <w:r>
+        <w:t xml:space="preserve"> </w:t>
+      </w:r>
+      <w:r>
+        <w:t xml:space="preserve">1.</w:t>
+      </w:r>
+      <w:r>
+        <w:t xml:space="preserve"> </w:t>
+      </w:r>
+      <w:r>
+        <w:rPr>
+          <w:rStyle w:val="VerbatimChar"/>
+          <w:bCs/>
+          <w:b/>
+        </w:rPr>
+        <w:t xml:space="preserve">Agricultur</w:t>
+      </w:r>
+      <w:r>
+        <w:rPr>
+          <w:bCs/>
+          <w:b/>
+        </w:rPr>
+        <w:t xml:space="preserve"> </w:t>
+      </w:r>
+      <w:r>
+        <w:rPr>
+          <w:bCs/>
+          <w:b/>
+        </w:rPr>
+        <w:t xml:space="preserve">and</w:t>
+      </w:r>
+      <w:r>
+        <w:rPr>
+          <w:bCs/>
+          <w:b/>
+        </w:rPr>
+        <w:t xml:space="preserve"> </w:t>
+      </w:r>
+      <w:r>
+        <w:rPr>
+          <w:rStyle w:val="VerbatimChar"/>
+          <w:bCs/>
+          <w:b/>
+        </w:rPr>
+        <w:t xml:space="preserve">perCapitaW</w:t>
+      </w:r>
+      <w:r>
+        <w:rPr>
+          <w:bCs/>
+          <w:b/>
+        </w:rPr>
+        <w:t xml:space="preserve"> </w:t>
+      </w:r>
+      <w:r>
+        <w:rPr>
+          <w:bCs/>
+          <w:b/>
+        </w:rPr>
+        <w:t xml:space="preserve">correlate 0.99</w:t>
+      </w:r>
+      <w:r>
+        <w:t xml:space="preserve"> </w:t>
+      </w:r>
+      <w:r>
+        <w:t xml:space="preserve">— in Africa, per-capita</w:t>
+      </w:r>
+      <w:r>
+        <w:t xml:space="preserve"> </w:t>
+      </w:r>
+      <w:r>
+        <w:t xml:space="preserve">water use is agricultural water use; irrigation dominates the total. (This</w:t>
+      </w:r>
+      <w:r>
+        <w:t xml:space="preserve"> </w:t>
+      </w:r>
+      <w:r>
+        <w:t xml:space="preserve">near-duplication is why the 6th eigenvalue collapses to zero; Section 29.)</w:t>
+      </w:r>
+      <w:r>
+        <w:t xml:space="preserve"> </w:t>
+      </w:r>
+      <w:r>
+        <w:t xml:space="preserve">2.</w:t>
+      </w:r>
+      <w:r>
+        <w:t xml:space="preserve"> </w:t>
+      </w:r>
+      <w:r>
+        <w:rPr>
+          <w:rStyle w:val="VerbatimChar"/>
+          <w:bCs/>
+          <w:b/>
+        </w:rPr>
+        <w:t xml:space="preserve">Domestic</w:t>
+      </w:r>
+      <w:r>
+        <w:rPr>
+          <w:bCs/>
+          <w:b/>
+        </w:rPr>
+        <w:t xml:space="preserve"> </w:t>
+      </w:r>
+      <w:r>
+        <w:rPr>
+          <w:bCs/>
+          <w:b/>
+        </w:rPr>
+        <w:t xml:space="preserve">and</w:t>
+      </w:r>
+      <w:r>
+        <w:rPr>
+          <w:bCs/>
+          <w:b/>
+        </w:rPr>
+        <w:t xml:space="preserve"> </w:t>
+      </w:r>
+      <w:r>
+        <w:rPr>
+          <w:rStyle w:val="VerbatimChar"/>
+          <w:bCs/>
+          <w:b/>
+        </w:rPr>
+        <w:t xml:space="preserve">Industry</w:t>
+      </w:r>
+      <w:r>
+        <w:rPr>
+          <w:bCs/>
+          <w:b/>
+        </w:rPr>
+        <w:t xml:space="preserve"> </w:t>
+      </w:r>
+      <w:r>
+        <w:rPr>
+          <w:bCs/>
+          <w:b/>
+        </w:rPr>
+        <w:t xml:space="preserve">correlate 0.75</w:t>
+      </w:r>
+      <w:r>
+        <w:t xml:space="preserve"> </w:t>
+      </w:r>
+      <w:r>
+        <w:t xml:space="preserve">— the two</w:t>
+      </w:r>
+      <w:r>
+        <w:t xml:space="preserve"> </w:t>
+      </w:r>
+      <w:r>
+        <w:t xml:space="preserve">“</w:t>
+      </w:r>
+      <w:r>
+        <w:t xml:space="preserve">modern-economy</w:t>
+      </w:r>
+      <w:r>
+        <w:t xml:space="preserve">”</w:t>
+      </w:r>
+      <w:r>
+        <w:t xml:space="preserve"> </w:t>
+      </w:r>
+      <w:r>
+        <w:t xml:space="preserve">uses</w:t>
+      </w:r>
+      <w:r>
+        <w:t xml:space="preserve"> </w:t>
+      </w:r>
+      <w:r>
+        <w:t xml:space="preserve">rise together with development and urbanisation.</w:t>
+      </w:r>
+      <w:r>
+        <w:t xml:space="preserve"> </w:t>
+      </w:r>
+      <w:r>
+        <w:t xml:space="preserve">3.</w:t>
+      </w:r>
+      <w:r>
+        <w:t xml:space="preserve"> </w:t>
+      </w:r>
+      <w:r>
+        <w:rPr>
+          <w:rStyle w:val="VerbatimChar"/>
+          <w:bCs/>
+          <w:b/>
+        </w:rPr>
+        <w:t xml:space="preserve">Resources</w:t>
+      </w:r>
+      <w:r>
+        <w:rPr>
+          <w:bCs/>
+          <w:b/>
+        </w:rPr>
+        <w:t xml:space="preserve"> </w:t>
+      </w:r>
+      <w:r>
+        <w:rPr>
+          <w:bCs/>
+          <w:b/>
+        </w:rPr>
+        <w:t xml:space="preserve">correlates with everything at −0.04 to −0.19</w:t>
+      </w:r>
+      <w:r>
+        <w:t xml:space="preserve"> </w:t>
+      </w:r>
+      <w:r>
+        <w:t xml:space="preserve">— renewable</w:t>
+      </w:r>
+      <w:r>
+        <w:t xml:space="preserve"> </w:t>
+      </w:r>
+      <w:r>
+        <w:rPr>
+          <w:iCs/>
+          <w:i/>
+        </w:rPr>
+        <w:t xml:space="preserve">availability</w:t>
+      </w:r>
+      <w:r>
+        <w:t xml:space="preserve"> </w:t>
+      </w:r>
+      <w:r>
+        <w:t xml:space="preserve">is essentially uncorrelated with (if anything, weakly opposed</w:t>
+      </w:r>
+      <w:r>
+        <w:t xml:space="preserve"> </w:t>
+      </w:r>
+      <w:r>
+        <w:t xml:space="preserve">to)</w:t>
+      </w:r>
+      <w:r>
+        <w:t xml:space="preserve"> </w:t>
+      </w:r>
+      <w:r>
+        <w:rPr>
+          <w:iCs/>
+          <w:i/>
+        </w:rPr>
+        <w:t xml:space="preserve">use</w:t>
+      </w:r>
+      <w:r>
+        <w:t xml:space="preserve">. Having water and using water are decoupled. This is why</w:t>
+      </w:r>
+      <w:r>
+        <w:t xml:space="preserve"> </w:t>
+      </w:r>
+      <w:r>
+        <w:rPr>
+          <w:rStyle w:val="VerbatimChar"/>
+        </w:rPr>
+        <w:t xml:space="preserve">Resources</w:t>
+      </w:r>
+      <w:r>
+        <w:t xml:space="preserve"> </w:t>
+      </w:r>
+      <w:r>
+        <w:t xml:space="preserve">gets a factor almost to itself (Factor 2), instead of joining the</w:t>
+      </w:r>
+      <w:r>
+        <w:t xml:space="preserve"> </w:t>
+      </w:r>
+      <w:r>
+        <w:t xml:space="preserve">use variables on Factor 1.</w:t>
       </w:r>
     </w:p>
     <w:p>
@@ -3850,19 +4599,239 @@
         <w:pStyle w:val="BodyText"/>
       </w:pPr>
       <w:r>
-        <w:t xml:space="preserve">The axis labels carry the variance explained (Factor 1 = 56%, Factor 2 = 18%).</w:t>
-      </w:r>
-      <w:r>
-        <w:t xml:space="preserve"> </w:t>
-      </w:r>
-      <w:r>
-        <w:t xml:space="preserve">Variables pointing the same way are correlated; countries near a variable score</w:t>
-      </w:r>
-      <w:r>
-        <w:t xml:space="preserve"> </w:t>
-      </w:r>
-      <w:r>
-        <w:t xml:space="preserve">high on it.</w:t>
+        <w:rPr>
+          <w:bCs/>
+          <w:b/>
+        </w:rPr>
+        <w:t xml:space="preserve">Reading the biplot</w:t>
+      </w:r>
+      <w:r>
+        <w:t xml:space="preserve"> </w:t>
+      </w:r>
+      <w:r>
+        <w:t xml:space="preserve">(axis labels carry the variance: Factor 1 = 56%, Factor</w:t>
+      </w:r>
+      <w:r>
+        <w:t xml:space="preserve"> </w:t>
+      </w:r>
+      <w:r>
+        <w:t xml:space="preserve">2 = 18%). Variables pointing the same way are correlated; a country plotted near</w:t>
+      </w:r>
+      <w:r>
+        <w:t xml:space="preserve"> </w:t>
+      </w:r>
+      <w:r>
+        <w:t xml:space="preserve">a variable scores high on it. The plot resolves into meaningful regions:</w:t>
+      </w:r>
+    </w:p>
+    <w:p>
+      <w:pPr>
+        <w:numPr>
+          <w:ilvl w:val="0"/>
+          <w:numId w:val="1002"/>
+        </w:numPr>
+        <w:pStyle w:val="Compact"/>
+      </w:pPr>
+      <w:r>
+        <w:rPr>
+          <w:bCs/>
+          <w:b/>
+        </w:rPr>
+        <w:t xml:space="preserve">Far left — the heavy users.</w:t>
+      </w:r>
+      <w:r>
+        <w:t xml:space="preserve"> </w:t>
+      </w:r>
+      <w:r>
+        <w:t xml:space="preserve">Point 16 (</w:t>
+      </w:r>
+      <w:r>
+        <w:rPr>
+          <w:bCs/>
+          <w:b/>
+        </w:rPr>
+        <w:t xml:space="preserve">Egypt</w:t>
+      </w:r>
+      <w:r>
+        <w:t xml:space="preserve">) is the extreme, joined by</w:t>
+      </w:r>
+      <w:r>
+        <w:t xml:space="preserve"> </w:t>
+      </w:r>
+      <w:r>
+        <w:t xml:space="preserve">42 (</w:t>
+      </w:r>
+      <w:r>
+        <w:rPr>
+          <w:bCs/>
+          <w:b/>
+        </w:rPr>
+        <w:t xml:space="preserve">Sudan</w:t>
+      </w:r>
+      <w:r>
+        <w:t xml:space="preserve">), 28 (</w:t>
+      </w:r>
+      <w:r>
+        <w:rPr>
+          <w:bCs/>
+          <w:b/>
+        </w:rPr>
+        <w:t xml:space="preserve">Madagascar</w:t>
+      </w:r>
+      <w:r>
+        <w:t xml:space="preserve">), 27 (</w:t>
+      </w:r>
+      <w:r>
+        <w:rPr>
+          <w:bCs/>
+          <w:b/>
+        </w:rPr>
+        <w:t xml:space="preserve">Libya</w:t>
+      </w:r>
+      <w:r>
+        <w:t xml:space="preserve">), 30 (</w:t>
+      </w:r>
+      <w:r>
+        <w:rPr>
+          <w:bCs/>
+          <w:b/>
+        </w:rPr>
+        <w:t xml:space="preserve">Mali</w:t>
+      </w:r>
+      <w:r>
+        <w:t xml:space="preserve">), 31</w:t>
+      </w:r>
+      <w:r>
+        <w:t xml:space="preserve"> </w:t>
+      </w:r>
+      <w:r>
+        <w:t xml:space="preserve">(</w:t>
+      </w:r>
+      <w:r>
+        <w:rPr>
+          <w:bCs/>
+          <w:b/>
+        </w:rPr>
+        <w:t xml:space="preserve">Mauritania</w:t>
+      </w:r>
+      <w:r>
+        <w:t xml:space="preserve">) and 43 (</w:t>
+      </w:r>
+      <w:r>
+        <w:rPr>
+          <w:bCs/>
+          <w:b/>
+        </w:rPr>
+        <w:t xml:space="preserve">Swaziland</w:t>
+      </w:r>
+      <w:r>
+        <w:t xml:space="preserve">) — the big agricultural abstractors,</w:t>
+      </w:r>
+      <w:r>
+        <w:t xml:space="preserve"> </w:t>
+      </w:r>
+      <w:r>
+        <w:t xml:space="preserve">sitting where the</w:t>
+      </w:r>
+      <w:r>
+        <w:t xml:space="preserve"> </w:t>
+      </w:r>
+      <w:r>
+        <w:rPr>
+          <w:rStyle w:val="VerbatimChar"/>
+        </w:rPr>
+        <w:t xml:space="preserve">Agricultur</w:t>
+      </w:r>
+      <w:r>
+        <w:t xml:space="preserve">/</w:t>
+      </w:r>
+      <w:r>
+        <w:rPr>
+          <w:rStyle w:val="VerbatimChar"/>
+        </w:rPr>
+        <w:t xml:space="preserve">perCapitaW</w:t>
+      </w:r>
+      <w:r>
+        <w:t xml:space="preserve">/</w:t>
+      </w:r>
+      <w:r>
+        <w:rPr>
+          <w:rStyle w:val="VerbatimChar"/>
+        </w:rPr>
+        <w:t xml:space="preserve">withdrawal</w:t>
+      </w:r>
+      <w:r>
+        <w:t xml:space="preserve"> </w:t>
+      </w:r>
+      <w:r>
+        <w:t xml:space="preserve">arrows point. High</w:t>
+      </w:r>
+      <w:r>
+        <w:t xml:space="preserve"> </w:t>
+      </w:r>
+      <w:r>
+        <w:t xml:space="preserve">water use =</w:t>
+      </w:r>
+      <w:r>
+        <w:t xml:space="preserve"> </w:t>
+      </w:r>
+      <w:r>
+        <w:rPr>
+          <w:bCs/>
+          <w:b/>
+        </w:rPr>
+        <w:t xml:space="preserve">negative Factor 1</w:t>
+      </w:r>
+      <w:r>
+        <w:t xml:space="preserve">.</w:t>
+      </w:r>
+    </w:p>
+    <w:p>
+      <w:pPr>
+        <w:numPr>
+          <w:ilvl w:val="0"/>
+          <w:numId w:val="1002"/>
+        </w:numPr>
+        <w:pStyle w:val="Compact"/>
+      </w:pPr>
+      <w:r>
+        <w:rPr>
+          <w:bCs/>
+          <w:b/>
+        </w:rPr>
+        <w:t xml:space="preserve">Bottom-right — the water-rich.</w:t>
+      </w:r>
+      <w:r>
+        <w:t xml:space="preserve"> </w:t>
+      </w:r>
+      <w:r>
+        <w:t xml:space="preserve">Points 12 (</w:t>
+      </w:r>
+      <w:r>
+        <w:rPr>
+          <w:bCs/>
+          <w:b/>
+        </w:rPr>
+        <w:t xml:space="preserve">Congo</w:t>
+      </w:r>
+      <w:r>
+        <w:t xml:space="preserve">) and 14 (</w:t>
+      </w:r>
+      <w:r>
+        <w:rPr>
+          <w:bCs/>
+          <w:b/>
+        </w:rPr>
+        <w:t xml:space="preserve">DR Congo</w:t>
+      </w:r>
+      <w:r>
+        <w:t xml:space="preserve">)</w:t>
+      </w:r>
+      <w:r>
+        <w:t xml:space="preserve"> </w:t>
+      </w:r>
+      <w:r>
+        <w:t xml:space="preserve">sit alone by the</w:t>
       </w:r>
       <w:r>
         <w:t xml:space="preserve"> </w:t>
@@ -3877,19 +4846,192 @@
         <w:t xml:space="preserve"> </w:t>
       </w:r>
       <w:r>
-        <w:t xml:space="preserve">sits opposite the use variables, and the countries</w:t>
-      </w:r>
-      <w:r>
-        <w:t xml:space="preserve"> </w:t>
-      </w:r>
-      <w:r>
-        <w:t xml:space="preserve">strung along the bottom-right (e.g. 12, 14) are the resource-heavy,</w:t>
-      </w:r>
-      <w:r>
-        <w:t xml:space="preserve"> </w:t>
-      </w:r>
-      <w:r>
-        <w:t xml:space="preserve">low-use cases.</w:t>
+        <w:t xml:space="preserve">arrow: vast renewable supply, almost no</w:t>
+      </w:r>
+      <w:r>
+        <w:t xml:space="preserve"> </w:t>
+      </w:r>
+      <w:r>
+        <w:t xml:space="preserve">withdrawal. High resources =</w:t>
+      </w:r>
+      <w:r>
+        <w:t xml:space="preserve"> </w:t>
+      </w:r>
+      <w:r>
+        <w:rPr>
+          <w:bCs/>
+          <w:b/>
+        </w:rPr>
+        <w:t xml:space="preserve">negative Factor 2</w:t>
+      </w:r>
+      <w:r>
+        <w:t xml:space="preserve">.</w:t>
+      </w:r>
+    </w:p>
+    <w:p>
+      <w:pPr>
+        <w:numPr>
+          <w:ilvl w:val="0"/>
+          <w:numId w:val="1002"/>
+        </w:numPr>
+        <w:pStyle w:val="Compact"/>
+      </w:pPr>
+      <w:r>
+        <w:rPr>
+          <w:bCs/>
+          <w:b/>
+        </w:rPr>
+        <w:t xml:space="preserve">Top — the domestic/industrial economies.</w:t>
+      </w:r>
+      <w:r>
+        <w:t xml:space="preserve"> </w:t>
+      </w:r>
+      <w:r>
+        <w:t xml:space="preserve">Point 17 (</w:t>
+      </w:r>
+      <w:r>
+        <w:rPr>
+          <w:bCs/>
+          <w:b/>
+        </w:rPr>
+        <w:t xml:space="preserve">Equatorial Guinea</w:t>
+      </w:r>
+      <w:r>
+        <w:t xml:space="preserve">,</w:t>
+      </w:r>
+      <w:r>
+        <w:t xml:space="preserve"> </w:t>
+      </w:r>
+      <w:r>
+        <w:t xml:space="preserve">domestic use 132, agriculture ~1) with 1 (</w:t>
+      </w:r>
+      <w:r>
+        <w:rPr>
+          <w:bCs/>
+          <w:b/>
+        </w:rPr>
+        <w:t xml:space="preserve">Algeria</w:t>
+      </w:r>
+      <w:r>
+        <w:t xml:space="preserve">) and 4 (</w:t>
+      </w:r>
+      <w:r>
+        <w:rPr>
+          <w:bCs/>
+          <w:b/>
+        </w:rPr>
+        <w:t xml:space="preserve">Botswana</w:t>
+      </w:r>
+      <w:r>
+        <w:t xml:space="preserve">),</w:t>
+      </w:r>
+      <w:r>
+        <w:t xml:space="preserve"> </w:t>
+      </w:r>
+      <w:r>
+        <w:t xml:space="preserve">where</w:t>
+      </w:r>
+      <w:r>
+        <w:t xml:space="preserve"> </w:t>
+      </w:r>
+      <w:r>
+        <w:rPr>
+          <w:rStyle w:val="VerbatimChar"/>
+        </w:rPr>
+        <w:t xml:space="preserve">Domestic</w:t>
+      </w:r>
+      <w:r>
+        <w:t xml:space="preserve"> </w:t>
+      </w:r>
+      <w:r>
+        <w:t xml:space="preserve">and</w:t>
+      </w:r>
+      <w:r>
+        <w:t xml:space="preserve"> </w:t>
+      </w:r>
+      <w:r>
+        <w:rPr>
+          <w:rStyle w:val="VerbatimChar"/>
+        </w:rPr>
+        <w:t xml:space="preserve">Industry</w:t>
+      </w:r>
+      <w:r>
+        <w:t xml:space="preserve"> </w:t>
+      </w:r>
+      <w:r>
+        <w:t xml:space="preserve">point.</w:t>
+      </w:r>
+    </w:p>
+    <w:p>
+      <w:pPr>
+        <w:numPr>
+          <w:ilvl w:val="0"/>
+          <w:numId w:val="1002"/>
+        </w:numPr>
+        <w:pStyle w:val="Compact"/>
+      </w:pPr>
+      <w:r>
+        <w:rPr>
+          <w:bCs/>
+          <w:b/>
+        </w:rPr>
+        <w:t xml:space="preserve">Dense right cluster — the low-use majority.</w:t>
+      </w:r>
+      <w:r>
+        <w:t xml:space="preserve"> </w:t>
+      </w:r>
+      <w:r>
+        <w:t xml:space="preserve">The tight knot of small</w:t>
+      </w:r>
+      <w:r>
+        <w:t xml:space="preserve"> </w:t>
+      </w:r>
+      <w:r>
+        <w:t xml:space="preserve">economies (Comoros, Cape Verde, Djibouti, Gambia, Rwanda, Togo, Uganda…).</w:t>
+      </w:r>
+    </w:p>
+    <w:p>
+      <w:pPr>
+        <w:pStyle w:val="FirstParagraph"/>
+      </w:pPr>
+      <w:r>
+        <w:t xml:space="preserve">So the axes read as:</w:t>
+      </w:r>
+      <w:r>
+        <w:t xml:space="preserve"> </w:t>
+      </w:r>
+      <w:r>
+        <w:rPr>
+          <w:bCs/>
+          <w:b/>
+        </w:rPr>
+        <w:t xml:space="preserve">Factor 1 = the overall scale of (agriculture-driven)</w:t>
+      </w:r>
+      <w:r>
+        <w:rPr>
+          <w:bCs/>
+          <w:b/>
+        </w:rPr>
+        <w:t xml:space="preserve"> </w:t>
+      </w:r>
+      <w:r>
+        <w:rPr>
+          <w:bCs/>
+          <w:b/>
+        </w:rPr>
+        <w:t xml:space="preserve">water use; Factor 2 = the resource-versus-use contrast.</w:t>
+      </w:r>
+      <w:r>
+        <w:t xml:space="preserve"> </w:t>
+      </w:r>
+      <w:r>
+        <w:t xml:space="preserve">Congo and Egypt land</w:t>
+      </w:r>
+      <w:r>
+        <w:t xml:space="preserve"> </w:t>
+      </w:r>
+      <w:r>
+        <w:t xml:space="preserve">almost as far apart as the data allows — one has the water, the other uses it.</w:t>
       </w:r>
     </w:p>
     <w:p>
@@ -6254,7 +7396,7 @@
     </w:p>
     <w:bookmarkEnd w:id="60"/>
     <w:bookmarkEnd w:id="61"/>
-    <w:bookmarkStart w:id="83" w:name="part-2-spatial-mode"/>
+    <w:bookmarkStart w:id="84" w:name="part-2-spatial-mode"/>
     <w:p>
       <w:pPr>
         <w:pStyle w:val="Heading1"/>
@@ -7949,6 +9091,494 @@
         <w:t xml:space="preserve">, exactly as Factor 1 suggested.</w:t>
       </w:r>
     </w:p>
+    <w:p>
+      <w:pPr>
+        <w:pStyle w:val="BodyText"/>
+      </w:pPr>
+      <w:r>
+        <w:rPr>
+          <w:bCs/>
+          <w:b/>
+        </w:rPr>
+        <w:t xml:space="preserve">The two African water profiles.</w:t>
+      </w:r>
+      <w:r>
+        <w:t xml:space="preserve"> </w:t>
+      </w:r>
+      <w:r>
+        <w:t xml:space="preserve">The cluster means (</w:t>
+      </w:r>
+      <w:r>
+        <w:rPr>
+          <w:rStyle w:val="VerbatimChar"/>
+        </w:rPr>
+        <w:t xml:space="preserve">plot="cluster"</w:t>
+      </w:r>
+      <w:r>
+        <w:t xml:space="preserve"> </w:t>
+      </w:r>
+      <w:r>
+        <w:t xml:space="preserve">also</w:t>
+      </w:r>
+      <w:r>
+        <w:t xml:space="preserve"> </w:t>
+      </w:r>
+      <w:r>
+        <w:t xml:space="preserve">prints these) name the groups:</w:t>
+      </w:r>
+    </w:p>
+    <w:tbl>
+      <w:tblPr>
+        <w:tblStyle w:val="Table"/>
+        <w:tblW w:type="auto" w:w="0"/>
+        <w:tblLook w:firstRow="1" w:lastRow="0" w:firstColumn="0" w:lastColumn="0" w:noHBand="0" w:noVBand="0" w:val="0020"/>
+        <w:jc w:val="start"/>
+      </w:tblPr>
+      <w:tblGrid>
+        <w:gridCol w:w="2640"/>
+        <w:gridCol w:w="2640"/>
+        <w:gridCol w:w="2640"/>
+      </w:tblGrid>
+      <w:tr>
+        <w:trPr>
+          <w:tblHeader w:val="true"/>
+        </w:trPr>
+        <w:tc>
+          <w:tcPr/>
+          <w:p>
+            <w:pPr>
+              <w:pStyle w:val="Compact"/>
+              <w:jc w:val="left"/>
+            </w:pPr>
+            <w:r>
+              <w:t xml:space="preserve">Variable</w:t>
+            </w:r>
+          </w:p>
+        </w:tc>
+        <w:tc>
+          <w:tcPr/>
+          <w:p>
+            <w:pPr>
+              <w:pStyle w:val="Compact"/>
+              <w:jc w:val="right"/>
+            </w:pPr>
+            <w:r>
+              <w:t xml:space="preserve">Cluster A (light users)</w:t>
+            </w:r>
+          </w:p>
+        </w:tc>
+        <w:tc>
+          <w:tcPr/>
+          <w:p>
+            <w:pPr>
+              <w:pStyle w:val="Compact"/>
+              <w:jc w:val="right"/>
+            </w:pPr>
+            <w:r>
+              <w:t xml:space="preserve">Cluster B (heavy users)</w:t>
+            </w:r>
+          </w:p>
+        </w:tc>
+      </w:tr>
+      <w:tr>
+        <w:tc>
+          <w:tcPr/>
+          <w:p>
+            <w:pPr>
+              <w:pStyle w:val="Compact"/>
+              <w:jc w:val="left"/>
+            </w:pPr>
+            <w:r>
+              <w:t xml:space="preserve">Domestic</w:t>
+            </w:r>
+          </w:p>
+        </w:tc>
+        <w:tc>
+          <w:tcPr/>
+          <w:p>
+            <w:pPr>
+              <w:pStyle w:val="Compact"/>
+              <w:jc w:val="right"/>
+            </w:pPr>
+            <w:r>
+              <w:t xml:space="preserve">10.7</w:t>
+            </w:r>
+          </w:p>
+        </w:tc>
+        <w:tc>
+          <w:tcPr/>
+          <w:p>
+            <w:pPr>
+              <w:pStyle w:val="Compact"/>
+              <w:jc w:val="right"/>
+            </w:pPr>
+            <w:r>
+              <w:t xml:space="preserve">52.9</w:t>
+            </w:r>
+          </w:p>
+        </w:tc>
+      </w:tr>
+      <w:tr>
+        <w:tc>
+          <w:tcPr/>
+          <w:p>
+            <w:pPr>
+              <w:pStyle w:val="Compact"/>
+              <w:jc w:val="left"/>
+            </w:pPr>
+            <w:r>
+              <w:t xml:space="preserve">Industry</w:t>
+            </w:r>
+          </w:p>
+        </w:tc>
+        <w:tc>
+          <w:tcPr/>
+          <w:p>
+            <w:pPr>
+              <w:pStyle w:val="Compact"/>
+              <w:jc w:val="right"/>
+            </w:pPr>
+            <w:r>
+              <w:t xml:space="preserve">3.3</w:t>
+            </w:r>
+          </w:p>
+        </w:tc>
+        <w:tc>
+          <w:tcPr/>
+          <w:p>
+            <w:pPr>
+              <w:pStyle w:val="Compact"/>
+              <w:jc w:val="right"/>
+            </w:pPr>
+            <w:r>
+              <w:t xml:space="preserve">17.6</w:t>
+            </w:r>
+          </w:p>
+        </w:tc>
+      </w:tr>
+      <w:tr>
+        <w:tc>
+          <w:tcPr/>
+          <w:p>
+            <w:pPr>
+              <w:pStyle w:val="Compact"/>
+              <w:jc w:val="left"/>
+            </w:pPr>
+            <w:r>
+              <w:t xml:space="preserve">Agricultur</w:t>
+            </w:r>
+          </w:p>
+        </w:tc>
+        <w:tc>
+          <w:tcPr/>
+          <w:p>
+            <w:pPr>
+              <w:pStyle w:val="Compact"/>
+              <w:jc w:val="right"/>
+            </w:pPr>
+            <w:r>
+              <w:t xml:space="preserve">56</w:t>
+            </w:r>
+          </w:p>
+        </w:tc>
+        <w:tc>
+          <w:tcPr/>
+          <w:p>
+            <w:pPr>
+              <w:pStyle w:val="Compact"/>
+              <w:jc w:val="right"/>
+            </w:pPr>
+            <w:r>
+              <w:t xml:space="preserve">448</w:t>
+            </w:r>
+          </w:p>
+        </w:tc>
+      </w:tr>
+      <w:tr>
+        <w:tc>
+          <w:tcPr/>
+          <w:p>
+            <w:pPr>
+              <w:pStyle w:val="Compact"/>
+              <w:jc w:val="left"/>
+            </w:pPr>
+            <w:r>
+              <w:t xml:space="preserve">withdrawal</w:t>
+            </w:r>
+          </w:p>
+        </w:tc>
+        <w:tc>
+          <w:tcPr/>
+          <w:p>
+            <w:pPr>
+              <w:pStyle w:val="Compact"/>
+              <w:jc w:val="right"/>
+            </w:pPr>
+            <w:r>
+              <w:t xml:space="preserve">1.2</w:t>
+            </w:r>
+          </w:p>
+        </w:tc>
+        <w:tc>
+          <w:tcPr/>
+          <w:p>
+            <w:pPr>
+              <w:pStyle w:val="Compact"/>
+              <w:jc w:val="right"/>
+            </w:pPr>
+            <w:r>
+              <w:t xml:space="preserve">14.1</w:t>
+            </w:r>
+          </w:p>
+        </w:tc>
+      </w:tr>
+      <w:tr>
+        <w:tc>
+          <w:tcPr/>
+          <w:p>
+            <w:pPr>
+              <w:pStyle w:val="Compact"/>
+              <w:jc w:val="left"/>
+            </w:pPr>
+            <w:r>
+              <w:t xml:space="preserve">perCapitaW</w:t>
+            </w:r>
+          </w:p>
+        </w:tc>
+        <w:tc>
+          <w:tcPr/>
+          <w:p>
+            <w:pPr>
+              <w:pStyle w:val="Compact"/>
+              <w:jc w:val="right"/>
+            </w:pPr>
+            <w:r>
+              <w:t xml:space="preserve">70</w:t>
+            </w:r>
+          </w:p>
+        </w:tc>
+        <w:tc>
+          <w:tcPr/>
+          <w:p>
+            <w:pPr>
+              <w:pStyle w:val="Compact"/>
+              <w:jc w:val="right"/>
+            </w:pPr>
+            <w:r>
+              <w:t xml:space="preserve">519</w:t>
+            </w:r>
+          </w:p>
+        </w:tc>
+      </w:tr>
+      <w:tr>
+        <w:tc>
+          <w:tcPr/>
+          <w:p>
+            <w:pPr>
+              <w:pStyle w:val="Compact"/>
+              <w:jc w:val="left"/>
+            </w:pPr>
+            <w:r>
+              <w:rPr>
+                <w:bCs/>
+                <w:b/>
+              </w:rPr>
+              <w:t xml:space="preserve">Resources</w:t>
+            </w:r>
+          </w:p>
+        </w:tc>
+        <w:tc>
+          <w:tcPr/>
+          <w:p>
+            <w:pPr>
+              <w:pStyle w:val="Compact"/>
+              <w:jc w:val="right"/>
+            </w:pPr>
+            <w:r>
+              <w:rPr>
+                <w:bCs/>
+                <w:b/>
+              </w:rPr>
+              <w:t xml:space="preserve">128</w:t>
+            </w:r>
+          </w:p>
+        </w:tc>
+        <w:tc>
+          <w:tcPr/>
+          <w:p>
+            <w:pPr>
+              <w:pStyle w:val="Compact"/>
+              <w:jc w:val="right"/>
+            </w:pPr>
+            <w:r>
+              <w:rPr>
+                <w:bCs/>
+                <w:b/>
+              </w:rPr>
+              <w:t xml:space="preserve">59</w:t>
+            </w:r>
+          </w:p>
+        </w:tc>
+      </w:tr>
+    </w:tbl>
+    <w:p>
+      <w:pPr>
+        <w:pStyle w:val="BodyText"/>
+      </w:pPr>
+      <w:r>
+        <w:t xml:space="preserve">Cluster</w:t>
+      </w:r>
+      <w:r>
+        <w:t xml:space="preserve"> </w:t>
+      </w:r>
+      <w:r>
+        <w:rPr>
+          <w:bCs/>
+          <w:b/>
+        </w:rPr>
+        <w:t xml:space="preserve">B</w:t>
+      </w:r>
+      <w:r>
+        <w:t xml:space="preserve"> </w:t>
+      </w:r>
+      <w:r>
+        <w:t xml:space="preserve">— the heavy users (Egypt, Sudan, Libya, Mali, South Africa,</w:t>
+      </w:r>
+      <w:r>
+        <w:t xml:space="preserve"> </w:t>
+      </w:r>
+      <w:r>
+        <w:t xml:space="preserve">Morocco…) — withdraws roughly</w:t>
+      </w:r>
+      <w:r>
+        <w:t xml:space="preserve"> </w:t>
+      </w:r>
+      <w:r>
+        <w:rPr>
+          <w:bCs/>
+          <w:b/>
+        </w:rPr>
+        <w:t xml:space="preserve">8× more agricultural water</w:t>
+      </w:r>
+      <w:r>
+        <w:t xml:space="preserve"> </w:t>
+      </w:r>
+      <w:r>
+        <w:t xml:space="preserve">per country than</w:t>
+      </w:r>
+      <w:r>
+        <w:t xml:space="preserve"> </w:t>
+      </w:r>
+      <w:r>
+        <w:t xml:space="preserve">Cluster A, yet sits on</w:t>
+      </w:r>
+      <w:r>
+        <w:t xml:space="preserve"> </w:t>
+      </w:r>
+      <w:r>
+        <w:rPr>
+          <w:bCs/>
+          <w:b/>
+        </w:rPr>
+        <w:t xml:space="preserve">less than half the renewable resource</w:t>
+      </w:r>
+      <w:r>
+        <w:t xml:space="preserve"> </w:t>
+      </w:r>
+      <w:r>
+        <w:t xml:space="preserve">(59 vs 128).</w:t>
+      </w:r>
+      <w:r>
+        <w:t xml:space="preserve"> </w:t>
+      </w:r>
+      <w:r>
+        <w:t xml:space="preserve">Cluster</w:t>
+      </w:r>
+      <w:r>
+        <w:t xml:space="preserve"> </w:t>
+      </w:r>
+      <w:r>
+        <w:rPr>
+          <w:bCs/>
+          <w:b/>
+        </w:rPr>
+        <w:t xml:space="preserve">A</w:t>
+      </w:r>
+      <w:r>
+        <w:t xml:space="preserve"> </w:t>
+      </w:r>
+      <w:r>
+        <w:t xml:space="preserve">— the light users — is the water-rich majority.</w:t>
+      </w:r>
+      <w:r>
+        <w:t xml:space="preserve"> </w:t>
+      </w:r>
+      <w:r>
+        <w:rPr>
+          <w:bCs/>
+          <w:b/>
+        </w:rPr>
+        <w:t xml:space="preserve">This is the</w:t>
+      </w:r>
+      <w:r>
+        <w:rPr>
+          <w:bCs/>
+          <w:b/>
+        </w:rPr>
+        <w:t xml:space="preserve"> </w:t>
+      </w:r>
+      <w:r>
+        <w:rPr>
+          <w:bCs/>
+          <w:b/>
+        </w:rPr>
+        <w:t xml:space="preserve">paradox measured on the ground: the countries drawing down the most water are,</w:t>
+      </w:r>
+      <w:r>
+        <w:rPr>
+          <w:bCs/>
+          <w:b/>
+        </w:rPr>
+        <w:t xml:space="preserve"> </w:t>
+      </w:r>
+      <w:r>
+        <w:rPr>
+          <w:bCs/>
+          <w:b/>
+        </w:rPr>
+        <w:t xml:space="preserve">on average, the least well supplied.</w:t>
+      </w:r>
+      <w:r>
+        <w:t xml:space="preserve"> </w:t>
+      </w:r>
+      <w:r>
+        <w:t xml:space="preserve">The analysis has turned a rhetorical</w:t>
+      </w:r>
+      <w:r>
+        <w:t xml:space="preserve"> </w:t>
+      </w:r>
+      <w:r>
+        <w:t xml:space="preserve">claim (</w:t>
+      </w:r>
+      <w:r>
+        <w:t xml:space="preserve">“</w:t>
+      </w:r>
+      <w:r>
+        <w:t xml:space="preserve">water-rich yet water-stressed</w:t>
+      </w:r>
+      <w:r>
+        <w:t xml:space="preserve">”</w:t>
+      </w:r>
+      <w:r>
+        <w:t xml:space="preserve">) into two quantified groups a</w:t>
+      </w:r>
+      <w:r>
+        <w:t xml:space="preserve"> </w:t>
+      </w:r>
+      <w:r>
+        <w:t xml:space="preserve">policymaker can name and map.</w:t>
+      </w:r>
+    </w:p>
     <w:bookmarkEnd w:id="76"/>
     <w:bookmarkStart w:id="80" w:name="distributional-diagnostics-typediagnose"/>
     <w:p>
@@ -8670,31 +10300,22 @@
         <w:t xml:space="preserve">#&gt; [1] "qrfactor"</w:t>
       </w:r>
     </w:p>
-    <w:p>
-      <w:r>
-        <w:pict>
-          <v:rect style="width:0;height:1.5pt" o:hralign="center" o:hrstd="t" o:hr="t"/>
-        </w:pict>
-      </w:r>
-    </w:p>
     <w:bookmarkEnd w:id="82"/>
-    <w:bookmarkEnd w:id="83"/>
-    <w:bookmarkStart w:id="94" w:name="part-3-reference"/>
-    <w:p>
-      <w:pPr>
-        <w:pStyle w:val="Heading1"/>
-      </w:pPr>
-      <w:r>
-        <w:t xml:space="preserve">PART 3 — Reference</w:t>
-      </w:r>
-    </w:p>
-    <w:bookmarkStart w:id="84" w:name="qrfactor-argument-reference"/>
+    <w:bookmarkStart w:id="83" w:name="b.-the-african-water-paradox-in-numbers"/>
     <w:p>
       <w:pPr>
         <w:pStyle w:val="Heading2"/>
       </w:pPr>
       <w:r>
-        <w:t xml:space="preserve">25.</w:t>
+        <w:t xml:space="preserve">24b. The African water paradox, in numbers</w:t>
+      </w:r>
+    </w:p>
+    <w:p>
+      <w:pPr>
+        <w:pStyle w:val="FirstParagraph"/>
+      </w:pPr>
+      <w:r>
+        <w:t xml:space="preserve">Pulling the whole analysis together — every figure here came from one</w:t>
       </w:r>
       <w:r>
         <w:t xml:space="preserve"> </w:t>
@@ -8709,195 +10330,7 @@
         <w:t xml:space="preserve"> </w:t>
       </w:r>
       <w:r>
-        <w:t xml:space="preserve">argument reference</w:t>
-      </w:r>
-    </w:p>
-    <w:p>
-      <w:pPr>
-        <w:pStyle w:val="SourceCode"/>
-      </w:pPr>
-      <w:r>
-        <w:rPr>
-          <w:rStyle w:val="FunctionTok"/>
-        </w:rPr>
-        <w:t xml:space="preserve">qrfactor</w:t>
-      </w:r>
-      <w:r>
-        <w:rPr>
-          <w:rStyle w:val="NormalTok"/>
-        </w:rPr>
-        <w:t xml:space="preserve">(source, </w:t>
-      </w:r>
-      <w:r>
-        <w:rPr>
-          <w:rStyle w:val="AttributeTok"/>
-        </w:rPr>
-        <w:t xml:space="preserve">layer=</w:t>
-      </w:r>
-      <w:r>
-        <w:rPr>
-          <w:rStyle w:val="StringTok"/>
-        </w:rPr>
-        <w:t xml:space="preserve">''</w:t>
-      </w:r>
-      <w:r>
-        <w:rPr>
-          <w:rStyle w:val="NormalTok"/>
-        </w:rPr>
-        <w:t xml:space="preserve">, </w:t>
-      </w:r>
-      <w:r>
-        <w:rPr>
-          <w:rStyle w:val="AttributeTok"/>
-        </w:rPr>
-        <w:t xml:space="preserve">var=</w:t>
-      </w:r>
-      <w:r>
-        <w:rPr>
-          <w:rStyle w:val="ConstantTok"/>
-        </w:rPr>
-        <w:t xml:space="preserve">NULL</w:t>
-      </w:r>
-      <w:r>
-        <w:rPr>
-          <w:rStyle w:val="NormalTok"/>
-        </w:rPr>
-        <w:t xml:space="preserve">, </w:t>
-      </w:r>
-      <w:r>
-        <w:rPr>
-          <w:rStyle w:val="AttributeTok"/>
-        </w:rPr>
-        <w:t xml:space="preserve">type=</w:t>
-      </w:r>
-      <w:r>
-        <w:rPr>
-          <w:rStyle w:val="StringTok"/>
-        </w:rPr>
-        <w:t xml:space="preserve">''</w:t>
-      </w:r>
-      <w:r>
-        <w:rPr>
-          <w:rStyle w:val="NormalTok"/>
-        </w:rPr>
-        <w:t xml:space="preserve">, </w:t>
-      </w:r>
-      <w:r>
-        <w:rPr>
-          <w:rStyle w:val="AttributeTok"/>
-        </w:rPr>
-        <w:t xml:space="preserve">p=</w:t>
-      </w:r>
-      <w:r>
-        <w:rPr>
-          <w:rStyle w:val="StringTok"/>
-        </w:rPr>
-        <w:t xml:space="preserve">"Yes"</w:t>
-      </w:r>
-      <w:r>
-        <w:rPr>
-          <w:rStyle w:val="NormalTok"/>
-        </w:rPr>
-        <w:t xml:space="preserve">,</w:t>
-      </w:r>
-      <w:r>
-        <w:br/>
-      </w:r>
-      <w:r>
-        <w:rPr>
-          <w:rStyle w:val="NormalTok"/>
-        </w:rPr>
-        <w:t xml:space="preserve">         </w:t>
-      </w:r>
-      <w:r>
-        <w:rPr>
-          <w:rStyle w:val="AttributeTok"/>
-        </w:rPr>
-        <w:t xml:space="preserve">scale=</w:t>
-      </w:r>
-      <w:r>
-        <w:rPr>
-          <w:rStyle w:val="StringTok"/>
-        </w:rPr>
-        <w:t xml:space="preserve">"sd"</w:t>
-      </w:r>
-      <w:r>
-        <w:rPr>
-          <w:rStyle w:val="NormalTok"/>
-        </w:rPr>
-        <w:t xml:space="preserve">, </w:t>
-      </w:r>
-      <w:r>
-        <w:rPr>
-          <w:rStyle w:val="AttributeTok"/>
-        </w:rPr>
-        <w:t xml:space="preserve">t=</w:t>
-      </w:r>
-      <w:r>
-        <w:rPr>
-          <w:rStyle w:val="StringTok"/>
-        </w:rPr>
-        <w:t xml:space="preserve">''</w:t>
-      </w:r>
-      <w:r>
-        <w:rPr>
-          <w:rStyle w:val="NormalTok"/>
-        </w:rPr>
-        <w:t xml:space="preserve">, </w:t>
-      </w:r>
-      <w:r>
-        <w:rPr>
-          <w:rStyle w:val="AttributeTok"/>
-        </w:rPr>
-        <w:t xml:space="preserve">nf=</w:t>
-      </w:r>
-      <w:r>
-        <w:rPr>
-          <w:rStyle w:val="DecValTok"/>
-        </w:rPr>
-        <w:t xml:space="preserve">2</w:t>
-      </w:r>
-      <w:r>
-        <w:rPr>
-          <w:rStyle w:val="NormalTok"/>
-        </w:rPr>
-        <w:t xml:space="preserve">, </w:t>
-      </w:r>
-      <w:r>
-        <w:rPr>
-          <w:rStyle w:val="AttributeTok"/>
-        </w:rPr>
-        <w:t xml:space="preserve">m=</w:t>
-      </w:r>
-      <w:r>
-        <w:rPr>
-          <w:rStyle w:val="ConstantTok"/>
-        </w:rPr>
-        <w:t xml:space="preserve">NULL</w:t>
-      </w:r>
-      <w:r>
-        <w:rPr>
-          <w:rStyle w:val="NormalTok"/>
-        </w:rPr>
-        <w:t xml:space="preserve">, </w:t>
-      </w:r>
-      <w:r>
-        <w:rPr>
-          <w:rStyle w:val="AttributeTok"/>
-        </w:rPr>
-        <w:t xml:space="preserve">f=</w:t>
-      </w:r>
-      <w:r>
-        <w:rPr>
-          <w:rStyle w:val="ConstantTok"/>
-        </w:rPr>
-        <w:t xml:space="preserve">NULL</w:t>
-      </w:r>
-      <w:r>
-        <w:rPr>
-          <w:rStyle w:val="NormalTok"/>
-        </w:rPr>
-        <w:t xml:space="preserve">, ...)</w:t>
+        <w:t xml:space="preserve">call on the bundled data:</w:t>
       </w:r>
     </w:p>
     <w:tbl>
@@ -8924,7 +10357,7 @@
               <w:jc w:val="left"/>
             </w:pPr>
             <w:r>
-              <w:t xml:space="preserve">Arg</w:t>
+              <w:t xml:space="preserve">Question</w:t>
             </w:r>
           </w:p>
         </w:tc>
@@ -8936,7 +10369,22 @@
               <w:jc w:val="left"/>
             </w:pPr>
             <w:r>
-              <w:t xml:space="preserve">Meaning</w:t>
+              <w:t xml:space="preserve">What</w:t>
+            </w:r>
+            <w:r>
+              <w:t xml:space="preserve"> </w:t>
+            </w:r>
+            <w:r>
+              <w:rPr>
+                <w:rStyle w:val="VerbatimChar"/>
+              </w:rPr>
+              <w:t xml:space="preserve">qrfactor</w:t>
+            </w:r>
+            <w:r>
+              <w:t xml:space="preserve"> </w:t>
+            </w:r>
+            <w:r>
+              <w:t xml:space="preserve">answered</w:t>
             </w:r>
           </w:p>
         </w:tc>
@@ -8950,10 +10398,7 @@
               <w:jc w:val="left"/>
             </w:pPr>
             <w:r>
-              <w:rPr>
-                <w:rStyle w:val="VerbatimChar"/>
-              </w:rPr>
-              <w:t xml:space="preserve">source</w:t>
+              <w:t xml:space="preserve">How many axes matter?</w:t>
             </w:r>
           </w:p>
         </w:tc>
@@ -8965,7 +10410,23 @@
               <w:jc w:val="left"/>
             </w:pPr>
             <w:r>
-              <w:t xml:space="preserve">data frame, CSV/txt path, shapefile folder, or spatial object</w:t>
+              <w:t xml:space="preserve">Two (Kaiser): 56% + 18% =</w:t>
+            </w:r>
+            <w:r>
+              <w:t xml:space="preserve"> </w:t>
+            </w:r>
+            <w:r>
+              <w:rPr>
+                <w:bCs/>
+                <w:b/>
+              </w:rPr>
+              <w:t xml:space="preserve">74%</w:t>
+            </w:r>
+            <w:r>
+              <w:t xml:space="preserve"> </w:t>
+            </w:r>
+            <w:r>
+              <w:t xml:space="preserve">of the variation</w:t>
             </w:r>
           </w:p>
         </w:tc>
@@ -8979,10 +10440,7 @@
               <w:jc w:val="left"/>
             </w:pPr>
             <w:r>
-              <w:rPr>
-                <w:rStyle w:val="VerbatimChar"/>
-              </w:rPr>
-              <w:t xml:space="preserve">layer</w:t>
+              <w:t xml:space="preserve">What is Factor 1?</w:t>
             </w:r>
           </w:p>
         </w:tc>
@@ -8994,22 +10452,20 @@
               <w:jc w:val="left"/>
             </w:pPr>
             <w:r>
-              <w:t xml:space="preserve">shapefile layer name;</w:t>
+              <w:t xml:space="preserve">The</w:t>
             </w:r>
             <w:r>
               <w:t xml:space="preserve"> </w:t>
             </w:r>
             <w:r>
               <w:rPr>
-                <w:rStyle w:val="VerbatimChar"/>
+                <w:bCs/>
+                <w:b/>
               </w:rPr>
-              <w:t xml:space="preserve">"gisobject"</w:t>
-            </w:r>
-            <w:r>
-              <w:t xml:space="preserve"> </w:t>
-            </w:r>
-            <w:r>
-              <w:t xml:space="preserve">for an in-memory object; a filename for CSV/txt</w:t>
+              <w:t xml:space="preserve">scale of water use</w:t>
+            </w:r>
+            <w:r>
+              <w:t xml:space="preserve">, driven by agriculture (loadings −0.79 to −0.91)</w:t>
             </w:r>
           </w:p>
         </w:tc>
@@ -9023,10 +10479,7 @@
               <w:jc w:val="left"/>
             </w:pPr>
             <w:r>
-              <w:rPr>
-                <w:rStyle w:val="VerbatimChar"/>
-              </w:rPr>
-              <w:t xml:space="preserve">var</w:t>
+              <w:t xml:space="preserve">What is Factor 2?</w:t>
             </w:r>
           </w:p>
         </w:tc>
@@ -9038,7 +10491,35 @@
               <w:jc w:val="left"/>
             </w:pPr>
             <w:r>
-              <w:t xml:space="preserve">character vector of variable (column) names to analyse — must be numeric</w:t>
+              <w:t xml:space="preserve">The</w:t>
+            </w:r>
+            <w:r>
+              <w:t xml:space="preserve"> </w:t>
+            </w:r>
+            <w:r>
+              <w:rPr>
+                <w:bCs/>
+                <w:b/>
+              </w:rPr>
+              <w:t xml:space="preserve">resource-vs-use contrast</w:t>
+            </w:r>
+            <w:r>
+              <w:t xml:space="preserve"> </w:t>
+            </w:r>
+            <w:r>
+              <w:t xml:space="preserve">(</w:t>
+            </w:r>
+            <w:r>
+              <w:rPr>
+                <w:rStyle w:val="VerbatimChar"/>
+              </w:rPr>
+              <w:t xml:space="preserve">Resources</w:t>
+            </w:r>
+            <w:r>
+              <w:t xml:space="preserve"> </w:t>
+            </w:r>
+            <w:r>
+              <w:t xml:space="preserve">alone, loading −0.68)</w:t>
             </w:r>
           </w:p>
         </w:tc>
@@ -9052,10 +10533,7 @@
               <w:jc w:val="left"/>
             </w:pPr>
             <w:r>
-              <w:rPr>
-                <w:rStyle w:val="VerbatimChar"/>
-              </w:rPr>
-              <w:t xml:space="preserve">type</w:t>
+              <w:t xml:space="preserve">Is use tied to availability?</w:t>
             </w:r>
           </w:p>
         </w:tc>
@@ -9067,7 +10545,17 @@
               <w:jc w:val="left"/>
             </w:pPr>
             <w:r>
-              <w:t xml:space="preserve">analysis flavour carried to</w:t>
+              <w:rPr>
+                <w:bCs/>
+                <w:b/>
+              </w:rPr>
+              <w:t xml:space="preserve">No</w:t>
+            </w:r>
+            <w:r>
+              <w:t xml:space="preserve"> </w:t>
+            </w:r>
+            <w:r>
+              <w:t xml:space="preserve">—</w:t>
             </w:r>
             <w:r>
               <w:t xml:space="preserve"> </w:t>
@@ -9076,43 +10564,13 @@
               <w:rPr>
                 <w:rStyle w:val="VerbatimChar"/>
               </w:rPr>
-              <w:t xml:space="preserve">plot</w:t>
+              <w:t xml:space="preserve">Resources</w:t>
             </w:r>
             <w:r>
               <w:t xml:space="preserve"> </w:t>
             </w:r>
             <w:r>
-              <w:t xml:space="preserve">(e.g. </w:t>
-            </w:r>
-            <w:r>
-              <w:rPr>
-                <w:rStyle w:val="VerbatimChar"/>
-              </w:rPr>
-              <w:t xml:space="preserve">"mds"</w:t>
-            </w:r>
-            <w:r>
-              <w:t xml:space="preserve">,</w:t>
-            </w:r>
-            <w:r>
-              <w:t xml:space="preserve"> </w:t>
-            </w:r>
-            <w:r>
-              <w:rPr>
-                <w:rStyle w:val="VerbatimChar"/>
-              </w:rPr>
-              <w:t xml:space="preserve">"coord"</w:t>
-            </w:r>
-            <w:r>
-              <w:t xml:space="preserve">); usually set on</w:t>
-            </w:r>
-            <w:r>
-              <w:t xml:space="preserve"> </w:t>
-            </w:r>
-            <w:r>
-              <w:rPr>
-                <w:rStyle w:val="VerbatimChar"/>
-              </w:rPr>
-              <w:t xml:space="preserve">plot()</w:t>
+              <w:t xml:space="preserve">correlates −0.04 to −0.19 with every use variable</w:t>
             </w:r>
           </w:p>
         </w:tc>
@@ -9126,10 +10584,7 @@
               <w:jc w:val="left"/>
             </w:pPr>
             <w:r>
-              <w:rPr>
-                <w:rStyle w:val="VerbatimChar"/>
-              </w:rPr>
-              <w:t xml:space="preserve">p</w:t>
+              <w:t xml:space="preserve">Which variable is redundant?</w:t>
             </w:r>
           </w:p>
         </w:tc>
@@ -9144,13 +10599,41 @@
               <w:rPr>
                 <w:rStyle w:val="VerbatimChar"/>
               </w:rPr>
-              <w:t xml:space="preserve">"Yes"</w:t>
+              <w:t xml:space="preserve">perCapitaW</w:t>
             </w:r>
             <w:r>
               <w:t xml:space="preserve"> </w:t>
             </w:r>
             <w:r>
-              <w:t xml:space="preserve">(default) writes scores/clusters back to the attribute table</w:t>
+              <w:t xml:space="preserve">≈</w:t>
+            </w:r>
+            <w:r>
+              <w:t xml:space="preserve"> </w:t>
+            </w:r>
+            <w:r>
+              <w:rPr>
+                <w:rStyle w:val="VerbatimChar"/>
+              </w:rPr>
+              <w:t xml:space="preserve">Agricultur</w:t>
+            </w:r>
+            <w:r>
+              <w:t xml:space="preserve"> </w:t>
+            </w:r>
+            <w:r>
+              <w:t xml:space="preserve">(r =</w:t>
+            </w:r>
+            <w:r>
+              <w:t xml:space="preserve"> </w:t>
+            </w:r>
+            <w:r>
+              <w:rPr>
+                <w:bCs/>
+                <w:b/>
+              </w:rPr>
+              <w:t xml:space="preserve">0.99</w:t>
+            </w:r>
+            <w:r>
+              <w:t xml:space="preserve">); the 6th eigenvalue ≈ 0</w:t>
             </w:r>
           </w:p>
         </w:tc>
@@ -9164,10 +10647,7 @@
               <w:jc w:val="left"/>
             </w:pPr>
             <w:r>
-              <w:rPr>
-                <w:rStyle w:val="VerbatimChar"/>
-              </w:rPr>
-              <w:t xml:space="preserve">scale</w:t>
+              <w:t xml:space="preserve">Who uses the most?</w:t>
             </w:r>
           </w:p>
         </w:tc>
@@ -9180,84 +10660,10 @@
             </w:pPr>
             <w:r>
               <w:rPr>
-                <w:rStyle w:val="VerbatimChar"/>
+                <w:bCs/>
+                <w:b/>
               </w:rPr>
-              <w:t xml:space="preserve">"sd"</w:t>
-            </w:r>
-            <w:r>
-              <w:t xml:space="preserve"> </w:t>
-            </w:r>
-            <w:r>
-              <w:t xml:space="preserve">(default, correlation),</w:t>
-            </w:r>
-            <w:r>
-              <w:t xml:space="preserve"> </w:t>
-            </w:r>
-            <w:r>
-              <w:rPr>
-                <w:rStyle w:val="VerbatimChar"/>
-              </w:rPr>
-              <w:t xml:space="preserve">"normal"</w:t>
-            </w:r>
-            <w:r>
-              <w:t xml:space="preserve">,</w:t>
-            </w:r>
-            <w:r>
-              <w:t xml:space="preserve"> </w:t>
-            </w:r>
-            <w:r>
-              <w:rPr>
-                <w:rStyle w:val="VerbatimChar"/>
-              </w:rPr>
-              <w:t xml:space="preserve">"n"</w:t>
-            </w:r>
-            <w:r>
-              <w:t xml:space="preserve">,</w:t>
-            </w:r>
-            <w:r>
-              <w:t xml:space="preserve"> </w:t>
-            </w:r>
-            <w:r>
-              <w:rPr>
-                <w:rStyle w:val="VerbatimChar"/>
-              </w:rPr>
-              <w:t xml:space="preserve">"centre"</w:t>
-            </w:r>
-            <w:r>
-              <w:t xml:space="preserve">,</w:t>
-            </w:r>
-            <w:r>
-              <w:t xml:space="preserve"> </w:t>
-            </w:r>
-            <w:r>
-              <w:rPr>
-                <w:rStyle w:val="VerbatimChar"/>
-              </w:rPr>
-              <w:t xml:space="preserve">"data"</w:t>
-            </w:r>
-            <w:r>
-              <w:t xml:space="preserve">,</w:t>
-            </w:r>
-            <w:r>
-              <w:t xml:space="preserve"> </w:t>
-            </w:r>
-            <w:r>
-              <w:rPr>
-                <w:rStyle w:val="VerbatimChar"/>
-              </w:rPr>
-              <w:t xml:space="preserve">"log"</w:t>
-            </w:r>
-            <w:r>
-              <w:t xml:space="preserve">,</w:t>
-            </w:r>
-            <w:r>
-              <w:t xml:space="preserve"> </w:t>
-            </w:r>
-            <w:r>
-              <w:rPr>
-                <w:rStyle w:val="VerbatimChar"/>
-              </w:rPr>
-              <w:t xml:space="preserve">"sqrt"</w:t>
+              <w:t xml:space="preserve">Egypt, Sudan, Madagascar, Libya, Mali, Mauritania, Swaziland</w:t>
             </w:r>
           </w:p>
         </w:tc>
@@ -9271,10 +10677,7 @@
               <w:jc w:val="left"/>
             </w:pPr>
             <w:r>
-              <w:rPr>
-                <w:rStyle w:val="VerbatimChar"/>
-              </w:rPr>
-              <w:t xml:space="preserve">t</w:t>
+              <w:t xml:space="preserve">Who has the most water?</w:t>
             </w:r>
           </w:p>
         </w:tc>
@@ -9286,16 +10689,17 @@
               <w:jc w:val="left"/>
             </w:pPr>
             <w:r>
-              <w:t xml:space="preserve">character vector of variables to transform (e.g. </w:t>
-            </w:r>
-            <w:r>
               <w:rPr>
-                <w:rStyle w:val="VerbatimChar"/>
+                <w:bCs/>
+                <w:b/>
               </w:rPr>
-              <w:t xml:space="preserve">c("withdrawal","Resources")</w:t>
-            </w:r>
-            <w:r>
-              <w:t xml:space="preserve">)</w:t>
+              <w:t xml:space="preserve">Congo, DR Congo</w:t>
+            </w:r>
+            <w:r>
+              <w:t xml:space="preserve"> </w:t>
+            </w:r>
+            <w:r>
+              <w:t xml:space="preserve">— and they barely use it</w:t>
             </w:r>
           </w:p>
         </w:tc>
@@ -9309,10 +10713,7 @@
               <w:jc w:val="left"/>
             </w:pPr>
             <w:r>
-              <w:rPr>
-                <w:rStyle w:val="VerbatimChar"/>
-              </w:rPr>
-              <w:t xml:space="preserve">nf</w:t>
+              <w:t xml:space="preserve">Do the groups differ?</w:t>
             </w:r>
           </w:p>
         </w:tc>
@@ -9324,7 +10725,23 @@
               <w:jc w:val="left"/>
             </w:pPr>
             <w:r>
-              <w:t xml:space="preserve">number of factors for clustering (default 2)</w:t>
+              <w:t xml:space="preserve">Heavy vs light users separate at</w:t>
+            </w:r>
+            <w:r>
+              <w:t xml:space="preserve"> </w:t>
+            </w:r>
+            <w:r>
+              <w:rPr>
+                <w:bCs/>
+                <w:b/>
+              </w:rPr>
+              <w:t xml:space="preserve">p &lt; 1e-6</w:t>
+            </w:r>
+            <w:r>
+              <w:t xml:space="preserve"> </w:t>
+            </w:r>
+            <w:r>
+              <w:t xml:space="preserve">on use, not on resources</w:t>
             </w:r>
           </w:p>
         </w:tc>
@@ -9338,22 +10755,7 @@
               <w:jc w:val="left"/>
             </w:pPr>
             <w:r>
-              <w:rPr>
-                <w:rStyle w:val="VerbatimChar"/>
-              </w:rPr>
-              <w:t xml:space="preserve">m</w:t>
-            </w:r>
-            <w:r>
-              <w:t xml:space="preserve">,</w:t>
-            </w:r>
-            <w:r>
-              <w:t xml:space="preserve"> </w:t>
-            </w:r>
-            <w:r>
-              <w:rPr>
-                <w:rStyle w:val="VerbatimChar"/>
-              </w:rPr>
-              <w:t xml:space="preserve">f</w:t>
+              <w:t xml:space="preserve">The paradox</w:t>
             </w:r>
           </w:p>
         </w:tc>
@@ -9365,14 +10767,890 @@
               <w:jc w:val="left"/>
             </w:pPr>
             <w:r>
-              <w:t xml:space="preserve">join key column and CSV path for CSV↔shapefile joins</w:t>
+              <w:t xml:space="preserve">Heavy users hold</w:t>
+            </w:r>
+            <w:r>
+              <w:t xml:space="preserve"> </w:t>
+            </w:r>
+            <w:r>
+              <w:rPr>
+                <w:bCs/>
+                <w:b/>
+              </w:rPr>
+              <w:t xml:space="preserve">59</w:t>
+            </w:r>
+            <w:r>
+              <w:t xml:space="preserve"> </w:t>
+            </w:r>
+            <w:r>
+              <w:t xml:space="preserve">units of resource on average; light users</w:t>
+            </w:r>
+            <w:r>
+              <w:t xml:space="preserve"> </w:t>
+            </w:r>
+            <w:r>
+              <w:rPr>
+                <w:bCs/>
+                <w:b/>
+              </w:rPr>
+              <w:t xml:space="preserve">128</w:t>
             </w:r>
           </w:p>
         </w:tc>
       </w:tr>
     </w:tbl>
+    <w:p>
+      <w:pPr>
+        <w:pStyle w:val="BodyText"/>
+      </w:pPr>
+      <w:r>
+        <w:t xml:space="preserve">The methodological point for the applied reader:</w:t>
+      </w:r>
+      <w:r>
+        <w:t xml:space="preserve"> </w:t>
+      </w:r>
+      <w:r>
+        <w:rPr>
+          <w:bCs/>
+          <w:b/>
+        </w:rPr>
+        <w:t xml:space="preserve">one call did the work of a</w:t>
+      </w:r>
+      <w:r>
+        <w:rPr>
+          <w:bCs/>
+          <w:b/>
+        </w:rPr>
+        <w:t xml:space="preserve"> </w:t>
+      </w:r>
+      <w:r>
+        <w:rPr>
+          <w:bCs/>
+          <w:b/>
+        </w:rPr>
+        <w:t xml:space="preserve">PCA, an R-mode factor analysis, a Q-mode classification, a cluster analysis, an</w:t>
+      </w:r>
+      <w:r>
+        <w:rPr>
+          <w:bCs/>
+          <w:b/>
+        </w:rPr>
+        <w:t xml:space="preserve"> </w:t>
+      </w:r>
+      <w:r>
+        <w:rPr>
+          <w:bCs/>
+          <w:b/>
+        </w:rPr>
+        <w:t xml:space="preserve">ANOVA and a set of maps</w:t>
+      </w:r>
+      <w:r>
+        <w:t xml:space="preserve"> </w:t>
+      </w:r>
+      <w:r>
+        <w:t xml:space="preserve">— and, because it is map-first, the conclusion is not</w:t>
+      </w:r>
+      <w:r>
+        <w:t xml:space="preserve"> </w:t>
+      </w:r>
+      <w:r>
+        <w:t xml:space="preserve">a table but a picture of the continent. A worked write-up of exactly this</w:t>
+      </w:r>
+      <w:r>
+        <w:t xml:space="preserve"> </w:t>
+      </w:r>
+      <w:r>
+        <w:t xml:space="preserve">analysis is a natural applied paper (see</w:t>
+      </w:r>
+      <w:r>
+        <w:t xml:space="preserve"> </w:t>
+      </w:r>
+      <w:r>
+        <w:rPr>
+          <w:rStyle w:val="VerbatimChar"/>
+        </w:rPr>
+        <w:t xml:space="preserve">PUBLICATION_PLAN.md</w:t>
+      </w:r>
+      <w:r>
+        <w:t xml:space="preserve">, Paper 3).</w:t>
+      </w:r>
+    </w:p>
+    <w:p>
+      <w:pPr>
+        <w:pStyle w:val="BodyText"/>
+      </w:pPr>
+      <w:r>
+        <w:rPr>
+          <w:bCs/>
+          <w:b/>
+        </w:rPr>
+        <w:t xml:space="preserve">An honest caveat on causation.</w:t>
+      </w:r>
+      <w:r>
+        <w:t xml:space="preserve"> </w:t>
+      </w:r>
+      <w:r>
+        <w:t xml:space="preserve">These are</w:t>
+      </w:r>
+      <w:r>
+        <w:t xml:space="preserve"> </w:t>
+      </w:r>
+      <w:r>
+        <w:rPr>
+          <w:iCs/>
+          <w:i/>
+        </w:rPr>
+        <w:t xml:space="preserve">associations</w:t>
+      </w:r>
+      <w:r>
+        <w:t xml:space="preserve"> </w:t>
+      </w:r>
+      <w:r>
+        <w:t xml:space="preserve">in a single</w:t>
+      </w:r>
+      <w:r>
+        <w:t xml:space="preserve"> </w:t>
+      </w:r>
+      <w:r>
+        <w:t xml:space="preserve">cross-section of 50 countries, not a causal claim. The decoupling of use from</w:t>
+      </w:r>
+      <w:r>
+        <w:t xml:space="preserve"> </w:t>
+      </w:r>
+      <w:r>
+        <w:t xml:space="preserve">availability is real in these data, but explaining it (climate, economy,</w:t>
+      </w:r>
+      <w:r>
+        <w:t xml:space="preserve"> </w:t>
+      </w:r>
+      <w:r>
+        <w:t xml:space="preserve">irrigation policy, data year) is the domain expert’s job, not the factor</w:t>
+      </w:r>
+      <w:r>
+        <w:t xml:space="preserve"> </w:t>
+      </w:r>
+      <w:r>
+        <w:t xml:space="preserve">model’s.</w:t>
+      </w:r>
+      <w:r>
+        <w:t xml:space="preserve"> </w:t>
+      </w:r>
+      <w:r>
+        <w:rPr>
+          <w:rStyle w:val="VerbatimChar"/>
+        </w:rPr>
+        <w:t xml:space="preserve">qrfactor</w:t>
+      </w:r>
+      <w:r>
+        <w:t xml:space="preserve"> </w:t>
+      </w:r>
+      <w:r>
+        <w:t xml:space="preserve">locates the pattern; it does not explain it.</w:t>
+      </w:r>
+    </w:p>
+    <w:p>
+      <w:r>
+        <w:pict>
+          <v:rect style="width:0;height:1.5pt" o:hralign="center" o:hrstd="t" o:hr="t"/>
+        </w:pict>
+      </w:r>
+    </w:p>
+    <w:bookmarkEnd w:id="83"/>
     <w:bookmarkEnd w:id="84"/>
-    <w:bookmarkStart w:id="88" w:name="plot.qrfactor-argument-reference"/>
+    <w:bookmarkStart w:id="95" w:name="part-3-reference"/>
+    <w:p>
+      <w:pPr>
+        <w:pStyle w:val="Heading1"/>
+      </w:pPr>
+      <w:r>
+        <w:t xml:space="preserve">PART 3 — Reference</w:t>
+      </w:r>
+    </w:p>
+    <w:bookmarkStart w:id="85" w:name="qrfactor-argument-reference"/>
+    <w:p>
+      <w:pPr>
+        <w:pStyle w:val="Heading2"/>
+      </w:pPr>
+      <w:r>
+        <w:t xml:space="preserve">25.</w:t>
+      </w:r>
+      <w:r>
+        <w:t xml:space="preserve"> </w:t>
+      </w:r>
+      <w:r>
+        <w:rPr>
+          <w:rStyle w:val="VerbatimChar"/>
+        </w:rPr>
+        <w:t xml:space="preserve">qrfactor()</w:t>
+      </w:r>
+      <w:r>
+        <w:t xml:space="preserve"> </w:t>
+      </w:r>
+      <w:r>
+        <w:t xml:space="preserve">argument reference</w:t>
+      </w:r>
+    </w:p>
+    <w:p>
+      <w:pPr>
+        <w:pStyle w:val="SourceCode"/>
+      </w:pPr>
+      <w:r>
+        <w:rPr>
+          <w:rStyle w:val="FunctionTok"/>
+        </w:rPr>
+        <w:t xml:space="preserve">qrfactor</w:t>
+      </w:r>
+      <w:r>
+        <w:rPr>
+          <w:rStyle w:val="NormalTok"/>
+        </w:rPr>
+        <w:t xml:space="preserve">(source, </w:t>
+      </w:r>
+      <w:r>
+        <w:rPr>
+          <w:rStyle w:val="AttributeTok"/>
+        </w:rPr>
+        <w:t xml:space="preserve">layer=</w:t>
+      </w:r>
+      <w:r>
+        <w:rPr>
+          <w:rStyle w:val="StringTok"/>
+        </w:rPr>
+        <w:t xml:space="preserve">''</w:t>
+      </w:r>
+      <w:r>
+        <w:rPr>
+          <w:rStyle w:val="NormalTok"/>
+        </w:rPr>
+        <w:t xml:space="preserve">, </w:t>
+      </w:r>
+      <w:r>
+        <w:rPr>
+          <w:rStyle w:val="AttributeTok"/>
+        </w:rPr>
+        <w:t xml:space="preserve">var=</w:t>
+      </w:r>
+      <w:r>
+        <w:rPr>
+          <w:rStyle w:val="ConstantTok"/>
+        </w:rPr>
+        <w:t xml:space="preserve">NULL</w:t>
+      </w:r>
+      <w:r>
+        <w:rPr>
+          <w:rStyle w:val="NormalTok"/>
+        </w:rPr>
+        <w:t xml:space="preserve">, </w:t>
+      </w:r>
+      <w:r>
+        <w:rPr>
+          <w:rStyle w:val="AttributeTok"/>
+        </w:rPr>
+        <w:t xml:space="preserve">type=</w:t>
+      </w:r>
+      <w:r>
+        <w:rPr>
+          <w:rStyle w:val="StringTok"/>
+        </w:rPr>
+        <w:t xml:space="preserve">''</w:t>
+      </w:r>
+      <w:r>
+        <w:rPr>
+          <w:rStyle w:val="NormalTok"/>
+        </w:rPr>
+        <w:t xml:space="preserve">, </w:t>
+      </w:r>
+      <w:r>
+        <w:rPr>
+          <w:rStyle w:val="AttributeTok"/>
+        </w:rPr>
+        <w:t xml:space="preserve">p=</w:t>
+      </w:r>
+      <w:r>
+        <w:rPr>
+          <w:rStyle w:val="StringTok"/>
+        </w:rPr>
+        <w:t xml:space="preserve">"Yes"</w:t>
+      </w:r>
+      <w:r>
+        <w:rPr>
+          <w:rStyle w:val="NormalTok"/>
+        </w:rPr>
+        <w:t xml:space="preserve">,</w:t>
+      </w:r>
+      <w:r>
+        <w:br/>
+      </w:r>
+      <w:r>
+        <w:rPr>
+          <w:rStyle w:val="NormalTok"/>
+        </w:rPr>
+        <w:t xml:space="preserve">         </w:t>
+      </w:r>
+      <w:r>
+        <w:rPr>
+          <w:rStyle w:val="AttributeTok"/>
+        </w:rPr>
+        <w:t xml:space="preserve">scale=</w:t>
+      </w:r>
+      <w:r>
+        <w:rPr>
+          <w:rStyle w:val="StringTok"/>
+        </w:rPr>
+        <w:t xml:space="preserve">"sd"</w:t>
+      </w:r>
+      <w:r>
+        <w:rPr>
+          <w:rStyle w:val="NormalTok"/>
+        </w:rPr>
+        <w:t xml:space="preserve">, </w:t>
+      </w:r>
+      <w:r>
+        <w:rPr>
+          <w:rStyle w:val="AttributeTok"/>
+        </w:rPr>
+        <w:t xml:space="preserve">t=</w:t>
+      </w:r>
+      <w:r>
+        <w:rPr>
+          <w:rStyle w:val="StringTok"/>
+        </w:rPr>
+        <w:t xml:space="preserve">''</w:t>
+      </w:r>
+      <w:r>
+        <w:rPr>
+          <w:rStyle w:val="NormalTok"/>
+        </w:rPr>
+        <w:t xml:space="preserve">, </w:t>
+      </w:r>
+      <w:r>
+        <w:rPr>
+          <w:rStyle w:val="AttributeTok"/>
+        </w:rPr>
+        <w:t xml:space="preserve">nf=</w:t>
+      </w:r>
+      <w:r>
+        <w:rPr>
+          <w:rStyle w:val="DecValTok"/>
+        </w:rPr>
+        <w:t xml:space="preserve">2</w:t>
+      </w:r>
+      <w:r>
+        <w:rPr>
+          <w:rStyle w:val="NormalTok"/>
+        </w:rPr>
+        <w:t xml:space="preserve">, </w:t>
+      </w:r>
+      <w:r>
+        <w:rPr>
+          <w:rStyle w:val="AttributeTok"/>
+        </w:rPr>
+        <w:t xml:space="preserve">m=</w:t>
+      </w:r>
+      <w:r>
+        <w:rPr>
+          <w:rStyle w:val="ConstantTok"/>
+        </w:rPr>
+        <w:t xml:space="preserve">NULL</w:t>
+      </w:r>
+      <w:r>
+        <w:rPr>
+          <w:rStyle w:val="NormalTok"/>
+        </w:rPr>
+        <w:t xml:space="preserve">, </w:t>
+      </w:r>
+      <w:r>
+        <w:rPr>
+          <w:rStyle w:val="AttributeTok"/>
+        </w:rPr>
+        <w:t xml:space="preserve">f=</w:t>
+      </w:r>
+      <w:r>
+        <w:rPr>
+          <w:rStyle w:val="ConstantTok"/>
+        </w:rPr>
+        <w:t xml:space="preserve">NULL</w:t>
+      </w:r>
+      <w:r>
+        <w:rPr>
+          <w:rStyle w:val="NormalTok"/>
+        </w:rPr>
+        <w:t xml:space="preserve">, ...)</w:t>
+      </w:r>
+    </w:p>
+    <w:tbl>
+      <w:tblPr>
+        <w:tblStyle w:val="Table"/>
+        <w:tblW w:type="pct" w:w="5000"/>
+        <w:tblLook w:firstRow="1" w:lastRow="0" w:firstColumn="0" w:lastColumn="0" w:noHBand="0" w:noVBand="0" w:val="0020"/>
+        <w:jc w:val="start"/>
+        <w:tblLayout w:type="fixed"/>
+      </w:tblPr>
+      <w:tblGrid>
+        <w:gridCol w:w="3960"/>
+        <w:gridCol w:w="3960"/>
+      </w:tblGrid>
+      <w:tr>
+        <w:trPr>
+          <w:tblHeader w:val="true"/>
+        </w:trPr>
+        <w:tc>
+          <w:tcPr/>
+          <w:p>
+            <w:pPr>
+              <w:pStyle w:val="Compact"/>
+              <w:jc w:val="left"/>
+            </w:pPr>
+            <w:r>
+              <w:t xml:space="preserve">Arg</w:t>
+            </w:r>
+          </w:p>
+        </w:tc>
+        <w:tc>
+          <w:tcPr/>
+          <w:p>
+            <w:pPr>
+              <w:pStyle w:val="Compact"/>
+              <w:jc w:val="left"/>
+            </w:pPr>
+            <w:r>
+              <w:t xml:space="preserve">Meaning</w:t>
+            </w:r>
+          </w:p>
+        </w:tc>
+      </w:tr>
+      <w:tr>
+        <w:tc>
+          <w:tcPr/>
+          <w:p>
+            <w:pPr>
+              <w:pStyle w:val="Compact"/>
+              <w:jc w:val="left"/>
+            </w:pPr>
+            <w:r>
+              <w:rPr>
+                <w:rStyle w:val="VerbatimChar"/>
+              </w:rPr>
+              <w:t xml:space="preserve">source</w:t>
+            </w:r>
+          </w:p>
+        </w:tc>
+        <w:tc>
+          <w:tcPr/>
+          <w:p>
+            <w:pPr>
+              <w:pStyle w:val="Compact"/>
+              <w:jc w:val="left"/>
+            </w:pPr>
+            <w:r>
+              <w:t xml:space="preserve">data frame, CSV/txt path, shapefile folder, or spatial object</w:t>
+            </w:r>
+          </w:p>
+        </w:tc>
+      </w:tr>
+      <w:tr>
+        <w:tc>
+          <w:tcPr/>
+          <w:p>
+            <w:pPr>
+              <w:pStyle w:val="Compact"/>
+              <w:jc w:val="left"/>
+            </w:pPr>
+            <w:r>
+              <w:rPr>
+                <w:rStyle w:val="VerbatimChar"/>
+              </w:rPr>
+              <w:t xml:space="preserve">layer</w:t>
+            </w:r>
+          </w:p>
+        </w:tc>
+        <w:tc>
+          <w:tcPr/>
+          <w:p>
+            <w:pPr>
+              <w:pStyle w:val="Compact"/>
+              <w:jc w:val="left"/>
+            </w:pPr>
+            <w:r>
+              <w:t xml:space="preserve">shapefile layer name;</w:t>
+            </w:r>
+            <w:r>
+              <w:t xml:space="preserve"> </w:t>
+            </w:r>
+            <w:r>
+              <w:rPr>
+                <w:rStyle w:val="VerbatimChar"/>
+              </w:rPr>
+              <w:t xml:space="preserve">"gisobject"</w:t>
+            </w:r>
+            <w:r>
+              <w:t xml:space="preserve"> </w:t>
+            </w:r>
+            <w:r>
+              <w:t xml:space="preserve">for an in-memory object; a filename for CSV/txt</w:t>
+            </w:r>
+          </w:p>
+        </w:tc>
+      </w:tr>
+      <w:tr>
+        <w:tc>
+          <w:tcPr/>
+          <w:p>
+            <w:pPr>
+              <w:pStyle w:val="Compact"/>
+              <w:jc w:val="left"/>
+            </w:pPr>
+            <w:r>
+              <w:rPr>
+                <w:rStyle w:val="VerbatimChar"/>
+              </w:rPr>
+              <w:t xml:space="preserve">var</w:t>
+            </w:r>
+          </w:p>
+        </w:tc>
+        <w:tc>
+          <w:tcPr/>
+          <w:p>
+            <w:pPr>
+              <w:pStyle w:val="Compact"/>
+              <w:jc w:val="left"/>
+            </w:pPr>
+            <w:r>
+              <w:t xml:space="preserve">character vector of variable (column) names to analyse — must be numeric</w:t>
+            </w:r>
+          </w:p>
+        </w:tc>
+      </w:tr>
+      <w:tr>
+        <w:tc>
+          <w:tcPr/>
+          <w:p>
+            <w:pPr>
+              <w:pStyle w:val="Compact"/>
+              <w:jc w:val="left"/>
+            </w:pPr>
+            <w:r>
+              <w:rPr>
+                <w:rStyle w:val="VerbatimChar"/>
+              </w:rPr>
+              <w:t xml:space="preserve">type</w:t>
+            </w:r>
+          </w:p>
+        </w:tc>
+        <w:tc>
+          <w:tcPr/>
+          <w:p>
+            <w:pPr>
+              <w:pStyle w:val="Compact"/>
+              <w:jc w:val="left"/>
+            </w:pPr>
+            <w:r>
+              <w:t xml:space="preserve">analysis flavour carried to</w:t>
+            </w:r>
+            <w:r>
+              <w:t xml:space="preserve"> </w:t>
+            </w:r>
+            <w:r>
+              <w:rPr>
+                <w:rStyle w:val="VerbatimChar"/>
+              </w:rPr>
+              <w:t xml:space="preserve">plot</w:t>
+            </w:r>
+            <w:r>
+              <w:t xml:space="preserve"> </w:t>
+            </w:r>
+            <w:r>
+              <w:t xml:space="preserve">(e.g. </w:t>
+            </w:r>
+            <w:r>
+              <w:rPr>
+                <w:rStyle w:val="VerbatimChar"/>
+              </w:rPr>
+              <w:t xml:space="preserve">"mds"</w:t>
+            </w:r>
+            <w:r>
+              <w:t xml:space="preserve">,</w:t>
+            </w:r>
+            <w:r>
+              <w:t xml:space="preserve"> </w:t>
+            </w:r>
+            <w:r>
+              <w:rPr>
+                <w:rStyle w:val="VerbatimChar"/>
+              </w:rPr>
+              <w:t xml:space="preserve">"coord"</w:t>
+            </w:r>
+            <w:r>
+              <w:t xml:space="preserve">); usually set on</w:t>
+            </w:r>
+            <w:r>
+              <w:t xml:space="preserve"> </w:t>
+            </w:r>
+            <w:r>
+              <w:rPr>
+                <w:rStyle w:val="VerbatimChar"/>
+              </w:rPr>
+              <w:t xml:space="preserve">plot()</w:t>
+            </w:r>
+          </w:p>
+        </w:tc>
+      </w:tr>
+      <w:tr>
+        <w:tc>
+          <w:tcPr/>
+          <w:p>
+            <w:pPr>
+              <w:pStyle w:val="Compact"/>
+              <w:jc w:val="left"/>
+            </w:pPr>
+            <w:r>
+              <w:rPr>
+                <w:rStyle w:val="VerbatimChar"/>
+              </w:rPr>
+              <w:t xml:space="preserve">p</w:t>
+            </w:r>
+          </w:p>
+        </w:tc>
+        <w:tc>
+          <w:tcPr/>
+          <w:p>
+            <w:pPr>
+              <w:pStyle w:val="Compact"/>
+              <w:jc w:val="left"/>
+            </w:pPr>
+            <w:r>
+              <w:rPr>
+                <w:rStyle w:val="VerbatimChar"/>
+              </w:rPr>
+              <w:t xml:space="preserve">"Yes"</w:t>
+            </w:r>
+            <w:r>
+              <w:t xml:space="preserve"> </w:t>
+            </w:r>
+            <w:r>
+              <w:t xml:space="preserve">(default) writes scores/clusters back to the attribute table</w:t>
+            </w:r>
+          </w:p>
+        </w:tc>
+      </w:tr>
+      <w:tr>
+        <w:tc>
+          <w:tcPr/>
+          <w:p>
+            <w:pPr>
+              <w:pStyle w:val="Compact"/>
+              <w:jc w:val="left"/>
+            </w:pPr>
+            <w:r>
+              <w:rPr>
+                <w:rStyle w:val="VerbatimChar"/>
+              </w:rPr>
+              <w:t xml:space="preserve">scale</w:t>
+            </w:r>
+          </w:p>
+        </w:tc>
+        <w:tc>
+          <w:tcPr/>
+          <w:p>
+            <w:pPr>
+              <w:pStyle w:val="Compact"/>
+              <w:jc w:val="left"/>
+            </w:pPr>
+            <w:r>
+              <w:rPr>
+                <w:rStyle w:val="VerbatimChar"/>
+              </w:rPr>
+              <w:t xml:space="preserve">"sd"</w:t>
+            </w:r>
+            <w:r>
+              <w:t xml:space="preserve"> </w:t>
+            </w:r>
+            <w:r>
+              <w:t xml:space="preserve">(default, correlation),</w:t>
+            </w:r>
+            <w:r>
+              <w:t xml:space="preserve"> </w:t>
+            </w:r>
+            <w:r>
+              <w:rPr>
+                <w:rStyle w:val="VerbatimChar"/>
+              </w:rPr>
+              <w:t xml:space="preserve">"normal"</w:t>
+            </w:r>
+            <w:r>
+              <w:t xml:space="preserve">,</w:t>
+            </w:r>
+            <w:r>
+              <w:t xml:space="preserve"> </w:t>
+            </w:r>
+            <w:r>
+              <w:rPr>
+                <w:rStyle w:val="VerbatimChar"/>
+              </w:rPr>
+              <w:t xml:space="preserve">"n"</w:t>
+            </w:r>
+            <w:r>
+              <w:t xml:space="preserve">,</w:t>
+            </w:r>
+            <w:r>
+              <w:t xml:space="preserve"> </w:t>
+            </w:r>
+            <w:r>
+              <w:rPr>
+                <w:rStyle w:val="VerbatimChar"/>
+              </w:rPr>
+              <w:t xml:space="preserve">"centre"</w:t>
+            </w:r>
+            <w:r>
+              <w:t xml:space="preserve">,</w:t>
+            </w:r>
+            <w:r>
+              <w:t xml:space="preserve"> </w:t>
+            </w:r>
+            <w:r>
+              <w:rPr>
+                <w:rStyle w:val="VerbatimChar"/>
+              </w:rPr>
+              <w:t xml:space="preserve">"data"</w:t>
+            </w:r>
+            <w:r>
+              <w:t xml:space="preserve">,</w:t>
+            </w:r>
+            <w:r>
+              <w:t xml:space="preserve"> </w:t>
+            </w:r>
+            <w:r>
+              <w:rPr>
+                <w:rStyle w:val="VerbatimChar"/>
+              </w:rPr>
+              <w:t xml:space="preserve">"log"</w:t>
+            </w:r>
+            <w:r>
+              <w:t xml:space="preserve">,</w:t>
+            </w:r>
+            <w:r>
+              <w:t xml:space="preserve"> </w:t>
+            </w:r>
+            <w:r>
+              <w:rPr>
+                <w:rStyle w:val="VerbatimChar"/>
+              </w:rPr>
+              <w:t xml:space="preserve">"sqrt"</w:t>
+            </w:r>
+          </w:p>
+        </w:tc>
+      </w:tr>
+      <w:tr>
+        <w:tc>
+          <w:tcPr/>
+          <w:p>
+            <w:pPr>
+              <w:pStyle w:val="Compact"/>
+              <w:jc w:val="left"/>
+            </w:pPr>
+            <w:r>
+              <w:rPr>
+                <w:rStyle w:val="VerbatimChar"/>
+              </w:rPr>
+              <w:t xml:space="preserve">t</w:t>
+            </w:r>
+          </w:p>
+        </w:tc>
+        <w:tc>
+          <w:tcPr/>
+          <w:p>
+            <w:pPr>
+              <w:pStyle w:val="Compact"/>
+              <w:jc w:val="left"/>
+            </w:pPr>
+            <w:r>
+              <w:t xml:space="preserve">character vector of variables to transform (e.g. </w:t>
+            </w:r>
+            <w:r>
+              <w:rPr>
+                <w:rStyle w:val="VerbatimChar"/>
+              </w:rPr>
+              <w:t xml:space="preserve">c("withdrawal","Resources")</w:t>
+            </w:r>
+            <w:r>
+              <w:t xml:space="preserve">)</w:t>
+            </w:r>
+          </w:p>
+        </w:tc>
+      </w:tr>
+      <w:tr>
+        <w:tc>
+          <w:tcPr/>
+          <w:p>
+            <w:pPr>
+              <w:pStyle w:val="Compact"/>
+              <w:jc w:val="left"/>
+            </w:pPr>
+            <w:r>
+              <w:rPr>
+                <w:rStyle w:val="VerbatimChar"/>
+              </w:rPr>
+              <w:t xml:space="preserve">nf</w:t>
+            </w:r>
+          </w:p>
+        </w:tc>
+        <w:tc>
+          <w:tcPr/>
+          <w:p>
+            <w:pPr>
+              <w:pStyle w:val="Compact"/>
+              <w:jc w:val="left"/>
+            </w:pPr>
+            <w:r>
+              <w:t xml:space="preserve">number of factors for clustering (default 2)</w:t>
+            </w:r>
+          </w:p>
+        </w:tc>
+      </w:tr>
+      <w:tr>
+        <w:tc>
+          <w:tcPr/>
+          <w:p>
+            <w:pPr>
+              <w:pStyle w:val="Compact"/>
+              <w:jc w:val="left"/>
+            </w:pPr>
+            <w:r>
+              <w:rPr>
+                <w:rStyle w:val="VerbatimChar"/>
+              </w:rPr>
+              <w:t xml:space="preserve">m</w:t>
+            </w:r>
+            <w:r>
+              <w:t xml:space="preserve">,</w:t>
+            </w:r>
+            <w:r>
+              <w:t xml:space="preserve"> </w:t>
+            </w:r>
+            <w:r>
+              <w:rPr>
+                <w:rStyle w:val="VerbatimChar"/>
+              </w:rPr>
+              <w:t xml:space="preserve">f</w:t>
+            </w:r>
+          </w:p>
+        </w:tc>
+        <w:tc>
+          <w:tcPr/>
+          <w:p>
+            <w:pPr>
+              <w:pStyle w:val="Compact"/>
+              <w:jc w:val="left"/>
+            </w:pPr>
+            <w:r>
+              <w:t xml:space="preserve">join key column and CSV path for CSV↔shapefile joins</w:t>
+            </w:r>
+          </w:p>
+        </w:tc>
+      </w:tr>
+    </w:tbl>
+    <w:bookmarkEnd w:id="85"/>
+    <w:bookmarkStart w:id="89" w:name="plot.qrfactor-argument-reference"/>
     <w:p>
       <w:pPr>
         <w:pStyle w:val="Heading2"/>
@@ -9792,7 +12070,7 @@
       <w:pPr>
         <w:numPr>
           <w:ilvl w:val="0"/>
-          <w:numId w:val="1002"/>
+          <w:numId w:val="1003"/>
         </w:numPr>
         <w:pStyle w:val="Compact"/>
       </w:pPr>
@@ -9958,7 +12236,7 @@
       <w:pPr>
         <w:numPr>
           <w:ilvl w:val="0"/>
-          <w:numId w:val="1002"/>
+          <w:numId w:val="1003"/>
         </w:numPr>
         <w:pStyle w:val="Compact"/>
       </w:pPr>
@@ -10117,7 +12395,7 @@
       <w:pPr>
         <w:numPr>
           <w:ilvl w:val="0"/>
-          <w:numId w:val="1002"/>
+          <w:numId w:val="1003"/>
         </w:numPr>
         <w:pStyle w:val="Compact"/>
       </w:pPr>
@@ -10161,7 +12439,7 @@
       <w:pPr>
         <w:numPr>
           <w:ilvl w:val="0"/>
-          <w:numId w:val="1002"/>
+          <w:numId w:val="1003"/>
         </w:numPr>
         <w:pStyle w:val="Compact"/>
       </w:pPr>
@@ -10193,7 +12471,7 @@
       <w:pPr>
         <w:numPr>
           <w:ilvl w:val="0"/>
-          <w:numId w:val="1002"/>
+          <w:numId w:val="1003"/>
         </w:numPr>
         <w:pStyle w:val="Compact"/>
       </w:pPr>
@@ -10216,7 +12494,7 @@
       <w:pPr>
         <w:numPr>
           <w:ilvl w:val="0"/>
-          <w:numId w:val="1002"/>
+          <w:numId w:val="1003"/>
         </w:numPr>
         <w:pStyle w:val="Compact"/>
       </w:pPr>
@@ -10251,7 +12529,7 @@
       <w:pPr>
         <w:numPr>
           <w:ilvl w:val="0"/>
-          <w:numId w:val="1002"/>
+          <w:numId w:val="1003"/>
         </w:numPr>
         <w:pStyle w:val="Compact"/>
       </w:pPr>
@@ -10346,7 +12624,7 @@
       <w:pPr>
         <w:numPr>
           <w:ilvl w:val="0"/>
-          <w:numId w:val="1002"/>
+          <w:numId w:val="1003"/>
         </w:numPr>
         <w:pStyle w:val="Compact"/>
       </w:pPr>
@@ -10913,18 +13191,18 @@
           <wp:inline>
             <wp:extent cx="5334000" cy="3556000"/>
             <wp:effectExtent b="0" l="0" r="0" t="0"/>
-            <wp:docPr descr="Sized and annotated" title="" id="86" name="Picture"/>
+            <wp:docPr descr="Sized and annotated" title="" id="87" name="Picture"/>
             <a:graphic>
               <a:graphicData uri="http://schemas.openxmlformats.org/drawingml/2006/picture">
                 <pic:pic>
                   <pic:nvPicPr>
-                    <pic:cNvPr descr="figures/fig_cex_values.png" id="87" name="Picture"/>
+                    <pic:cNvPr descr="figures/fig_cex_values.png" id="88" name="Picture"/>
                     <pic:cNvPicPr>
                       <a:picLocks noChangeArrowheads="1" noChangeAspect="1"/>
                     </pic:cNvPicPr>
                   </pic:nvPicPr>
                   <pic:blipFill>
-                    <a:blip r:embed="rId85"/>
+                    <a:blip r:embed="rId86"/>
                     <a:stretch>
                       <a:fillRect/>
                     </a:stretch>
@@ -10959,8 +13237,8 @@
         <w:t xml:space="preserve">Sized and annotated</w:t>
       </w:r>
     </w:p>
-    <w:bookmarkEnd w:id="88"/>
-    <w:bookmarkStart w:id="89" w:name="the-objects-elements"/>
+    <w:bookmarkEnd w:id="89"/>
+    <w:bookmarkStart w:id="90" w:name="the-objects-elements"/>
     <w:p>
       <w:pPr>
         <w:pStyle w:val="Heading2"/>
@@ -11732,8 +14010,8 @@
         </w:tc>
       </w:tr>
     </w:tbl>
-    <w:bookmarkEnd w:id="89"/>
-    <w:bookmarkStart w:id="90" w:name="reproducing-the-figures"/>
+    <w:bookmarkEnd w:id="90"/>
+    <w:bookmarkStart w:id="91" w:name="reproducing-the-figures"/>
     <w:p>
       <w:pPr>
         <w:pStyle w:val="Heading2"/>
@@ -11871,315 +14149,14 @@
         <w:t xml:space="preserve">.</w:t>
       </w:r>
     </w:p>
-    <w:bookmarkEnd w:id="90"/>
-    <w:bookmarkStart w:id="91" w:name="honest-limits-and-caveats"/>
+    <w:bookmarkEnd w:id="91"/>
+    <w:bookmarkStart w:id="92" w:name="honest-limits-and-caveats"/>
     <w:p>
       <w:pPr>
         <w:pStyle w:val="Heading2"/>
       </w:pPr>
       <w:r>
         <w:t xml:space="preserve">29. Honest limits and caveats</w:t>
-      </w:r>
-    </w:p>
-    <w:p>
-      <w:pPr>
-        <w:numPr>
-          <w:ilvl w:val="0"/>
-          <w:numId w:val="1003"/>
-        </w:numPr>
-        <w:pStyle w:val="Compact"/>
-      </w:pPr>
-      <w:r>
-        <w:rPr>
-          <w:bCs/>
-          <w:b/>
-        </w:rPr>
-        <w:t xml:space="preserve">Numeric data only.</w:t>
-      </w:r>
-      <w:r>
-        <w:t xml:space="preserve"> </w:t>
-      </w:r>
-      <w:r>
-        <w:t xml:space="preserve">Categorical or character columns must be dropped or</w:t>
-      </w:r>
-      <w:r>
-        <w:t xml:space="preserve"> </w:t>
-      </w:r>
-      <w:r>
-        <w:t xml:space="preserve">encoded first.</w:t>
-      </w:r>
-    </w:p>
-    <w:p>
-      <w:pPr>
-        <w:numPr>
-          <w:ilvl w:val="0"/>
-          <w:numId w:val="1003"/>
-        </w:numPr>
-        <w:pStyle w:val="Compact"/>
-      </w:pPr>
-      <w:r>
-        <w:rPr>
-          <w:bCs/>
-          <w:b/>
-        </w:rPr>
-        <w:t xml:space="preserve">Collinearity.</w:t>
-      </w:r>
-      <w:r>
-        <w:t xml:space="preserve"> </w:t>
-      </w:r>
-      <w:r>
-        <w:t xml:space="preserve">Near-duplicate variables (here</w:t>
-      </w:r>
-      <w:r>
-        <w:t xml:space="preserve"> </w:t>
-      </w:r>
-      <w:r>
-        <w:rPr>
-          <w:rStyle w:val="VerbatimChar"/>
-        </w:rPr>
-        <w:t xml:space="preserve">Agricultur</w:t>
-      </w:r>
-      <w:r>
-        <w:t xml:space="preserve"> </w:t>
-      </w:r>
-      <w:r>
-        <w:t xml:space="preserve">≈</w:t>
-      </w:r>
-      <w:r>
-        <w:t xml:space="preserve"> </w:t>
-      </w:r>
-      <w:r>
-        <w:rPr>
-          <w:rStyle w:val="VerbatimChar"/>
-        </w:rPr>
-        <w:t xml:space="preserve">perCapitaW</w:t>
-      </w:r>
-      <w:r>
-        <w:t xml:space="preserve">,</w:t>
-      </w:r>
-      <w:r>
-        <w:t xml:space="preserve"> </w:t>
-      </w:r>
-      <w:r>
-        <w:t xml:space="preserve">r = 0.992) drive the smallest eigenvalue to ~0 and make the Mahalanobis</w:t>
-      </w:r>
-      <w:r>
-        <w:t xml:space="preserve"> </w:t>
-      </w:r>
-      <w:r>
-        <w:t xml:space="preserve">diagnostic singular. The last factor is then numerical noise; consider</w:t>
-      </w:r>
-      <w:r>
-        <w:t xml:space="preserve"> </w:t>
-      </w:r>
-      <w:r>
-        <w:t xml:space="preserve">dropping one of the pair.</w:t>
-      </w:r>
-    </w:p>
-    <w:p>
-      <w:pPr>
-        <w:numPr>
-          <w:ilvl w:val="0"/>
-          <w:numId w:val="1003"/>
-        </w:numPr>
-        <w:pStyle w:val="Compact"/>
-      </w:pPr>
-      <w:r>
-        <w:rPr>
-          <w:bCs/>
-          <w:b/>
-        </w:rPr>
-        <w:t xml:space="preserve">Cluster ids are random labels.</w:t>
-      </w:r>
-      <w:r>
-        <w:t xml:space="preserve"> </w:t>
-      </w:r>
-      <w:r>
-        <w:rPr>
-          <w:rStyle w:val="VerbatimChar"/>
-        </w:rPr>
-        <w:t xml:space="preserve">kmeans</w:t>
-      </w:r>
-      <w:r>
-        <w:t xml:space="preserve"> </w:t>
-      </w:r>
-      <w:r>
-        <w:t xml:space="preserve">is unseeded — groupings are</w:t>
-      </w:r>
-      <w:r>
-        <w:t xml:space="preserve"> </w:t>
-      </w:r>
-      <w:r>
-        <w:t xml:space="preserve">stable, id numbers are not. Seed for reproducibility.</w:t>
-      </w:r>
-    </w:p>
-    <w:p>
-      <w:pPr>
-        <w:numPr>
-          <w:ilvl w:val="0"/>
-          <w:numId w:val="1003"/>
-        </w:numPr>
-        <w:pStyle w:val="Compact"/>
-      </w:pPr>
-      <w:r>
-        <w:rPr>
-          <w:rStyle w:val="VerbatimChar"/>
-          <w:bCs/>
-          <w:b/>
-        </w:rPr>
-        <w:t xml:space="preserve">scale=</w:t>
-      </w:r>
-      <w:r>
-        <w:rPr>
-          <w:bCs/>
-          <w:b/>
-        </w:rPr>
-        <w:t xml:space="preserve"> </w:t>
-      </w:r>
-      <w:r>
-        <w:rPr>
-          <w:bCs/>
-          <w:b/>
-        </w:rPr>
-        <w:t xml:space="preserve">dominates the result.</w:t>
-      </w:r>
-      <w:r>
-        <w:t xml:space="preserve"> </w:t>
-      </w:r>
-      <w:r>
-        <w:t xml:space="preserve">Correlation vs covariance scaling changes</w:t>
-      </w:r>
-      <w:r>
-        <w:t xml:space="preserve"> </w:t>
-      </w:r>
-      <w:r>
-        <w:t xml:space="preserve">the variance split from 56%/18% to 99%/… . Report your choice.</w:t>
-      </w:r>
-    </w:p>
-    <w:p>
-      <w:pPr>
-        <w:numPr>
-          <w:ilvl w:val="0"/>
-          <w:numId w:val="1003"/>
-        </w:numPr>
-        <w:pStyle w:val="Compact"/>
-      </w:pPr>
-      <w:r>
-        <w:rPr>
-          <w:bCs/>
-          <w:b/>
-        </w:rPr>
-        <w:t xml:space="preserve">Case sensitivity.</w:t>
-      </w:r>
-      <w:r>
-        <w:t xml:space="preserve"> </w:t>
-      </w:r>
-      <w:r>
-        <w:rPr>
-          <w:rStyle w:val="VerbatimChar"/>
-        </w:rPr>
-        <w:t xml:space="preserve">type="pca"</w:t>
-      </w:r>
-      <w:r>
-        <w:t xml:space="preserve"> </w:t>
-      </w:r>
-      <w:r>
-        <w:t xml:space="preserve">works;</w:t>
-      </w:r>
-      <w:r>
-        <w:t xml:space="preserve"> </w:t>
-      </w:r>
-      <w:r>
-        <w:rPr>
-          <w:rStyle w:val="VerbatimChar"/>
-        </w:rPr>
-        <w:t xml:space="preserve">type="PCA"</w:t>
-      </w:r>
-      <w:r>
-        <w:t xml:space="preserve"> </w:t>
-      </w:r>
-      <w:r>
-        <w:t xml:space="preserve">silently gives the</w:t>
-      </w:r>
-      <w:r>
-        <w:t xml:space="preserve"> </w:t>
-      </w:r>
-      <w:r>
-        <w:t xml:space="preserve">default biplot.</w:t>
-      </w:r>
-    </w:p>
-    <w:p>
-      <w:pPr>
-        <w:numPr>
-          <w:ilvl w:val="0"/>
-          <w:numId w:val="1003"/>
-        </w:numPr>
-        <w:pStyle w:val="Compact"/>
-      </w:pPr>
-      <w:r>
-        <w:rPr>
-          <w:rStyle w:val="VerbatimChar"/>
-          <w:bCs/>
-          <w:b/>
-        </w:rPr>
-        <w:t xml:space="preserve">plot="map"</w:t>
-      </w:r>
-      <w:r>
-        <w:rPr>
-          <w:bCs/>
-          <w:b/>
-        </w:rPr>
-        <w:t xml:space="preserve"> </w:t>
-      </w:r>
-      <w:r>
-        <w:rPr>
-          <w:bCs/>
-          <w:b/>
-        </w:rPr>
-        <w:t xml:space="preserve">is verbose</w:t>
-      </w:r>
-      <w:r>
-        <w:t xml:space="preserve"> </w:t>
-      </w:r>
-      <w:r>
-        <w:t xml:space="preserve">— it emits the biplot plus many</w:t>
-      </w:r>
-      <w:r>
-        <w:t xml:space="preserve"> </w:t>
-      </w:r>
-      <w:r>
-        <w:rPr>
-          <w:rStyle w:val="VerbatimChar"/>
-        </w:rPr>
-        <w:t xml:space="preserve">spplot</w:t>
-      </w:r>
-      <w:r>
-        <w:t xml:space="preserve"> </w:t>
-      </w:r>
-      <w:r>
-        <w:t xml:space="preserve">pages;</w:t>
-      </w:r>
-      <w:r>
-        <w:t xml:space="preserve"> </w:t>
-      </w:r>
-      <w:r>
-        <w:t xml:space="preserve">send it to a multi-page device (PDF) or a PNG sequence if you want to keep</w:t>
-      </w:r>
-      <w:r>
-        <w:t xml:space="preserve"> </w:t>
-      </w:r>
-      <w:r>
-        <w:t xml:space="preserve">them.</w:t>
-      </w:r>
-    </w:p>
-    <w:bookmarkEnd w:id="91"/>
-    <w:bookmarkStart w:id="92" w:name="glossary"/>
-    <w:p>
-      <w:pPr>
-        <w:pStyle w:val="Heading2"/>
-      </w:pPr>
-      <w:r>
-        <w:t xml:space="preserve">30. Glossary</w:t>
       </w:r>
     </w:p>
     <w:p>
@@ -12195,13 +14172,19 @@
           <w:bCs/>
           <w:b/>
         </w:rPr>
-        <w:t xml:space="preserve">Loading</w:t>
-      </w:r>
-      <w:r>
-        <w:t xml:space="preserve"> </w:t>
-      </w:r>
-      <w:r>
-        <w:t xml:space="preserve">— weight relating a variable (R-mode) or sample (Q-mode) to a factor.</w:t>
+        <w:t xml:space="preserve">Numeric data only.</w:t>
+      </w:r>
+      <w:r>
+        <w:t xml:space="preserve"> </w:t>
+      </w:r>
+      <w:r>
+        <w:t xml:space="preserve">Categorical or character columns must be dropped or</w:t>
+      </w:r>
+      <w:r>
+        <w:t xml:space="preserve"> </w:t>
+      </w:r>
+      <w:r>
+        <w:t xml:space="preserve">encoded first.</w:t>
       </w:r>
     </w:p>
     <w:p>
@@ -12217,13 +14200,58 @@
           <w:bCs/>
           <w:b/>
         </w:rPr>
-        <w:t xml:space="preserve">Score</w:t>
-      </w:r>
-      <w:r>
-        <w:t xml:space="preserve"> </w:t>
-      </w:r>
-      <w:r>
-        <w:t xml:space="preserve">— a sample’s/variable’s coordinate on a factor.</w:t>
+        <w:t xml:space="preserve">Collinearity.</w:t>
+      </w:r>
+      <w:r>
+        <w:t xml:space="preserve"> </w:t>
+      </w:r>
+      <w:r>
+        <w:t xml:space="preserve">Near-duplicate variables (here</w:t>
+      </w:r>
+      <w:r>
+        <w:t xml:space="preserve"> </w:t>
+      </w:r>
+      <w:r>
+        <w:rPr>
+          <w:rStyle w:val="VerbatimChar"/>
+        </w:rPr>
+        <w:t xml:space="preserve">Agricultur</w:t>
+      </w:r>
+      <w:r>
+        <w:t xml:space="preserve"> </w:t>
+      </w:r>
+      <w:r>
+        <w:t xml:space="preserve">≈</w:t>
+      </w:r>
+      <w:r>
+        <w:t xml:space="preserve"> </w:t>
+      </w:r>
+      <w:r>
+        <w:rPr>
+          <w:rStyle w:val="VerbatimChar"/>
+        </w:rPr>
+        <w:t xml:space="preserve">perCapitaW</w:t>
+      </w:r>
+      <w:r>
+        <w:t xml:space="preserve">,</w:t>
+      </w:r>
+      <w:r>
+        <w:t xml:space="preserve"> </w:t>
+      </w:r>
+      <w:r>
+        <w:t xml:space="preserve">r = 0.992) drive the smallest eigenvalue to ~0 and make the Mahalanobis</w:t>
+      </w:r>
+      <w:r>
+        <w:t xml:space="preserve"> </w:t>
+      </w:r>
+      <w:r>
+        <w:t xml:space="preserve">diagnostic singular. The last factor is then numerical noise; consider</w:t>
+      </w:r>
+      <w:r>
+        <w:t xml:space="preserve"> </w:t>
+      </w:r>
+      <w:r>
+        <w:t xml:space="preserve">dropping one of the pair.</w:t>
       </w:r>
     </w:p>
     <w:p>
@@ -12239,13 +14267,28 @@
           <w:bCs/>
           <w:b/>
         </w:rPr>
-        <w:t xml:space="preserve">Eigenvalue</w:t>
-      </w:r>
-      <w:r>
-        <w:t xml:space="preserve"> </w:t>
-      </w:r>
-      <w:r>
-        <w:t xml:space="preserve">— variance captured by an axis; Kaiser rule keeps &gt; 1.</w:t>
+        <w:t xml:space="preserve">Cluster ids are random labels.</w:t>
+      </w:r>
+      <w:r>
+        <w:t xml:space="preserve"> </w:t>
+      </w:r>
+      <w:r>
+        <w:rPr>
+          <w:rStyle w:val="VerbatimChar"/>
+        </w:rPr>
+        <w:t xml:space="preserve">kmeans</w:t>
+      </w:r>
+      <w:r>
+        <w:t xml:space="preserve"> </w:t>
+      </w:r>
+      <w:r>
+        <w:t xml:space="preserve">is unseeded — groupings are</w:t>
+      </w:r>
+      <w:r>
+        <w:t xml:space="preserve"> </w:t>
+      </w:r>
+      <w:r>
+        <w:t xml:space="preserve">stable, id numbers are not. Seed for reproducibility.</w:t>
       </w:r>
     </w:p>
     <w:p>
@@ -12258,16 +14301,37 @@
       </w:pPr>
       <w:r>
         <w:rPr>
-          <w:bCs/>
-          <w:b/>
-        </w:rPr>
-        <w:t xml:space="preserve">R-mode / Q-mode</w:t>
-      </w:r>
-      <w:r>
-        <w:t xml:space="preserve"> </w:t>
-      </w:r>
-      <w:r>
-        <w:t xml:space="preserve">— classification of variables / of samples.</w:t>
+          <w:rStyle w:val="VerbatimChar"/>
+          <w:bCs/>
+          <w:b/>
+        </w:rPr>
+        <w:t xml:space="preserve">scale=</w:t>
+      </w:r>
+      <w:r>
+        <w:rPr>
+          <w:bCs/>
+          <w:b/>
+        </w:rPr>
+        <w:t xml:space="preserve"> </w:t>
+      </w:r>
+      <w:r>
+        <w:rPr>
+          <w:bCs/>
+          <w:b/>
+        </w:rPr>
+        <w:t xml:space="preserve">dominates the result.</w:t>
+      </w:r>
+      <w:r>
+        <w:t xml:space="preserve"> </w:t>
+      </w:r>
+      <w:r>
+        <w:t xml:space="preserve">Correlation vs covariance scaling changes</w:t>
+      </w:r>
+      <w:r>
+        <w:t xml:space="preserve"> </w:t>
+      </w:r>
+      <w:r>
+        <w:t xml:space="preserve">the variance split from 56%/18% to 99%/… . Report your choice.</w:t>
       </w:r>
     </w:p>
     <w:p>
@@ -12283,13 +14347,43 @@
           <w:bCs/>
           <w:b/>
         </w:rPr>
-        <w:t xml:space="preserve">Biplot</w:t>
-      </w:r>
-      <w:r>
-        <w:t xml:space="preserve"> </w:t>
-      </w:r>
-      <w:r>
-        <w:t xml:space="preserve">— variables and samples on one set of axes.</w:t>
+        <w:t xml:space="preserve">Case sensitivity.</w:t>
+      </w:r>
+      <w:r>
+        <w:t xml:space="preserve"> </w:t>
+      </w:r>
+      <w:r>
+        <w:rPr>
+          <w:rStyle w:val="VerbatimChar"/>
+        </w:rPr>
+        <w:t xml:space="preserve">type="pca"</w:t>
+      </w:r>
+      <w:r>
+        <w:t xml:space="preserve"> </w:t>
+      </w:r>
+      <w:r>
+        <w:t xml:space="preserve">works;</w:t>
+      </w:r>
+      <w:r>
+        <w:t xml:space="preserve"> </w:t>
+      </w:r>
+      <w:r>
+        <w:rPr>
+          <w:rStyle w:val="VerbatimChar"/>
+        </w:rPr>
+        <w:t xml:space="preserve">type="PCA"</w:t>
+      </w:r>
+      <w:r>
+        <w:t xml:space="preserve"> </w:t>
+      </w:r>
+      <w:r>
+        <w:t xml:space="preserve">silently gives the</w:t>
+      </w:r>
+      <w:r>
+        <w:t xml:space="preserve"> </w:t>
+      </w:r>
+      <w:r>
+        <w:t xml:space="preserve">default biplot.</w:t>
       </w:r>
     </w:p>
     <w:p>
@@ -12302,126 +14396,68 @@
       </w:pPr>
       <w:r>
         <w:rPr>
-          <w:bCs/>
-          <w:b/>
-        </w:rPr>
-        <w:t xml:space="preserve">PCoA</w:t>
-      </w:r>
-      <w:r>
-        <w:t xml:space="preserve"> </w:t>
-      </w:r>
-      <w:r>
-        <w:t xml:space="preserve">— principal coordinate analysis; ordination from distances.</w:t>
-      </w:r>
-    </w:p>
-    <w:p>
-      <w:pPr>
-        <w:numPr>
-          <w:ilvl w:val="0"/>
-          <w:numId w:val="1004"/>
-        </w:numPr>
-        <w:pStyle w:val="Compact"/>
-      </w:pPr>
-      <w:r>
-        <w:rPr>
-          <w:bCs/>
-          <w:b/>
-        </w:rPr>
-        <w:t xml:space="preserve">MDS</w:t>
-      </w:r>
-      <w:r>
-        <w:t xml:space="preserve"> </w:t>
-      </w:r>
-      <w:r>
-        <w:t xml:space="preserve">— multidimensional scaling; a similarity map.</w:t>
-      </w:r>
-    </w:p>
-    <w:p>
-      <w:pPr>
-        <w:numPr>
-          <w:ilvl w:val="0"/>
-          <w:numId w:val="1004"/>
-        </w:numPr>
-        <w:pStyle w:val="Compact"/>
-      </w:pPr>
-      <w:r>
-        <w:rPr>
-          <w:bCs/>
-          <w:b/>
-        </w:rPr>
-        <w:t xml:space="preserve">Choropleth</w:t>
-      </w:r>
-      <w:r>
-        <w:t xml:space="preserve"> </w:t>
-      </w:r>
-      <w:r>
-        <w:t xml:space="preserve">— a map coloured by a variable’s value per area.</w:t>
-      </w:r>
-    </w:p>
-    <w:p>
-      <w:pPr>
-        <w:numPr>
-          <w:ilvl w:val="0"/>
-          <w:numId w:val="1004"/>
-        </w:numPr>
-        <w:pStyle w:val="Compact"/>
-      </w:pPr>
-      <w:r>
-        <w:rPr>
-          <w:bCs/>
-          <w:b/>
-        </w:rPr>
-        <w:t xml:space="preserve">clusplot</w:t>
-      </w:r>
-      <w:r>
-        <w:t xml:space="preserve"> </w:t>
-      </w:r>
-      <w:r>
-        <w:t xml:space="preserve">—</w:t>
-      </w:r>
-      <w:r>
-        <w:t xml:space="preserve"> </w:t>
-      </w:r>
-      <w:r>
-        <w:rPr>
-          <w:rStyle w:val="VerbatimChar"/>
-        </w:rPr>
-        <w:t xml:space="preserve">cluster</w:t>
-      </w:r>
-      <w:r>
-        <w:t xml:space="preserve">’s ordination plot with group hulls.</w:t>
-      </w:r>
-    </w:p>
-    <w:p>
-      <w:pPr>
-        <w:numPr>
-          <w:ilvl w:val="0"/>
-          <w:numId w:val="1004"/>
-        </w:numPr>
-        <w:pStyle w:val="Compact"/>
-      </w:pPr>
-      <w:r>
-        <w:rPr>
-          <w:bCs/>
-          <w:b/>
-        </w:rPr>
-        <w:t xml:space="preserve">Mahalanobis distance</w:t>
-      </w:r>
-      <w:r>
-        <w:t xml:space="preserve"> </w:t>
-      </w:r>
-      <w:r>
-        <w:t xml:space="preserve">— multivariate distance used for outlier detection.</w:t>
+          <w:rStyle w:val="VerbatimChar"/>
+          <w:bCs/>
+          <w:b/>
+        </w:rPr>
+        <w:t xml:space="preserve">plot="map"</w:t>
+      </w:r>
+      <w:r>
+        <w:rPr>
+          <w:bCs/>
+          <w:b/>
+        </w:rPr>
+        <w:t xml:space="preserve"> </w:t>
+      </w:r>
+      <w:r>
+        <w:rPr>
+          <w:bCs/>
+          <w:b/>
+        </w:rPr>
+        <w:t xml:space="preserve">is verbose</w:t>
+      </w:r>
+      <w:r>
+        <w:t xml:space="preserve"> </w:t>
+      </w:r>
+      <w:r>
+        <w:t xml:space="preserve">— it emits the biplot plus many</w:t>
+      </w:r>
+      <w:r>
+        <w:t xml:space="preserve"> </w:t>
+      </w:r>
+      <w:r>
+        <w:rPr>
+          <w:rStyle w:val="VerbatimChar"/>
+        </w:rPr>
+        <w:t xml:space="preserve">spplot</w:t>
+      </w:r>
+      <w:r>
+        <w:t xml:space="preserve"> </w:t>
+      </w:r>
+      <w:r>
+        <w:t xml:space="preserve">pages;</w:t>
+      </w:r>
+      <w:r>
+        <w:t xml:space="preserve"> </w:t>
+      </w:r>
+      <w:r>
+        <w:t xml:space="preserve">send it to a multi-page device (PDF) or a PNG sequence if you want to keep</w:t>
+      </w:r>
+      <w:r>
+        <w:t xml:space="preserve"> </w:t>
+      </w:r>
+      <w:r>
+        <w:t xml:space="preserve">them.</w:t>
       </w:r>
     </w:p>
     <w:bookmarkEnd w:id="92"/>
-    <w:bookmarkStart w:id="93" w:name="exercises"/>
+    <w:bookmarkStart w:id="93" w:name="glossary"/>
     <w:p>
       <w:pPr>
         <w:pStyle w:val="Heading2"/>
       </w:pPr>
       <w:r>
-        <w:t xml:space="preserve">31. Exercises</w:t>
+        <w:t xml:space="preserve">30. Glossary</w:t>
       </w:r>
     </w:p>
     <w:p>
@@ -12437,41 +14473,13 @@
           <w:bCs/>
           <w:b/>
         </w:rPr>
-        <w:t xml:space="preserve">Retention.</w:t>
-      </w:r>
-      <w:r>
-        <w:t xml:space="preserve"> </w:t>
-      </w:r>
-      <w:r>
-        <w:t xml:space="preserve">From</w:t>
-      </w:r>
-      <w:r>
-        <w:t xml:space="preserve"> </w:t>
-      </w:r>
-      <w:r>
-        <w:rPr>
-          <w:rStyle w:val="VerbatimChar"/>
-        </w:rPr>
-        <w:t xml:space="preserve">mod$eigen.value</w:t>
-      </w:r>
-      <w:r>
-        <w:t xml:space="preserve">, how many factors pass the Kaiser</w:t>
-      </w:r>
-      <w:r>
-        <w:t xml:space="preserve"> </w:t>
-      </w:r>
-      <w:r>
-        <w:t xml:space="preserve">rule? What cumulative variance do they carry?</w:t>
-      </w:r>
-      <w:r>
-        <w:t xml:space="preserve"> </w:t>
-      </w:r>
-      <w:r>
-        <w:rPr>
-          <w:iCs/>
-          <w:i/>
-        </w:rPr>
-        <w:t xml:space="preserve">(Answer: two; 74%.)</w:t>
+        <w:t xml:space="preserve">Loading</w:t>
+      </w:r>
+      <w:r>
+        <w:t xml:space="preserve"> </w:t>
+      </w:r>
+      <w:r>
+        <w:t xml:space="preserve">— weight relating a variable (R-mode) or sample (Q-mode) to a factor.</w:t>
       </w:r>
     </w:p>
     <w:p>
@@ -12487,67 +14495,13 @@
           <w:bCs/>
           <w:b/>
         </w:rPr>
-        <w:t xml:space="preserve">Scaling.</w:t>
-      </w:r>
-      <w:r>
-        <w:t xml:space="preserve"> </w:t>
-      </w:r>
-      <w:r>
-        <w:t xml:space="preserve">Run</w:t>
-      </w:r>
-      <w:r>
-        <w:t xml:space="preserve"> </w:t>
-      </w:r>
-      <w:r>
-        <w:rPr>
-          <w:rStyle w:val="VerbatimChar"/>
-        </w:rPr>
-        <w:t xml:space="preserve">qrfactor(csv, var=var, scale="data")</w:t>
-      </w:r>
-      <w:r>
-        <w:t xml:space="preserve"> </w:t>
-      </w:r>
-      <w:r>
-        <w:t xml:space="preserve">and compare</w:t>
-      </w:r>
-      <w:r>
-        <w:t xml:space="preserve"> </w:t>
-      </w:r>
-      <w:r>
-        <w:rPr>
-          <w:rStyle w:val="VerbatimChar"/>
-        </w:rPr>
-        <w:t xml:space="preserve">variance</w:t>
-      </w:r>
-      <w:r>
-        <w:t xml:space="preserve"> </w:t>
-      </w:r>
-      <w:r>
-        <w:t xml:space="preserve">to the default. Why does Factor 1 jump to ~99%?</w:t>
-      </w:r>
-      <w:r>
-        <w:t xml:space="preserve"> </w:t>
-      </w:r>
-      <w:r>
-        <w:rPr>
-          <w:iCs/>
-          <w:i/>
-        </w:rPr>
-        <w:t xml:space="preserve">(Covariance</w:t>
-      </w:r>
-      <w:r>
-        <w:rPr>
-          <w:iCs/>
-          <w:i/>
-        </w:rPr>
-        <w:t xml:space="preserve"> </w:t>
-      </w:r>
-      <w:r>
-        <w:rPr>
-          <w:iCs/>
-          <w:i/>
-        </w:rPr>
-        <w:t xml:space="preserve">scale lets the largest-magnitude variable dominate.)</w:t>
+        <w:t xml:space="preserve">Score</w:t>
+      </w:r>
+      <w:r>
+        <w:t xml:space="preserve"> </w:t>
+      </w:r>
+      <w:r>
+        <w:t xml:space="preserve">— a sample’s/variable’s coordinate on a factor.</w:t>
       </w:r>
     </w:p>
     <w:p>
@@ -12563,94 +14517,13 @@
           <w:bCs/>
           <w:b/>
         </w:rPr>
-        <w:t xml:space="preserve">Collinearity.</w:t>
-      </w:r>
-      <w:r>
-        <w:t xml:space="preserve"> </w:t>
-      </w:r>
-      <w:r>
-        <w:t xml:space="preserve">Drop</w:t>
-      </w:r>
-      <w:r>
-        <w:t xml:space="preserve"> </w:t>
-      </w:r>
-      <w:r>
-        <w:rPr>
-          <w:rStyle w:val="VerbatimChar"/>
-        </w:rPr>
-        <w:t xml:space="preserve">perCapitaW</w:t>
-      </w:r>
-      <w:r>
-        <w:t xml:space="preserve"> </w:t>
-      </w:r>
-      <w:r>
-        <w:t xml:space="preserve">from</w:t>
-      </w:r>
-      <w:r>
-        <w:t xml:space="preserve"> </w:t>
-      </w:r>
-      <w:r>
-        <w:rPr>
-          <w:rStyle w:val="VerbatimChar"/>
-        </w:rPr>
-        <w:t xml:space="preserve">var</w:t>
-      </w:r>
-      <w:r>
-        <w:t xml:space="preserve"> </w:t>
-      </w:r>
-      <w:r>
-        <w:t xml:space="preserve">and refit. What happens to</w:t>
-      </w:r>
-      <w:r>
-        <w:t xml:space="preserve"> </w:t>
-      </w:r>
-      <w:r>
-        <w:t xml:space="preserve">the smallest eigenvalue, and does</w:t>
-      </w:r>
-      <w:r>
-        <w:t xml:space="preserve"> </w:t>
-      </w:r>
-      <w:r>
-        <w:rPr>
-          <w:rStyle w:val="VerbatimChar"/>
-        </w:rPr>
-        <w:t xml:space="preserve">type="diagnose"</w:t>
-      </w:r>
-      <w:r>
-        <w:t xml:space="preserve"> </w:t>
-      </w:r>
-      <w:r>
-        <w:t xml:space="preserve">now draw the outlier</w:t>
-      </w:r>
-      <w:r>
-        <w:t xml:space="preserve"> </w:t>
-      </w:r>
-      <w:r>
-        <w:t xml:space="preserve">panel?</w:t>
-      </w:r>
-      <w:r>
-        <w:t xml:space="preserve"> </w:t>
-      </w:r>
-      <w:r>
-        <w:rPr>
-          <w:iCs/>
-          <w:i/>
-        </w:rPr>
-        <w:t xml:space="preserve">(The near-zero eigenvalue lifts; the covariance matrix is no longer</w:t>
-      </w:r>
-      <w:r>
-        <w:rPr>
-          <w:iCs/>
-          <w:i/>
-        </w:rPr>
-        <w:t xml:space="preserve"> </w:t>
-      </w:r>
-      <w:r>
-        <w:rPr>
-          <w:iCs/>
-          <w:i/>
-        </w:rPr>
-        <w:t xml:space="preserve">singular, so the panel renders.)</w:t>
+        <w:t xml:space="preserve">Eigenvalue</w:t>
+      </w:r>
+      <w:r>
+        <w:t xml:space="preserve"> </w:t>
+      </w:r>
+      <w:r>
+        <w:t xml:space="preserve">— variance captured by an axis; Kaiser rule keeps &gt; 1.</w:t>
       </w:r>
     </w:p>
     <w:p>
@@ -12666,46 +14539,13 @@
           <w:bCs/>
           <w:b/>
         </w:rPr>
-        <w:t xml:space="preserve">Spatial.</w:t>
-      </w:r>
-      <w:r>
-        <w:t xml:space="preserve"> </w:t>
-      </w:r>
-      <w:r>
-        <w:t xml:space="preserve">Fit the shapefile model, then map</w:t>
-      </w:r>
-      <w:r>
-        <w:t xml:space="preserve"> </w:t>
-      </w:r>
-      <w:r>
-        <w:rPr>
-          <w:rStyle w:val="VerbatimChar"/>
-        </w:rPr>
-        <w:t xml:space="preserve">index2</w:t>
-      </w:r>
-      <w:r>
-        <w:t xml:space="preserve"> </w:t>
-      </w:r>
-      <w:r>
-        <w:t xml:space="preserve">for every country by</w:t>
-      </w:r>
-      <w:r>
-        <w:t xml:space="preserve"> </w:t>
-      </w:r>
-      <w:r>
-        <w:t xml:space="preserve">colouring</w:t>
-      </w:r>
-      <w:r>
-        <w:t xml:space="preserve"> </w:t>
-      </w:r>
-      <w:r>
-        <w:rPr>
-          <w:rStyle w:val="VerbatimChar"/>
-        </w:rPr>
-        <w:t xml:space="preserve">smod$gisdata$index2</w:t>
-      </w:r>
-      <w:r>
-        <w:t xml:space="preserve">. Which countries top Factor 2?</w:t>
+        <w:t xml:space="preserve">R-mode / Q-mode</w:t>
+      </w:r>
+      <w:r>
+        <w:t xml:space="preserve"> </w:t>
+      </w:r>
+      <w:r>
+        <w:t xml:space="preserve">— classification of variables / of samples.</w:t>
       </w:r>
     </w:p>
     <w:p>
@@ -12721,6 +14561,444 @@
           <w:bCs/>
           <w:b/>
         </w:rPr>
+        <w:t xml:space="preserve">Biplot</w:t>
+      </w:r>
+      <w:r>
+        <w:t xml:space="preserve"> </w:t>
+      </w:r>
+      <w:r>
+        <w:t xml:space="preserve">— variables and samples on one set of axes.</w:t>
+      </w:r>
+    </w:p>
+    <w:p>
+      <w:pPr>
+        <w:numPr>
+          <w:ilvl w:val="0"/>
+          <w:numId w:val="1005"/>
+        </w:numPr>
+        <w:pStyle w:val="Compact"/>
+      </w:pPr>
+      <w:r>
+        <w:rPr>
+          <w:bCs/>
+          <w:b/>
+        </w:rPr>
+        <w:t xml:space="preserve">PCoA</w:t>
+      </w:r>
+      <w:r>
+        <w:t xml:space="preserve"> </w:t>
+      </w:r>
+      <w:r>
+        <w:t xml:space="preserve">— principal coordinate analysis; ordination from distances.</w:t>
+      </w:r>
+    </w:p>
+    <w:p>
+      <w:pPr>
+        <w:numPr>
+          <w:ilvl w:val="0"/>
+          <w:numId w:val="1005"/>
+        </w:numPr>
+        <w:pStyle w:val="Compact"/>
+      </w:pPr>
+      <w:r>
+        <w:rPr>
+          <w:bCs/>
+          <w:b/>
+        </w:rPr>
+        <w:t xml:space="preserve">MDS</w:t>
+      </w:r>
+      <w:r>
+        <w:t xml:space="preserve"> </w:t>
+      </w:r>
+      <w:r>
+        <w:t xml:space="preserve">— multidimensional scaling; a similarity map.</w:t>
+      </w:r>
+    </w:p>
+    <w:p>
+      <w:pPr>
+        <w:numPr>
+          <w:ilvl w:val="0"/>
+          <w:numId w:val="1005"/>
+        </w:numPr>
+        <w:pStyle w:val="Compact"/>
+      </w:pPr>
+      <w:r>
+        <w:rPr>
+          <w:bCs/>
+          <w:b/>
+        </w:rPr>
+        <w:t xml:space="preserve">Choropleth</w:t>
+      </w:r>
+      <w:r>
+        <w:t xml:space="preserve"> </w:t>
+      </w:r>
+      <w:r>
+        <w:t xml:space="preserve">— a map coloured by a variable’s value per area.</w:t>
+      </w:r>
+    </w:p>
+    <w:p>
+      <w:pPr>
+        <w:numPr>
+          <w:ilvl w:val="0"/>
+          <w:numId w:val="1005"/>
+        </w:numPr>
+        <w:pStyle w:val="Compact"/>
+      </w:pPr>
+      <w:r>
+        <w:rPr>
+          <w:bCs/>
+          <w:b/>
+        </w:rPr>
+        <w:t xml:space="preserve">clusplot</w:t>
+      </w:r>
+      <w:r>
+        <w:t xml:space="preserve"> </w:t>
+      </w:r>
+      <w:r>
+        <w:t xml:space="preserve">—</w:t>
+      </w:r>
+      <w:r>
+        <w:t xml:space="preserve"> </w:t>
+      </w:r>
+      <w:r>
+        <w:rPr>
+          <w:rStyle w:val="VerbatimChar"/>
+        </w:rPr>
+        <w:t xml:space="preserve">cluster</w:t>
+      </w:r>
+      <w:r>
+        <w:t xml:space="preserve">’s ordination plot with group hulls.</w:t>
+      </w:r>
+    </w:p>
+    <w:p>
+      <w:pPr>
+        <w:numPr>
+          <w:ilvl w:val="0"/>
+          <w:numId w:val="1005"/>
+        </w:numPr>
+        <w:pStyle w:val="Compact"/>
+      </w:pPr>
+      <w:r>
+        <w:rPr>
+          <w:bCs/>
+          <w:b/>
+        </w:rPr>
+        <w:t xml:space="preserve">Mahalanobis distance</w:t>
+      </w:r>
+      <w:r>
+        <w:t xml:space="preserve"> </w:t>
+      </w:r>
+      <w:r>
+        <w:t xml:space="preserve">— multivariate distance used for outlier detection.</w:t>
+      </w:r>
+    </w:p>
+    <w:bookmarkEnd w:id="93"/>
+    <w:bookmarkStart w:id="94" w:name="exercises"/>
+    <w:p>
+      <w:pPr>
+        <w:pStyle w:val="Heading2"/>
+      </w:pPr>
+      <w:r>
+        <w:t xml:space="preserve">31. Exercises</w:t>
+      </w:r>
+    </w:p>
+    <w:p>
+      <w:pPr>
+        <w:numPr>
+          <w:ilvl w:val="0"/>
+          <w:numId w:val="1006"/>
+        </w:numPr>
+        <w:pStyle w:val="Compact"/>
+      </w:pPr>
+      <w:r>
+        <w:rPr>
+          <w:bCs/>
+          <w:b/>
+        </w:rPr>
+        <w:t xml:space="preserve">Retention.</w:t>
+      </w:r>
+      <w:r>
+        <w:t xml:space="preserve"> </w:t>
+      </w:r>
+      <w:r>
+        <w:t xml:space="preserve">From</w:t>
+      </w:r>
+      <w:r>
+        <w:t xml:space="preserve"> </w:t>
+      </w:r>
+      <w:r>
+        <w:rPr>
+          <w:rStyle w:val="VerbatimChar"/>
+        </w:rPr>
+        <w:t xml:space="preserve">mod$eigen.value</w:t>
+      </w:r>
+      <w:r>
+        <w:t xml:space="preserve">, how many factors pass the Kaiser</w:t>
+      </w:r>
+      <w:r>
+        <w:t xml:space="preserve"> </w:t>
+      </w:r>
+      <w:r>
+        <w:t xml:space="preserve">rule? What cumulative variance do they carry?</w:t>
+      </w:r>
+      <w:r>
+        <w:t xml:space="preserve"> </w:t>
+      </w:r>
+      <w:r>
+        <w:rPr>
+          <w:iCs/>
+          <w:i/>
+        </w:rPr>
+        <w:t xml:space="preserve">(Answer: two; 74%.)</w:t>
+      </w:r>
+    </w:p>
+    <w:p>
+      <w:pPr>
+        <w:numPr>
+          <w:ilvl w:val="0"/>
+          <w:numId w:val="1006"/>
+        </w:numPr>
+        <w:pStyle w:val="Compact"/>
+      </w:pPr>
+      <w:r>
+        <w:rPr>
+          <w:bCs/>
+          <w:b/>
+        </w:rPr>
+        <w:t xml:space="preserve">Scaling.</w:t>
+      </w:r>
+      <w:r>
+        <w:t xml:space="preserve"> </w:t>
+      </w:r>
+      <w:r>
+        <w:t xml:space="preserve">Run</w:t>
+      </w:r>
+      <w:r>
+        <w:t xml:space="preserve"> </w:t>
+      </w:r>
+      <w:r>
+        <w:rPr>
+          <w:rStyle w:val="VerbatimChar"/>
+        </w:rPr>
+        <w:t xml:space="preserve">qrfactor(csv, var=var, scale="data")</w:t>
+      </w:r>
+      <w:r>
+        <w:t xml:space="preserve"> </w:t>
+      </w:r>
+      <w:r>
+        <w:t xml:space="preserve">and compare</w:t>
+      </w:r>
+      <w:r>
+        <w:t xml:space="preserve"> </w:t>
+      </w:r>
+      <w:r>
+        <w:rPr>
+          <w:rStyle w:val="VerbatimChar"/>
+        </w:rPr>
+        <w:t xml:space="preserve">variance</w:t>
+      </w:r>
+      <w:r>
+        <w:t xml:space="preserve"> </w:t>
+      </w:r>
+      <w:r>
+        <w:t xml:space="preserve">to the default. Why does Factor 1 jump to ~99%?</w:t>
+      </w:r>
+      <w:r>
+        <w:t xml:space="preserve"> </w:t>
+      </w:r>
+      <w:r>
+        <w:rPr>
+          <w:iCs/>
+          <w:i/>
+        </w:rPr>
+        <w:t xml:space="preserve">(Covariance</w:t>
+      </w:r>
+      <w:r>
+        <w:rPr>
+          <w:iCs/>
+          <w:i/>
+        </w:rPr>
+        <w:t xml:space="preserve"> </w:t>
+      </w:r>
+      <w:r>
+        <w:rPr>
+          <w:iCs/>
+          <w:i/>
+        </w:rPr>
+        <w:t xml:space="preserve">scale lets the largest-magnitude variable dominate.)</w:t>
+      </w:r>
+    </w:p>
+    <w:p>
+      <w:pPr>
+        <w:numPr>
+          <w:ilvl w:val="0"/>
+          <w:numId w:val="1006"/>
+        </w:numPr>
+        <w:pStyle w:val="Compact"/>
+      </w:pPr>
+      <w:r>
+        <w:rPr>
+          <w:bCs/>
+          <w:b/>
+        </w:rPr>
+        <w:t xml:space="preserve">Collinearity.</w:t>
+      </w:r>
+      <w:r>
+        <w:t xml:space="preserve"> </w:t>
+      </w:r>
+      <w:r>
+        <w:t xml:space="preserve">Drop</w:t>
+      </w:r>
+      <w:r>
+        <w:t xml:space="preserve"> </w:t>
+      </w:r>
+      <w:r>
+        <w:rPr>
+          <w:rStyle w:val="VerbatimChar"/>
+        </w:rPr>
+        <w:t xml:space="preserve">perCapitaW</w:t>
+      </w:r>
+      <w:r>
+        <w:t xml:space="preserve"> </w:t>
+      </w:r>
+      <w:r>
+        <w:t xml:space="preserve">from</w:t>
+      </w:r>
+      <w:r>
+        <w:t xml:space="preserve"> </w:t>
+      </w:r>
+      <w:r>
+        <w:rPr>
+          <w:rStyle w:val="VerbatimChar"/>
+        </w:rPr>
+        <w:t xml:space="preserve">var</w:t>
+      </w:r>
+      <w:r>
+        <w:t xml:space="preserve"> </w:t>
+      </w:r>
+      <w:r>
+        <w:t xml:space="preserve">and refit. What happens to</w:t>
+      </w:r>
+      <w:r>
+        <w:t xml:space="preserve"> </w:t>
+      </w:r>
+      <w:r>
+        <w:t xml:space="preserve">the smallest eigenvalue, and does</w:t>
+      </w:r>
+      <w:r>
+        <w:t xml:space="preserve"> </w:t>
+      </w:r>
+      <w:r>
+        <w:rPr>
+          <w:rStyle w:val="VerbatimChar"/>
+        </w:rPr>
+        <w:t xml:space="preserve">type="diagnose"</w:t>
+      </w:r>
+      <w:r>
+        <w:t xml:space="preserve"> </w:t>
+      </w:r>
+      <w:r>
+        <w:t xml:space="preserve">now draw the outlier</w:t>
+      </w:r>
+      <w:r>
+        <w:t xml:space="preserve"> </w:t>
+      </w:r>
+      <w:r>
+        <w:t xml:space="preserve">panel?</w:t>
+      </w:r>
+      <w:r>
+        <w:t xml:space="preserve"> </w:t>
+      </w:r>
+      <w:r>
+        <w:rPr>
+          <w:iCs/>
+          <w:i/>
+        </w:rPr>
+        <w:t xml:space="preserve">(The near-zero eigenvalue lifts; the covariance matrix is no longer</w:t>
+      </w:r>
+      <w:r>
+        <w:rPr>
+          <w:iCs/>
+          <w:i/>
+        </w:rPr>
+        <w:t xml:space="preserve"> </w:t>
+      </w:r>
+      <w:r>
+        <w:rPr>
+          <w:iCs/>
+          <w:i/>
+        </w:rPr>
+        <w:t xml:space="preserve">singular, so the panel renders.)</w:t>
+      </w:r>
+    </w:p>
+    <w:p>
+      <w:pPr>
+        <w:numPr>
+          <w:ilvl w:val="0"/>
+          <w:numId w:val="1006"/>
+        </w:numPr>
+        <w:pStyle w:val="Compact"/>
+      </w:pPr>
+      <w:r>
+        <w:rPr>
+          <w:bCs/>
+          <w:b/>
+        </w:rPr>
+        <w:t xml:space="preserve">Spatial.</w:t>
+      </w:r>
+      <w:r>
+        <w:t xml:space="preserve"> </w:t>
+      </w:r>
+      <w:r>
+        <w:t xml:space="preserve">Fit the shapefile model, then map</w:t>
+      </w:r>
+      <w:r>
+        <w:t xml:space="preserve"> </w:t>
+      </w:r>
+      <w:r>
+        <w:rPr>
+          <w:rStyle w:val="VerbatimChar"/>
+        </w:rPr>
+        <w:t xml:space="preserve">index2</w:t>
+      </w:r>
+      <w:r>
+        <w:t xml:space="preserve"> </w:t>
+      </w:r>
+      <w:r>
+        <w:t xml:space="preserve">for every country by</w:t>
+      </w:r>
+      <w:r>
+        <w:t xml:space="preserve"> </w:t>
+      </w:r>
+      <w:r>
+        <w:t xml:space="preserve">colouring</w:t>
+      </w:r>
+      <w:r>
+        <w:t xml:space="preserve"> </w:t>
+      </w:r>
+      <w:r>
+        <w:rPr>
+          <w:rStyle w:val="VerbatimChar"/>
+        </w:rPr>
+        <w:t xml:space="preserve">smod$gisdata$index2</w:t>
+      </w:r>
+      <w:r>
+        <w:t xml:space="preserve">. Which countries top Factor 2?</w:t>
+      </w:r>
+    </w:p>
+    <w:p>
+      <w:pPr>
+        <w:numPr>
+          <w:ilvl w:val="0"/>
+          <w:numId w:val="1006"/>
+        </w:numPr>
+        <w:pStyle w:val="Compact"/>
+      </w:pPr>
+      <w:r>
+        <w:rPr>
+          <w:bCs/>
+          <w:b/>
+        </w:rPr>
         <w:t xml:space="preserve">Reproducibility.</w:t>
       </w:r>
       <w:r>
@@ -12856,8 +15134,8 @@
         <w:t xml:space="preserve">for the 1.5 change list.</w:t>
       </w:r>
     </w:p>
-    <w:bookmarkEnd w:id="93"/>
     <w:bookmarkEnd w:id="94"/>
+    <w:bookmarkEnd w:id="95"/>
     <w:sectPr/>
   </w:body>
 </w:document>
@@ -13141,6 +15419,9 @@
     <w:abstractNumId w:val="991"/>
   </w:num>
   <w:num w:numId="1005">
+    <w:abstractNumId w:val="991"/>
+  </w:num>
+  <w:num w:numId="1006">
     <w:abstractNumId w:val="99411"/>
     <w:lvlOverride w:ilvl="0">
       <w:startOverride w:val="1"/>

</xml_diff>

<commit_message>
Manual: add data types/assumptions, robustness, and full type= reference
</commit_message>
<xml_diff>
--- a/manual/qrfactor_manual.docx
+++ b/manual/qrfactor_manual.docx
@@ -408,6 +408,12 @@
         <w:t xml:space="preserve"> </w:t>
       </w:r>
       <w:r>
+        <w:t xml:space="preserve">5b. Data types, and the assumptions behind them</w:t>
+      </w:r>
+      <w:r>
+        <w:t xml:space="preserve"> </w:t>
+      </w:r>
+      <w:r>
         <w:t xml:space="preserve">6. PCA — the shared foundation</w:t>
       </w:r>
       <w:r>
@@ -598,6 +604,33 @@
       </w:r>
       <w:r>
         <w:t xml:space="preserve">24. Using an in-memory spatial object</w:t>
+      </w:r>
+      <w:r>
+        <w:t xml:space="preserve"> </w:t>
+      </w:r>
+      <w:r>
+        <w:t xml:space="preserve">24b. The African water paradox, in numbers</w:t>
+      </w:r>
+      <w:r>
+        <w:t xml:space="preserve"> </w:t>
+      </w:r>
+      <w:r>
+        <w:t xml:space="preserve">24c. What makes</w:t>
+      </w:r>
+      <w:r>
+        <w:t xml:space="preserve"> </w:t>
+      </w:r>
+      <w:r>
+        <w:rPr>
+          <w:rStyle w:val="VerbatimChar"/>
+        </w:rPr>
+        <w:t xml:space="preserve">qrfactor</w:t>
+      </w:r>
+      <w:r>
+        <w:t xml:space="preserve"> </w:t>
+      </w:r>
+      <w:r>
+        <w:t xml:space="preserve">robust</w:t>
       </w:r>
     </w:p>
     <w:p>
@@ -693,7 +726,7 @@
     </w:p>
     <w:bookmarkEnd w:id="20"/>
     <w:bookmarkEnd w:id="21"/>
-    <w:bookmarkStart w:id="61" w:name="part-1-the-method-step-by-step"/>
+    <w:bookmarkStart w:id="62" w:name="part-1-the-method-step-by-step"/>
     <w:p>
       <w:pPr>
         <w:pStyle w:val="Heading1"/>
@@ -2870,13 +2903,13 @@
       </w:r>
     </w:p>
     <w:bookmarkEnd w:id="26"/>
-    <w:bookmarkStart w:id="27" w:name="pca-the-shared-foundation"/>
+    <w:bookmarkStart w:id="27" w:name="X8d1bbda243f5e1f7757e1633b0142195d81ff06"/>
     <w:p>
       <w:pPr>
         <w:pStyle w:val="Heading2"/>
       </w:pPr>
       <w:r>
-        <w:t xml:space="preserve">6. PCA — the shared foundation</w:t>
+        <w:t xml:space="preserve">5b. Data types, and the assumptions behind them</w:t>
       </w:r>
     </w:p>
     <w:p>
@@ -2884,343 +2917,244 @@
         <w:pStyle w:val="FirstParagraph"/>
       </w:pPr>
       <w:r>
-        <w:t xml:space="preserve">Every analysis here starts from the eigen-decomposition of the (scaled) data.</w:t>
-      </w:r>
-      <w:r>
-        <w:t xml:space="preserve"> </w:t>
-      </w:r>
-      <w:r>
-        <w:t xml:space="preserve">The eigenvalues tell you how many axes matter; their square roots are the</w:t>
-      </w:r>
-      <w:r>
-        <w:t xml:space="preserve"> </w:t>
-      </w:r>
-      <w:r>
-        <w:t xml:space="preserve">familiar PCA standard deviations.</w:t>
-      </w:r>
-    </w:p>
-    <w:p>
-      <w:pPr>
-        <w:pStyle w:val="SourceCode"/>
-      </w:pPr>
-      <w:r>
-        <w:rPr>
-          <w:rStyle w:val="NormalTok"/>
-        </w:rPr>
-        <w:t xml:space="preserve">mod</w:t>
-      </w:r>
-      <w:r>
-        <w:rPr>
-          <w:rStyle w:val="SpecialCharTok"/>
-        </w:rPr>
-        <w:t xml:space="preserve">$</w:t>
-      </w:r>
-      <w:r>
-        <w:rPr>
-          <w:rStyle w:val="NormalTok"/>
-        </w:rPr>
-        <w:t xml:space="preserve">eigen.value</w:t>
-      </w:r>
-      <w:r>
-        <w:br/>
-      </w:r>
-      <w:r>
-        <w:rPr>
-          <w:rStyle w:val="CommentTok"/>
-        </w:rPr>
-        <w:t xml:space="preserve">#&gt; [1] 3.360e+00 1.079e+00 9.059e-01 5.212e-01 1.339e-01 9.076e-07</w:t>
-      </w:r>
-      <w:r>
-        <w:br/>
-      </w:r>
-      <w:r>
-        <w:rPr>
-          <w:rStyle w:val="FunctionTok"/>
-        </w:rPr>
-        <w:t xml:space="preserve">sqrt</w:t>
-      </w:r>
-      <w:r>
-        <w:rPr>
-          <w:rStyle w:val="NormalTok"/>
-        </w:rPr>
-        <w:t xml:space="preserve">(mod</w:t>
-      </w:r>
-      <w:r>
-        <w:rPr>
-          <w:rStyle w:val="SpecialCharTok"/>
-        </w:rPr>
-        <w:t xml:space="preserve">$</w:t>
-      </w:r>
-      <w:r>
-        <w:rPr>
-          <w:rStyle w:val="NormalTok"/>
-        </w:rPr>
-        <w:t xml:space="preserve">eigen.value)                 </w:t>
-      </w:r>
-      <w:r>
-        <w:rPr>
-          <w:rStyle w:val="CommentTok"/>
-        </w:rPr>
-        <w:t xml:space="preserve"># PCA standard deviations</w:t>
-      </w:r>
-      <w:r>
-        <w:br/>
-      </w:r>
-      <w:r>
-        <w:rPr>
-          <w:rStyle w:val="CommentTok"/>
-        </w:rPr>
-        <w:t xml:space="preserve">#&gt; [1] 1.8331 1.0386 0.9518 0.7219 0.3659 0.0010</w:t>
-      </w:r>
-      <w:r>
-        <w:br/>
-      </w:r>
-      <w:r>
-        <w:rPr>
-          <w:rStyle w:val="NormalTok"/>
-        </w:rPr>
-        <w:t xml:space="preserve">mod</w:t>
-      </w:r>
-      <w:r>
-        <w:rPr>
-          <w:rStyle w:val="SpecialCharTok"/>
-        </w:rPr>
-        <w:t xml:space="preserve">$</w:t>
-      </w:r>
-      <w:r>
-        <w:rPr>
-          <w:rStyle w:val="NormalTok"/>
-        </w:rPr>
-        <w:t xml:space="preserve">variance                          </w:t>
-      </w:r>
-      <w:r>
-        <w:rPr>
-          <w:rStyle w:val="CommentTok"/>
-        </w:rPr>
-        <w:t xml:space="preserve"># % variance per axis</w:t>
-      </w:r>
-      <w:r>
-        <w:br/>
-      </w:r>
-      <w:r>
-        <w:rPr>
-          <w:rStyle w:val="CommentTok"/>
-        </w:rPr>
-        <w:t xml:space="preserve">#&gt; [1] 56.007 17.977 15.098  8.686  2.231  0.000</w:t>
-      </w:r>
-      <w:r>
-        <w:br/>
-      </w:r>
-      <w:r>
-        <w:rPr>
-          <w:rStyle w:val="NormalTok"/>
-        </w:rPr>
-        <w:t xml:space="preserve">mod</w:t>
-      </w:r>
-      <w:r>
-        <w:rPr>
-          <w:rStyle w:val="SpecialCharTok"/>
-        </w:rPr>
-        <w:t xml:space="preserve">$</w:t>
-      </w:r>
-      <w:r>
-        <w:rPr>
-          <w:rStyle w:val="NormalTok"/>
-        </w:rPr>
-        <w:t xml:space="preserve">cumvariance                       </w:t>
-      </w:r>
-      <w:r>
-        <w:rPr>
-          <w:rStyle w:val="CommentTok"/>
-        </w:rPr>
-        <w:t xml:space="preserve"># cumulative %</w:t>
-      </w:r>
-      <w:r>
-        <w:br/>
-      </w:r>
-      <w:r>
-        <w:rPr>
-          <w:rStyle w:val="CommentTok"/>
-        </w:rPr>
-        <w:t xml:space="preserve">#&gt; [1]  56.01  73.98  89.08  97.77 100.00 100.00</w:t>
-      </w:r>
-    </w:p>
-    <w:p>
-      <w:pPr>
-        <w:pStyle w:val="FirstParagraph"/>
-      </w:pPr>
-      <w:r>
-        <w:t xml:space="preserve">Reading this:</w:t>
-      </w:r>
-      <w:r>
-        <w:t xml:space="preserve"> </w:t>
-      </w:r>
-      <w:r>
-        <w:rPr>
-          <w:bCs/>
-          <w:b/>
-        </w:rPr>
-        <w:t xml:space="preserve">Factor 1 alone explains 56% of the variation, and the first two</w:t>
-      </w:r>
-      <w:r>
-        <w:rPr>
-          <w:bCs/>
-          <w:b/>
-        </w:rPr>
-        <w:t xml:space="preserve"> </w:t>
-      </w:r>
-      <w:r>
-        <w:rPr>
-          <w:bCs/>
-          <w:b/>
-        </w:rPr>
-        <w:t xml:space="preserve">axes 74%.</w:t>
-      </w:r>
-      <w:r>
-        <w:t xml:space="preserve"> </w:t>
-      </w:r>
-      <w:r>
-        <w:t xml:space="preserve">By the Kaiser rule (eigenvalue &gt; 1) you retain</w:t>
-      </w:r>
-      <w:r>
-        <w:t xml:space="preserve"> </w:t>
-      </w:r>
-      <w:r>
-        <w:rPr>
-          <w:bCs/>
-          <w:b/>
-        </w:rPr>
-        <w:t xml:space="preserve">two</w:t>
-      </w:r>
-      <w:r>
-        <w:t xml:space="preserve"> </w:t>
-      </w:r>
-      <w:r>
-        <w:t xml:space="preserve">factors</w:t>
-      </w:r>
-      <w:r>
-        <w:t xml:space="preserve"> </w:t>
-      </w:r>
-      <w:r>
-        <w:t xml:space="preserve">(3.36 and 1.08; the third is 0.91, just under 1). The sixth eigenvalue is</w:t>
-      </w:r>
-      <w:r>
-        <w:t xml:space="preserve"> </w:t>
-      </w:r>
-      <w:r>
-        <w:t xml:space="preserve">essentially zero — a signal that two variables are nearly redundant (Section</w:t>
-      </w:r>
-      <w:r>
-        <w:t xml:space="preserve"> </w:t>
-      </w:r>
-      <w:r>
-        <w:t xml:space="preserve">29).</w:t>
-      </w:r>
-    </w:p>
-    <w:p>
-      <w:pPr>
-        <w:pStyle w:val="BodyText"/>
-      </w:pPr>
-      <w:r>
-        <w:rPr>
-          <w:bCs/>
-          <w:b/>
-        </w:rPr>
-        <w:t xml:space="preserve">Where those axes come from — the correlations.</w:t>
-      </w:r>
-      <w:r>
-        <w:t xml:space="preserve"> </w:t>
-      </w:r>
-      <w:r>
-        <w:t xml:space="preserve">The decomposition is driven</w:t>
-      </w:r>
-      <w:r>
-        <w:t xml:space="preserve"> </w:t>
-      </w:r>
-      <w:r>
-        <w:t xml:space="preserve">by the correlation matrix (</w:t>
-      </w:r>
-      <w:r>
-        <w:rPr>
-          <w:rStyle w:val="VerbatimChar"/>
-        </w:rPr>
-        <w:t xml:space="preserve">round(mod$correlation, 2)</w:t>
-      </w:r>
-      <w:r>
-        <w:t xml:space="preserve">):</w:t>
-      </w:r>
-    </w:p>
-    <w:p>
-      <w:pPr>
-        <w:pStyle w:val="SourceCode"/>
-      </w:pPr>
-      <w:r>
-        <w:rPr>
-          <w:rStyle w:val="VerbatimChar"/>
-        </w:rPr>
-        <w:t xml:space="preserve">           Domestic Industry Agricultur Resources withdrawal perCapitaW</w:t>
-      </w:r>
-      <w:r>
-        <w:br/>
-      </w:r>
-      <w:r>
-        <w:rPr>
-          <w:rStyle w:val="VerbatimChar"/>
-        </w:rPr>
-        <w:t xml:space="preserve">Domestic      1.00     0.75       0.33     -0.19       0.29       0.44</w:t>
-      </w:r>
-      <w:r>
-        <w:br/>
-      </w:r>
-      <w:r>
-        <w:rPr>
-          <w:rStyle w:val="VerbatimChar"/>
-        </w:rPr>
-        <w:t xml:space="preserve">Industry      0.75     1.00       0.47     -0.15       0.65       0.55</w:t>
-      </w:r>
-      <w:r>
-        <w:br/>
-      </w:r>
-      <w:r>
-        <w:rPr>
-          <w:rStyle w:val="VerbatimChar"/>
-        </w:rPr>
-        <w:t xml:space="preserve">Agricultur    0.33     0.47       1.00     -0.12       0.63       0.99</w:t>
-      </w:r>
-      <w:r>
-        <w:br/>
-      </w:r>
-      <w:r>
-        <w:rPr>
-          <w:rStyle w:val="VerbatimChar"/>
-        </w:rPr>
-        <w:t xml:space="preserve">Resources    -0.19    -0.15      -0.12      1.00      -0.04      -0.14</w:t>
-      </w:r>
-      <w:r>
-        <w:br/>
-      </w:r>
-      <w:r>
-        <w:rPr>
-          <w:rStyle w:val="VerbatimChar"/>
-        </w:rPr>
-        <w:t xml:space="preserve">withdrawal    0.29     0.65       0.63     -0.04       1.00       0.65</w:t>
-      </w:r>
-      <w:r>
-        <w:br/>
-      </w:r>
-      <w:r>
-        <w:rPr>
-          <w:rStyle w:val="VerbatimChar"/>
-        </w:rPr>
-        <w:t xml:space="preserve">perCapitaW    0.44     0.55       0.99     -0.14       0.65       1.00</w:t>
-      </w:r>
-    </w:p>
-    <w:p>
-      <w:pPr>
-        <w:pStyle w:val="FirstParagraph"/>
-      </w:pPr>
-      <w:r>
-        <w:t xml:space="preserve">Three facts jump out, and together they</w:t>
+        <w:rPr>
+          <w:rStyle w:val="VerbatimChar"/>
+        </w:rPr>
+        <w:t xml:space="preserve">qrfactor</w:t>
+      </w:r>
+      <w:r>
+        <w:t xml:space="preserve"> </w:t>
+      </w:r>
+      <w:r>
+        <w:t xml:space="preserve">is built on the eigen-decomposition of a correlation or covariance</w:t>
+      </w:r>
+      <w:r>
+        <w:t xml:space="preserve"> </w:t>
+      </w:r>
+      <w:r>
+        <w:t xml:space="preserve">matrix, so its native input is</w:t>
+      </w:r>
+      <w:r>
+        <w:t xml:space="preserve"> </w:t>
+      </w:r>
+      <w:r>
+        <w:rPr>
+          <w:bCs/>
+          <w:b/>
+        </w:rPr>
+        <w:t xml:space="preserve">quantitative</w:t>
+      </w:r>
+      <w:r>
+        <w:t xml:space="preserve">. But the door is wider than that</w:t>
+      </w:r>
+      <w:r>
+        <w:t xml:space="preserve"> </w:t>
+      </w:r>
+      <w:r>
+        <w:t xml:space="preserve">if you prepare the data:</w:t>
+      </w:r>
+    </w:p>
+    <w:p>
+      <w:pPr>
+        <w:numPr>
+          <w:ilvl w:val="0"/>
+          <w:numId w:val="1002"/>
+        </w:numPr>
+        <w:pStyle w:val="Compact"/>
+      </w:pPr>
+      <w:r>
+        <w:rPr>
+          <w:bCs/>
+          <w:b/>
+        </w:rPr>
+        <w:t xml:space="preserve">Quantitative (continuous / ratio)</w:t>
+      </w:r>
+      <w:r>
+        <w:t xml:space="preserve"> </w:t>
+      </w:r>
+      <w:r>
+        <w:t xml:space="preserve">— the intended input: withdrawals,</w:t>
+      </w:r>
+      <w:r>
+        <w:t xml:space="preserve"> </w:t>
+      </w:r>
+      <w:r>
+        <w:t xml:space="preserve">areas, concentrations, counts. Used directly.</w:t>
+      </w:r>
+    </w:p>
+    <w:p>
+      <w:pPr>
+        <w:numPr>
+          <w:ilvl w:val="0"/>
+          <w:numId w:val="1002"/>
+        </w:numPr>
+        <w:pStyle w:val="Compact"/>
+      </w:pPr>
+      <w:r>
+        <w:rPr>
+          <w:bCs/>
+          <w:b/>
+        </w:rPr>
+        <w:t xml:space="preserve">Ordinal (Likert, ranks, ordered classes)</w:t>
+      </w:r>
+      <w:r>
+        <w:t xml:space="preserve"> </w:t>
+      </w:r>
+      <w:r>
+        <w:t xml:space="preserve">— treat as numeric. Scoring a</w:t>
+      </w:r>
+      <w:r>
+        <w:t xml:space="preserve"> </w:t>
+      </w:r>
+      <w:r>
+        <w:t xml:space="preserve">1–5 agreement scale and analysing it is standard practice in the social</w:t>
+      </w:r>
+      <w:r>
+        <w:t xml:space="preserve"> </w:t>
+      </w:r>
+      <w:r>
+        <w:t xml:space="preserve">sciences; it is an approximation (the gaps are assumed equal), but a</w:t>
+      </w:r>
+      <w:r>
+        <w:t xml:space="preserve"> </w:t>
+      </w:r>
+      <w:r>
+        <w:t xml:space="preserve">serviceable one.</w:t>
+      </w:r>
+    </w:p>
+    <w:p>
+      <w:pPr>
+        <w:numPr>
+          <w:ilvl w:val="0"/>
+          <w:numId w:val="1002"/>
+        </w:numPr>
+        <w:pStyle w:val="Compact"/>
+      </w:pPr>
+      <w:r>
+        <w:rPr>
+          <w:bCs/>
+          <w:b/>
+        </w:rPr>
+        <w:t xml:space="preserve">Qualitative / nominal (categories, presence–absence)</w:t>
+      </w:r>
+      <w:r>
+        <w:t xml:space="preserve"> </w:t>
+      </w:r>
+      <w:r>
+        <w:t xml:space="preserve">—</w:t>
+      </w:r>
+      <w:r>
+        <w:t xml:space="preserve"> </w:t>
+      </w:r>
+      <w:r>
+        <w:rPr>
+          <w:bCs/>
+          <w:b/>
+        </w:rPr>
+        <w:t xml:space="preserve">not</w:t>
+      </w:r>
+      <w:r>
+        <w:t xml:space="preserve"> </w:t>
+      </w:r>
+      <w:r>
+        <w:t xml:space="preserve">analysed</w:t>
+      </w:r>
+      <w:r>
+        <w:t xml:space="preserve"> </w:t>
+      </w:r>
+      <w:r>
+        <w:t xml:space="preserve">raw; encode it numerically first. Turn a category into</w:t>
+      </w:r>
+      <w:r>
+        <w:t xml:space="preserve"> </w:t>
+      </w:r>
+      <w:r>
+        <w:rPr>
+          <w:bCs/>
+          <w:b/>
+        </w:rPr>
+        <w:t xml:space="preserve">indicator (0/1)</w:t>
+      </w:r>
+      <w:r>
+        <w:rPr>
+          <w:bCs/>
+          <w:b/>
+        </w:rPr>
+        <w:t xml:space="preserve"> </w:t>
+      </w:r>
+      <w:r>
+        <w:rPr>
+          <w:bCs/>
+          <w:b/>
+        </w:rPr>
+        <w:t xml:space="preserve">columns</w:t>
+      </w:r>
+      <w:r>
+        <w:t xml:space="preserve">, or use</w:t>
+      </w:r>
+      <w:r>
+        <w:t xml:space="preserve"> </w:t>
+      </w:r>
+      <w:r>
+        <w:rPr>
+          <w:bCs/>
+          <w:b/>
+        </w:rPr>
+        <w:t xml:space="preserve">frequencies / counts</w:t>
+      </w:r>
+      <w:r>
+        <w:t xml:space="preserve"> </w:t>
+      </w:r>
+      <w:r>
+        <w:t xml:space="preserve">per class. Once the column is</w:t>
+      </w:r>
+      <w:r>
+        <w:t xml:space="preserve"> </w:t>
+      </w:r>
+      <w:r>
+        <w:t xml:space="preserve">numeric, every analysis in this manual works on it.</w:t>
+      </w:r>
+    </w:p>
+    <w:p>
+      <w:pPr>
+        <w:pStyle w:val="BlockText"/>
+      </w:pPr>
+      <w:r>
+        <w:rPr>
+          <w:bCs/>
+          <w:b/>
+        </w:rPr>
+        <w:t xml:space="preserve">On correspondence and coordinate views.</w:t>
+      </w:r>
+      <w:r>
+        <w:t xml:space="preserve"> </w:t>
+      </w:r>
+      <w:r>
+        <w:rPr>
+          <w:rStyle w:val="VerbatimChar"/>
+        </w:rPr>
+        <w:t xml:space="preserve">type="coord"</w:t>
+      </w:r>
+      <w:r>
+        <w:t xml:space="preserve"> </w:t>
+      </w:r>
+      <w:r>
+        <w:t xml:space="preserve">(PCoA) and</w:t>
+      </w:r>
+      <w:r>
+        <w:t xml:space="preserve"> </w:t>
+      </w:r>
+      <w:r>
+        <w:rPr>
+          <w:rStyle w:val="VerbatimChar"/>
+        </w:rPr>
+        <w:t xml:space="preserve">type="ca"</w:t>
+      </w:r>
+      <w:r>
+        <w:t xml:space="preserve"> </w:t>
+      </w:r>
+      <w:r>
+        <w:t xml:space="preserve">(correspondence)</w:t>
       </w:r>
       <w:r>
         <w:t xml:space="preserve"> </w:t>
@@ -3230,157 +3164,40 @@
           <w:iCs/>
           <w:i/>
         </w:rPr>
-        <w:t xml:space="preserve">are</w:t>
-      </w:r>
-      <w:r>
-        <w:t xml:space="preserve"> </w:t>
-      </w:r>
-      <w:r>
-        <w:t xml:space="preserve">the paradox:</w:t>
-      </w:r>
-      <w:r>
-        <w:t xml:space="preserve"> </w:t>
-      </w:r>
-      <w:r>
-        <w:t xml:space="preserve">1.</w:t>
-      </w:r>
-      <w:r>
-        <w:t xml:space="preserve"> </w:t>
-      </w:r>
-      <w:r>
-        <w:rPr>
-          <w:rStyle w:val="VerbatimChar"/>
-          <w:bCs/>
-          <w:b/>
-        </w:rPr>
-        <w:t xml:space="preserve">Agricultur</w:t>
-      </w:r>
-      <w:r>
-        <w:rPr>
-          <w:bCs/>
-          <w:b/>
-        </w:rPr>
-        <w:t xml:space="preserve"> </w:t>
-      </w:r>
-      <w:r>
-        <w:rPr>
-          <w:bCs/>
-          <w:b/>
-        </w:rPr>
-        <w:t xml:space="preserve">and</w:t>
-      </w:r>
-      <w:r>
-        <w:rPr>
-          <w:bCs/>
-          <w:b/>
-        </w:rPr>
-        <w:t xml:space="preserve"> </w:t>
-      </w:r>
-      <w:r>
-        <w:rPr>
-          <w:rStyle w:val="VerbatimChar"/>
-          <w:bCs/>
-          <w:b/>
-        </w:rPr>
-        <w:t xml:space="preserve">perCapitaW</w:t>
-      </w:r>
-      <w:r>
-        <w:rPr>
-          <w:bCs/>
-          <w:b/>
-        </w:rPr>
-        <w:t xml:space="preserve"> </w:t>
-      </w:r>
-      <w:r>
-        <w:rPr>
-          <w:bCs/>
-          <w:b/>
-        </w:rPr>
-        <w:t xml:space="preserve">correlate 0.99</w:t>
-      </w:r>
-      <w:r>
-        <w:t xml:space="preserve"> </w:t>
-      </w:r>
-      <w:r>
-        <w:t xml:space="preserve">— in Africa, per-capita</w:t>
-      </w:r>
-      <w:r>
-        <w:t xml:space="preserve"> </w:t>
-      </w:r>
-      <w:r>
-        <w:t xml:space="preserve">water use is agricultural water use; irrigation dominates the total. (This</w:t>
-      </w:r>
-      <w:r>
-        <w:t xml:space="preserve"> </w:t>
-      </w:r>
-      <w:r>
-        <w:t xml:space="preserve">near-duplication is why the 6th eigenvalue collapses to zero; Section 29.)</w:t>
-      </w:r>
-      <w:r>
-        <w:t xml:space="preserve"> </w:t>
-      </w:r>
-      <w:r>
-        <w:t xml:space="preserve">2.</w:t>
-      </w:r>
-      <w:r>
-        <w:t xml:space="preserve"> </w:t>
-      </w:r>
-      <w:r>
-        <w:rPr>
-          <w:rStyle w:val="VerbatimChar"/>
-          <w:bCs/>
-          <w:b/>
-        </w:rPr>
-        <w:t xml:space="preserve">Domestic</w:t>
-      </w:r>
-      <w:r>
-        <w:rPr>
-          <w:bCs/>
-          <w:b/>
-        </w:rPr>
-        <w:t xml:space="preserve"> </w:t>
-      </w:r>
-      <w:r>
-        <w:rPr>
-          <w:bCs/>
-          <w:b/>
-        </w:rPr>
-        <w:t xml:space="preserve">and</w:t>
-      </w:r>
-      <w:r>
-        <w:rPr>
-          <w:bCs/>
-          <w:b/>
-        </w:rPr>
-        <w:t xml:space="preserve"> </w:t>
-      </w:r>
-      <w:r>
-        <w:rPr>
-          <w:rStyle w:val="VerbatimChar"/>
-          <w:bCs/>
-          <w:b/>
-        </w:rPr>
-        <w:t xml:space="preserve">Industry</w:t>
-      </w:r>
-      <w:r>
-        <w:rPr>
-          <w:bCs/>
-          <w:b/>
-        </w:rPr>
-        <w:t xml:space="preserve"> </w:t>
-      </w:r>
-      <w:r>
-        <w:rPr>
-          <w:bCs/>
-          <w:b/>
-        </w:rPr>
-        <w:t xml:space="preserve">correlate 0.75</w:t>
-      </w:r>
-      <w:r>
-        <w:t xml:space="preserve"> </w:t>
-      </w:r>
-      <w:r>
-        <w:t xml:space="preserve">— the two</w:t>
+        <w:t xml:space="preserve">relabel</w:t>
+      </w:r>
+      <w:r>
+        <w:t xml:space="preserve"> </w:t>
+      </w:r>
+      <w:r>
+        <w:t xml:space="preserve">the ordination axes — and on ordinary</w:t>
+      </w:r>
+      <w:r>
+        <w:t xml:space="preserve"> </w:t>
+      </w:r>
+      <w:r>
+        <w:t xml:space="preserve">Euclidean data principal-coordinate analysis is mathematically the same as</w:t>
+      </w:r>
+      <w:r>
+        <w:t xml:space="preserve"> </w:t>
+      </w:r>
+      <w:r>
+        <w:t xml:space="preserve">PCA, so the PCoA view is exact. But</w:t>
+      </w:r>
+      <w:r>
+        <w:t xml:space="preserve"> </w:t>
+      </w:r>
+      <w:r>
+        <w:rPr>
+          <w:rStyle w:val="VerbatimChar"/>
+        </w:rPr>
+        <w:t xml:space="preserve">type="ca"</w:t>
+      </w:r>
+      <w:r>
+        <w:t xml:space="preserve"> </w:t>
+      </w:r>
+      <w:r>
+        <w:t xml:space="preserve">shows the eigen-biplot under a</w:t>
       </w:r>
       <w:r>
         <w:t xml:space="preserve"> </w:t>
@@ -3389,7 +3206,7 @@
         <w:t xml:space="preserve">“</w:t>
       </w:r>
       <w:r>
-        <w:t xml:space="preserve">modern-economy</w:t>
+        <w:t xml:space="preserve">Correspondence Analysis</w:t>
       </w:r>
       <w:r>
         <w:t xml:space="preserve">”</w:t>
@@ -3398,50 +3215,145 @@
         <w:t xml:space="preserve"> </w:t>
       </w:r>
       <w:r>
-        <w:t xml:space="preserve">uses</w:t>
-      </w:r>
-      <w:r>
-        <w:t xml:space="preserve"> </w:t>
-      </w:r>
-      <w:r>
-        <w:t xml:space="preserve">rise together with development and urbanisation.</w:t>
-      </w:r>
-      <w:r>
-        <w:t xml:space="preserve"> </w:t>
-      </w:r>
-      <w:r>
-        <w:t xml:space="preserve">3.</w:t>
-      </w:r>
-      <w:r>
-        <w:t xml:space="preserve"> </w:t>
-      </w:r>
-      <w:r>
-        <w:rPr>
-          <w:rStyle w:val="VerbatimChar"/>
-          <w:bCs/>
-          <w:b/>
-        </w:rPr>
-        <w:t xml:space="preserve">Resources</w:t>
-      </w:r>
-      <w:r>
-        <w:rPr>
-          <w:bCs/>
-          <w:b/>
-        </w:rPr>
-        <w:t xml:space="preserve"> </w:t>
-      </w:r>
-      <w:r>
-        <w:rPr>
-          <w:bCs/>
-          <w:b/>
-        </w:rPr>
-        <w:t xml:space="preserve">correlates with everything at −0.04 to −0.19</w:t>
-      </w:r>
-      <w:r>
-        <w:t xml:space="preserve"> </w:t>
-      </w:r>
-      <w:r>
-        <w:t xml:space="preserve">— renewable</w:t>
+        <w:t xml:space="preserve">title; it is a</w:t>
+      </w:r>
+      <w:r>
+        <w:t xml:space="preserve"> </w:t>
+      </w:r>
+      <w:r>
+        <w:rPr>
+          <w:bCs/>
+          <w:b/>
+        </w:rPr>
+        <w:t xml:space="preserve">presentation view, not</w:t>
+      </w:r>
+      <w:r>
+        <w:t xml:space="preserve"> </w:t>
+      </w:r>
+      <w:r>
+        <w:t xml:space="preserve">the</w:t>
+      </w:r>
+      <w:r>
+        <w:t xml:space="preserve"> </w:t>
+      </w:r>
+      <w:r>
+        <w:t xml:space="preserve">chi-square decomposition of a contingency table that a statistician means by</w:t>
+      </w:r>
+      <w:r>
+        <w:t xml:space="preserve"> </w:t>
+      </w:r>
+      <w:r>
+        <w:t xml:space="preserve">CA. For true correspondence analysis of categorical/frequency data, dummy-code</w:t>
+      </w:r>
+      <w:r>
+        <w:t xml:space="preserve"> </w:t>
+      </w:r>
+      <w:r>
+        <w:t xml:space="preserve">it here, or use</w:t>
+      </w:r>
+      <w:r>
+        <w:t xml:space="preserve"> </w:t>
+      </w:r>
+      <w:r>
+        <w:rPr>
+          <w:rStyle w:val="VerbatimChar"/>
+        </w:rPr>
+        <w:t xml:space="preserve">MASS::corresp</w:t>
+      </w:r>
+      <w:r>
+        <w:t xml:space="preserve"> </w:t>
+      </w:r>
+      <w:r>
+        <w:t xml:space="preserve">/ the</w:t>
+      </w:r>
+      <w:r>
+        <w:t xml:space="preserve"> </w:t>
+      </w:r>
+      <w:r>
+        <w:rPr>
+          <w:rStyle w:val="VerbatimChar"/>
+        </w:rPr>
+        <w:t xml:space="preserve">ca</w:t>
+      </w:r>
+      <w:r>
+        <w:t xml:space="preserve"> </w:t>
+      </w:r>
+      <w:r>
+        <w:t xml:space="preserve">package. Stated plainly so no</w:t>
+      </w:r>
+      <w:r>
+        <w:t xml:space="preserve"> </w:t>
+      </w:r>
+      <w:r>
+        <w:t xml:space="preserve">reviewer is surprised.</w:t>
+      </w:r>
+    </w:p>
+    <w:p>
+      <w:pPr>
+        <w:pStyle w:val="FirstParagraph"/>
+      </w:pPr>
+      <w:r>
+        <w:rPr>
+          <w:bCs/>
+          <w:b/>
+        </w:rPr>
+        <w:t xml:space="preserve">What the factor model assumes</w:t>
+      </w:r>
+      <w:r>
+        <w:t xml:space="preserve"> </w:t>
+      </w:r>
+      <w:r>
+        <w:t xml:space="preserve">(and how this dataset measures up):</w:t>
+      </w:r>
+    </w:p>
+    <w:p>
+      <w:pPr>
+        <w:numPr>
+          <w:ilvl w:val="0"/>
+          <w:numId w:val="1003"/>
+        </w:numPr>
+        <w:pStyle w:val="Compact"/>
+      </w:pPr>
+      <w:r>
+        <w:rPr>
+          <w:bCs/>
+          <w:b/>
+        </w:rPr>
+        <w:t xml:space="preserve">Numeric, roughly interval-scaled variables</w:t>
+      </w:r>
+      <w:r>
+        <w:t xml:space="preserve"> </w:t>
+      </w:r>
+      <w:r>
+        <w:t xml:space="preserve">— met (or met via the encoding</w:t>
+      </w:r>
+      <w:r>
+        <w:t xml:space="preserve"> </w:t>
+      </w:r>
+      <w:r>
+        <w:t xml:space="preserve">above).</w:t>
+      </w:r>
+    </w:p>
+    <w:p>
+      <w:pPr>
+        <w:numPr>
+          <w:ilvl w:val="0"/>
+          <w:numId w:val="1003"/>
+        </w:numPr>
+        <w:pStyle w:val="Compact"/>
+      </w:pPr>
+      <w:r>
+        <w:rPr>
+          <w:bCs/>
+          <w:b/>
+        </w:rPr>
+        <w:t xml:space="preserve">Linear associations.</w:t>
+      </w:r>
+      <w:r>
+        <w:t xml:space="preserve"> </w:t>
+      </w:r>
+      <w:r>
+        <w:t xml:space="preserve">Factor analysis captures</w:t>
       </w:r>
       <w:r>
         <w:t xml:space="preserve"> </w:t>
@@ -3451,19 +3363,97 @@
           <w:iCs/>
           <w:i/>
         </w:rPr>
-        <w:t xml:space="preserve">availability</w:t>
-      </w:r>
-      <w:r>
-        <w:t xml:space="preserve"> </w:t>
-      </w:r>
-      <w:r>
-        <w:t xml:space="preserve">is essentially uncorrelated with (if anything, weakly opposed</w:t>
-      </w:r>
-      <w:r>
-        <w:t xml:space="preserve"> </w:t>
-      </w:r>
-      <w:r>
-        <w:t xml:space="preserve">to)</w:t>
+        <w:t xml:space="preserve">linear</w:t>
+      </w:r>
+      <w:r>
+        <w:t xml:space="preserve"> </w:t>
+      </w:r>
+      <w:r>
+        <w:t xml:space="preserve">correlation;</w:t>
+      </w:r>
+      <w:r>
+        <w:t xml:space="preserve"> </w:t>
+      </w:r>
+      <w:r>
+        <w:t xml:space="preserve">threshold or strongly nonlinear structure is missed. Skewed variables should</w:t>
+      </w:r>
+      <w:r>
+        <w:t xml:space="preserve"> </w:t>
+      </w:r>
+      <w:r>
+        <w:t xml:space="preserve">be transformed (§13) — the water data are heavily right-skewed (§22).</w:t>
+      </w:r>
+    </w:p>
+    <w:p>
+      <w:pPr>
+        <w:numPr>
+          <w:ilvl w:val="0"/>
+          <w:numId w:val="1003"/>
+        </w:numPr>
+        <w:pStyle w:val="Compact"/>
+      </w:pPr>
+      <w:r>
+        <w:rPr>
+          <w:bCs/>
+          <w:b/>
+        </w:rPr>
+        <w:t xml:space="preserve">Enough samples for the variables.</w:t>
+      </w:r>
+      <w:r>
+        <w:t xml:space="preserve"> </w:t>
+      </w:r>
+      <w:r>
+        <w:t xml:space="preserve">Rule of thumb: ≥ 5–10 observations per</w:t>
+      </w:r>
+      <w:r>
+        <w:t xml:space="preserve"> </w:t>
+      </w:r>
+      <w:r>
+        <w:t xml:space="preserve">variable. Here</w:t>
+      </w:r>
+      <w:r>
+        <w:t xml:space="preserve"> </w:t>
+      </w:r>
+      <w:r>
+        <w:rPr>
+          <w:bCs/>
+          <w:b/>
+        </w:rPr>
+        <w:t xml:space="preserve">50 countries for 6 variables</w:t>
+      </w:r>
+      <w:r>
+        <w:t xml:space="preserve"> </w:t>
+      </w:r>
+      <w:r>
+        <w:t xml:space="preserve">— comfortable.</w:t>
+      </w:r>
+    </w:p>
+    <w:p>
+      <w:pPr>
+        <w:numPr>
+          <w:ilvl w:val="0"/>
+          <w:numId w:val="1003"/>
+        </w:numPr>
+        <w:pStyle w:val="Compact"/>
+      </w:pPr>
+      <w:r>
+        <w:rPr>
+          <w:bCs/>
+          <w:b/>
+        </w:rPr>
+        <w:t xml:space="preserve">No perfect multicollinearity.</w:t>
+      </w:r>
+      <w:r>
+        <w:t xml:space="preserve"> </w:t>
+      </w:r>
+      <w:r>
+        <w:t xml:space="preserve">Near-duplicate variables make the matrix</w:t>
+      </w:r>
+      <w:r>
+        <w:t xml:space="preserve"> </w:t>
+      </w:r>
+      <w:r>
+        <w:t xml:space="preserve">singular. This dataset</w:t>
       </w:r>
       <w:r>
         <w:t xml:space="preserve"> </w:t>
@@ -3473,6 +3463,732 @@
           <w:iCs/>
           <w:i/>
         </w:rPr>
+        <w:t xml:space="preserve">violates</w:t>
+      </w:r>
+      <w:r>
+        <w:t xml:space="preserve"> </w:t>
+      </w:r>
+      <w:r>
+        <w:t xml:space="preserve">it —</w:t>
+      </w:r>
+      <w:r>
+        <w:t xml:space="preserve"> </w:t>
+      </w:r>
+      <w:r>
+        <w:rPr>
+          <w:rStyle w:val="VerbatimChar"/>
+        </w:rPr>
+        <w:t xml:space="preserve">Agricultur</w:t>
+      </w:r>
+      <w:r>
+        <w:t xml:space="preserve"> </w:t>
+      </w:r>
+      <w:r>
+        <w:t xml:space="preserve">and</w:t>
+      </w:r>
+      <w:r>
+        <w:t xml:space="preserve"> </w:t>
+      </w:r>
+      <w:r>
+        <w:rPr>
+          <w:rStyle w:val="VerbatimChar"/>
+        </w:rPr>
+        <w:t xml:space="preserve">perCapitaW</w:t>
+      </w:r>
+      <w:r>
+        <w:t xml:space="preserve"> </w:t>
+      </w:r>
+      <w:r>
+        <w:t xml:space="preserve">correlate</w:t>
+      </w:r>
+      <w:r>
+        <w:t xml:space="preserve"> </w:t>
+      </w:r>
+      <w:r>
+        <w:t xml:space="preserve">0.99, which collapses the sixth eigenvalue to ~0 and disables the Mahalanobis</w:t>
+      </w:r>
+      <w:r>
+        <w:t xml:space="preserve"> </w:t>
+      </w:r>
+      <w:r>
+        <w:t xml:space="preserve">outlier panel (§22, §29). Drop or combine such pairs.</w:t>
+      </w:r>
+    </w:p>
+    <w:p>
+      <w:pPr>
+        <w:numPr>
+          <w:ilvl w:val="0"/>
+          <w:numId w:val="1003"/>
+        </w:numPr>
+        <w:pStyle w:val="Compact"/>
+      </w:pPr>
+      <w:r>
+        <w:rPr>
+          <w:bCs/>
+          <w:b/>
+        </w:rPr>
+        <w:t xml:space="preserve">Real correlations exist.</w:t>
+      </w:r>
+      <w:r>
+        <w:t xml:space="preserve"> </w:t>
+      </w:r>
+      <w:r>
+        <w:t xml:space="preserve">If variables are near-independent, the factors</w:t>
+      </w:r>
+      <w:r>
+        <w:t xml:space="preserve"> </w:t>
+      </w:r>
+      <w:r>
+        <w:t xml:space="preserve">summarise little. (KMO and Bartlett tests that quantify this are a planned</w:t>
+      </w:r>
+      <w:r>
+        <w:t xml:space="preserve"> </w:t>
+      </w:r>
+      <w:r>
+        <w:t xml:space="preserve">addition, not in 1.5.)</w:t>
+      </w:r>
+    </w:p>
+    <w:p>
+      <w:pPr>
+        <w:numPr>
+          <w:ilvl w:val="0"/>
+          <w:numId w:val="1003"/>
+        </w:numPr>
+        <w:pStyle w:val="Compact"/>
+      </w:pPr>
+      <w:r>
+        <w:rPr>
+          <w:bCs/>
+          <w:b/>
+        </w:rPr>
+        <w:t xml:space="preserve">Outliers distort correlations.</w:t>
+      </w:r>
+      <w:r>
+        <w:t xml:space="preserve"> </w:t>
+      </w:r>
+      <w:r>
+        <w:t xml:space="preserve">Screen with</w:t>
+      </w:r>
+      <w:r>
+        <w:t xml:space="preserve"> </w:t>
+      </w:r>
+      <w:r>
+        <w:rPr>
+          <w:rStyle w:val="VerbatimChar"/>
+        </w:rPr>
+        <w:t xml:space="preserve">type="diagnose"</w:t>
+      </w:r>
+      <w:r>
+        <w:t xml:space="preserve"> </w:t>
+      </w:r>
+      <w:r>
+        <w:t xml:space="preserve">(§22).</w:t>
+      </w:r>
+    </w:p>
+    <w:bookmarkEnd w:id="27"/>
+    <w:bookmarkStart w:id="28" w:name="pca-the-shared-foundation"/>
+    <w:p>
+      <w:pPr>
+        <w:pStyle w:val="Heading2"/>
+      </w:pPr>
+      <w:r>
+        <w:t xml:space="preserve">6. PCA — the shared foundation</w:t>
+      </w:r>
+    </w:p>
+    <w:p>
+      <w:pPr>
+        <w:pStyle w:val="FirstParagraph"/>
+      </w:pPr>
+      <w:r>
+        <w:t xml:space="preserve">Every analysis here starts from the eigen-decomposition of the (scaled) data.</w:t>
+      </w:r>
+      <w:r>
+        <w:t xml:space="preserve"> </w:t>
+      </w:r>
+      <w:r>
+        <w:t xml:space="preserve">The eigenvalues tell you how many axes matter; their square roots are the</w:t>
+      </w:r>
+      <w:r>
+        <w:t xml:space="preserve"> </w:t>
+      </w:r>
+      <w:r>
+        <w:t xml:space="preserve">familiar PCA standard deviations.</w:t>
+      </w:r>
+    </w:p>
+    <w:p>
+      <w:pPr>
+        <w:pStyle w:val="SourceCode"/>
+      </w:pPr>
+      <w:r>
+        <w:rPr>
+          <w:rStyle w:val="NormalTok"/>
+        </w:rPr>
+        <w:t xml:space="preserve">mod</w:t>
+      </w:r>
+      <w:r>
+        <w:rPr>
+          <w:rStyle w:val="SpecialCharTok"/>
+        </w:rPr>
+        <w:t xml:space="preserve">$</w:t>
+      </w:r>
+      <w:r>
+        <w:rPr>
+          <w:rStyle w:val="NormalTok"/>
+        </w:rPr>
+        <w:t xml:space="preserve">eigen.value</w:t>
+      </w:r>
+      <w:r>
+        <w:br/>
+      </w:r>
+      <w:r>
+        <w:rPr>
+          <w:rStyle w:val="CommentTok"/>
+        </w:rPr>
+        <w:t xml:space="preserve">#&gt; [1] 3.360e+00 1.079e+00 9.059e-01 5.212e-01 1.339e-01 9.076e-07</w:t>
+      </w:r>
+      <w:r>
+        <w:br/>
+      </w:r>
+      <w:r>
+        <w:rPr>
+          <w:rStyle w:val="FunctionTok"/>
+        </w:rPr>
+        <w:t xml:space="preserve">sqrt</w:t>
+      </w:r>
+      <w:r>
+        <w:rPr>
+          <w:rStyle w:val="NormalTok"/>
+        </w:rPr>
+        <w:t xml:space="preserve">(mod</w:t>
+      </w:r>
+      <w:r>
+        <w:rPr>
+          <w:rStyle w:val="SpecialCharTok"/>
+        </w:rPr>
+        <w:t xml:space="preserve">$</w:t>
+      </w:r>
+      <w:r>
+        <w:rPr>
+          <w:rStyle w:val="NormalTok"/>
+        </w:rPr>
+        <w:t xml:space="preserve">eigen.value)                 </w:t>
+      </w:r>
+      <w:r>
+        <w:rPr>
+          <w:rStyle w:val="CommentTok"/>
+        </w:rPr>
+        <w:t xml:space="preserve"># PCA standard deviations</w:t>
+      </w:r>
+      <w:r>
+        <w:br/>
+      </w:r>
+      <w:r>
+        <w:rPr>
+          <w:rStyle w:val="CommentTok"/>
+        </w:rPr>
+        <w:t xml:space="preserve">#&gt; [1] 1.8331 1.0386 0.9518 0.7219 0.3659 0.0010</w:t>
+      </w:r>
+      <w:r>
+        <w:br/>
+      </w:r>
+      <w:r>
+        <w:rPr>
+          <w:rStyle w:val="NormalTok"/>
+        </w:rPr>
+        <w:t xml:space="preserve">mod</w:t>
+      </w:r>
+      <w:r>
+        <w:rPr>
+          <w:rStyle w:val="SpecialCharTok"/>
+        </w:rPr>
+        <w:t xml:space="preserve">$</w:t>
+      </w:r>
+      <w:r>
+        <w:rPr>
+          <w:rStyle w:val="NormalTok"/>
+        </w:rPr>
+        <w:t xml:space="preserve">variance                          </w:t>
+      </w:r>
+      <w:r>
+        <w:rPr>
+          <w:rStyle w:val="CommentTok"/>
+        </w:rPr>
+        <w:t xml:space="preserve"># % variance per axis</w:t>
+      </w:r>
+      <w:r>
+        <w:br/>
+      </w:r>
+      <w:r>
+        <w:rPr>
+          <w:rStyle w:val="CommentTok"/>
+        </w:rPr>
+        <w:t xml:space="preserve">#&gt; [1] 56.007 17.977 15.098  8.686  2.231  0.000</w:t>
+      </w:r>
+      <w:r>
+        <w:br/>
+      </w:r>
+      <w:r>
+        <w:rPr>
+          <w:rStyle w:val="NormalTok"/>
+        </w:rPr>
+        <w:t xml:space="preserve">mod</w:t>
+      </w:r>
+      <w:r>
+        <w:rPr>
+          <w:rStyle w:val="SpecialCharTok"/>
+        </w:rPr>
+        <w:t xml:space="preserve">$</w:t>
+      </w:r>
+      <w:r>
+        <w:rPr>
+          <w:rStyle w:val="NormalTok"/>
+        </w:rPr>
+        <w:t xml:space="preserve">cumvariance                       </w:t>
+      </w:r>
+      <w:r>
+        <w:rPr>
+          <w:rStyle w:val="CommentTok"/>
+        </w:rPr>
+        <w:t xml:space="preserve"># cumulative %</w:t>
+      </w:r>
+      <w:r>
+        <w:br/>
+      </w:r>
+      <w:r>
+        <w:rPr>
+          <w:rStyle w:val="CommentTok"/>
+        </w:rPr>
+        <w:t xml:space="preserve">#&gt; [1]  56.01  73.98  89.08  97.77 100.00 100.00</w:t>
+      </w:r>
+    </w:p>
+    <w:p>
+      <w:pPr>
+        <w:pStyle w:val="FirstParagraph"/>
+      </w:pPr>
+      <w:r>
+        <w:t xml:space="preserve">Reading this:</w:t>
+      </w:r>
+      <w:r>
+        <w:t xml:space="preserve"> </w:t>
+      </w:r>
+      <w:r>
+        <w:rPr>
+          <w:bCs/>
+          <w:b/>
+        </w:rPr>
+        <w:t xml:space="preserve">Factor 1 alone explains 56% of the variation, and the first two</w:t>
+      </w:r>
+      <w:r>
+        <w:rPr>
+          <w:bCs/>
+          <w:b/>
+        </w:rPr>
+        <w:t xml:space="preserve"> </w:t>
+      </w:r>
+      <w:r>
+        <w:rPr>
+          <w:bCs/>
+          <w:b/>
+        </w:rPr>
+        <w:t xml:space="preserve">axes 74%.</w:t>
+      </w:r>
+      <w:r>
+        <w:t xml:space="preserve"> </w:t>
+      </w:r>
+      <w:r>
+        <w:t xml:space="preserve">By the Kaiser rule (eigenvalue &gt; 1) you retain</w:t>
+      </w:r>
+      <w:r>
+        <w:t xml:space="preserve"> </w:t>
+      </w:r>
+      <w:r>
+        <w:rPr>
+          <w:bCs/>
+          <w:b/>
+        </w:rPr>
+        <w:t xml:space="preserve">two</w:t>
+      </w:r>
+      <w:r>
+        <w:t xml:space="preserve"> </w:t>
+      </w:r>
+      <w:r>
+        <w:t xml:space="preserve">factors</w:t>
+      </w:r>
+      <w:r>
+        <w:t xml:space="preserve"> </w:t>
+      </w:r>
+      <w:r>
+        <w:t xml:space="preserve">(3.36 and 1.08; the third is 0.91, just under 1). The sixth eigenvalue is</w:t>
+      </w:r>
+      <w:r>
+        <w:t xml:space="preserve"> </w:t>
+      </w:r>
+      <w:r>
+        <w:t xml:space="preserve">essentially zero — a signal that two variables are nearly redundant (Section</w:t>
+      </w:r>
+      <w:r>
+        <w:t xml:space="preserve"> </w:t>
+      </w:r>
+      <w:r>
+        <w:t xml:space="preserve">29).</w:t>
+      </w:r>
+    </w:p>
+    <w:p>
+      <w:pPr>
+        <w:pStyle w:val="BodyText"/>
+      </w:pPr>
+      <w:r>
+        <w:rPr>
+          <w:bCs/>
+          <w:b/>
+        </w:rPr>
+        <w:t xml:space="preserve">Where those axes come from — the correlations.</w:t>
+      </w:r>
+      <w:r>
+        <w:t xml:space="preserve"> </w:t>
+      </w:r>
+      <w:r>
+        <w:t xml:space="preserve">The decomposition is driven</w:t>
+      </w:r>
+      <w:r>
+        <w:t xml:space="preserve"> </w:t>
+      </w:r>
+      <w:r>
+        <w:t xml:space="preserve">by the correlation matrix (</w:t>
+      </w:r>
+      <w:r>
+        <w:rPr>
+          <w:rStyle w:val="VerbatimChar"/>
+        </w:rPr>
+        <w:t xml:space="preserve">round(mod$correlation, 2)</w:t>
+      </w:r>
+      <w:r>
+        <w:t xml:space="preserve">):</w:t>
+      </w:r>
+    </w:p>
+    <w:p>
+      <w:pPr>
+        <w:pStyle w:val="SourceCode"/>
+      </w:pPr>
+      <w:r>
+        <w:rPr>
+          <w:rStyle w:val="VerbatimChar"/>
+        </w:rPr>
+        <w:t xml:space="preserve">           Domestic Industry Agricultur Resources withdrawal perCapitaW</w:t>
+      </w:r>
+      <w:r>
+        <w:br/>
+      </w:r>
+      <w:r>
+        <w:rPr>
+          <w:rStyle w:val="VerbatimChar"/>
+        </w:rPr>
+        <w:t xml:space="preserve">Domestic      1.00     0.75       0.33     -0.19       0.29       0.44</w:t>
+      </w:r>
+      <w:r>
+        <w:br/>
+      </w:r>
+      <w:r>
+        <w:rPr>
+          <w:rStyle w:val="VerbatimChar"/>
+        </w:rPr>
+        <w:t xml:space="preserve">Industry      0.75     1.00       0.47     -0.15       0.65       0.55</w:t>
+      </w:r>
+      <w:r>
+        <w:br/>
+      </w:r>
+      <w:r>
+        <w:rPr>
+          <w:rStyle w:val="VerbatimChar"/>
+        </w:rPr>
+        <w:t xml:space="preserve">Agricultur    0.33     0.47       1.00     -0.12       0.63       0.99</w:t>
+      </w:r>
+      <w:r>
+        <w:br/>
+      </w:r>
+      <w:r>
+        <w:rPr>
+          <w:rStyle w:val="VerbatimChar"/>
+        </w:rPr>
+        <w:t xml:space="preserve">Resources    -0.19    -0.15      -0.12      1.00      -0.04      -0.14</w:t>
+      </w:r>
+      <w:r>
+        <w:br/>
+      </w:r>
+      <w:r>
+        <w:rPr>
+          <w:rStyle w:val="VerbatimChar"/>
+        </w:rPr>
+        <w:t xml:space="preserve">withdrawal    0.29     0.65       0.63     -0.04       1.00       0.65</w:t>
+      </w:r>
+      <w:r>
+        <w:br/>
+      </w:r>
+      <w:r>
+        <w:rPr>
+          <w:rStyle w:val="VerbatimChar"/>
+        </w:rPr>
+        <w:t xml:space="preserve">perCapitaW    0.44     0.55       0.99     -0.14       0.65       1.00</w:t>
+      </w:r>
+    </w:p>
+    <w:p>
+      <w:pPr>
+        <w:pStyle w:val="FirstParagraph"/>
+      </w:pPr>
+      <w:r>
+        <w:t xml:space="preserve">Three facts jump out, and together they</w:t>
+      </w:r>
+      <w:r>
+        <w:t xml:space="preserve"> </w:t>
+      </w:r>
+      <w:r>
+        <w:rPr>
+          <w:iCs/>
+          <w:i/>
+        </w:rPr>
+        <w:t xml:space="preserve">are</w:t>
+      </w:r>
+      <w:r>
+        <w:t xml:space="preserve"> </w:t>
+      </w:r>
+      <w:r>
+        <w:t xml:space="preserve">the paradox:</w:t>
+      </w:r>
+      <w:r>
+        <w:t xml:space="preserve"> </w:t>
+      </w:r>
+      <w:r>
+        <w:t xml:space="preserve">1.</w:t>
+      </w:r>
+      <w:r>
+        <w:t xml:space="preserve"> </w:t>
+      </w:r>
+      <w:r>
+        <w:rPr>
+          <w:rStyle w:val="VerbatimChar"/>
+          <w:bCs/>
+          <w:b/>
+        </w:rPr>
+        <w:t xml:space="preserve">Agricultur</w:t>
+      </w:r>
+      <w:r>
+        <w:rPr>
+          <w:bCs/>
+          <w:b/>
+        </w:rPr>
+        <w:t xml:space="preserve"> </w:t>
+      </w:r>
+      <w:r>
+        <w:rPr>
+          <w:bCs/>
+          <w:b/>
+        </w:rPr>
+        <w:t xml:space="preserve">and</w:t>
+      </w:r>
+      <w:r>
+        <w:rPr>
+          <w:bCs/>
+          <w:b/>
+        </w:rPr>
+        <w:t xml:space="preserve"> </w:t>
+      </w:r>
+      <w:r>
+        <w:rPr>
+          <w:rStyle w:val="VerbatimChar"/>
+          <w:bCs/>
+          <w:b/>
+        </w:rPr>
+        <w:t xml:space="preserve">perCapitaW</w:t>
+      </w:r>
+      <w:r>
+        <w:rPr>
+          <w:bCs/>
+          <w:b/>
+        </w:rPr>
+        <w:t xml:space="preserve"> </w:t>
+      </w:r>
+      <w:r>
+        <w:rPr>
+          <w:bCs/>
+          <w:b/>
+        </w:rPr>
+        <w:t xml:space="preserve">correlate 0.99</w:t>
+      </w:r>
+      <w:r>
+        <w:t xml:space="preserve"> </w:t>
+      </w:r>
+      <w:r>
+        <w:t xml:space="preserve">— in Africa, per-capita</w:t>
+      </w:r>
+      <w:r>
+        <w:t xml:space="preserve"> </w:t>
+      </w:r>
+      <w:r>
+        <w:t xml:space="preserve">water use is agricultural water use; irrigation dominates the total. (This</w:t>
+      </w:r>
+      <w:r>
+        <w:t xml:space="preserve"> </w:t>
+      </w:r>
+      <w:r>
+        <w:t xml:space="preserve">near-duplication is why the 6th eigenvalue collapses to zero; Section 29.)</w:t>
+      </w:r>
+      <w:r>
+        <w:t xml:space="preserve"> </w:t>
+      </w:r>
+      <w:r>
+        <w:t xml:space="preserve">2.</w:t>
+      </w:r>
+      <w:r>
+        <w:t xml:space="preserve"> </w:t>
+      </w:r>
+      <w:r>
+        <w:rPr>
+          <w:rStyle w:val="VerbatimChar"/>
+          <w:bCs/>
+          <w:b/>
+        </w:rPr>
+        <w:t xml:space="preserve">Domestic</w:t>
+      </w:r>
+      <w:r>
+        <w:rPr>
+          <w:bCs/>
+          <w:b/>
+        </w:rPr>
+        <w:t xml:space="preserve"> </w:t>
+      </w:r>
+      <w:r>
+        <w:rPr>
+          <w:bCs/>
+          <w:b/>
+        </w:rPr>
+        <w:t xml:space="preserve">and</w:t>
+      </w:r>
+      <w:r>
+        <w:rPr>
+          <w:bCs/>
+          <w:b/>
+        </w:rPr>
+        <w:t xml:space="preserve"> </w:t>
+      </w:r>
+      <w:r>
+        <w:rPr>
+          <w:rStyle w:val="VerbatimChar"/>
+          <w:bCs/>
+          <w:b/>
+        </w:rPr>
+        <w:t xml:space="preserve">Industry</w:t>
+      </w:r>
+      <w:r>
+        <w:rPr>
+          <w:bCs/>
+          <w:b/>
+        </w:rPr>
+        <w:t xml:space="preserve"> </w:t>
+      </w:r>
+      <w:r>
+        <w:rPr>
+          <w:bCs/>
+          <w:b/>
+        </w:rPr>
+        <w:t xml:space="preserve">correlate 0.75</w:t>
+      </w:r>
+      <w:r>
+        <w:t xml:space="preserve"> </w:t>
+      </w:r>
+      <w:r>
+        <w:t xml:space="preserve">— the two</w:t>
+      </w:r>
+      <w:r>
+        <w:t xml:space="preserve"> </w:t>
+      </w:r>
+      <w:r>
+        <w:t xml:space="preserve">“</w:t>
+      </w:r>
+      <w:r>
+        <w:t xml:space="preserve">modern-economy</w:t>
+      </w:r>
+      <w:r>
+        <w:t xml:space="preserve">”</w:t>
+      </w:r>
+      <w:r>
+        <w:t xml:space="preserve"> </w:t>
+      </w:r>
+      <w:r>
+        <w:t xml:space="preserve">uses</w:t>
+      </w:r>
+      <w:r>
+        <w:t xml:space="preserve"> </w:t>
+      </w:r>
+      <w:r>
+        <w:t xml:space="preserve">rise together with development and urbanisation.</w:t>
+      </w:r>
+      <w:r>
+        <w:t xml:space="preserve"> </w:t>
+      </w:r>
+      <w:r>
+        <w:t xml:space="preserve">3.</w:t>
+      </w:r>
+      <w:r>
+        <w:t xml:space="preserve"> </w:t>
+      </w:r>
+      <w:r>
+        <w:rPr>
+          <w:rStyle w:val="VerbatimChar"/>
+          <w:bCs/>
+          <w:b/>
+        </w:rPr>
+        <w:t xml:space="preserve">Resources</w:t>
+      </w:r>
+      <w:r>
+        <w:rPr>
+          <w:bCs/>
+          <w:b/>
+        </w:rPr>
+        <w:t xml:space="preserve"> </w:t>
+      </w:r>
+      <w:r>
+        <w:rPr>
+          <w:bCs/>
+          <w:b/>
+        </w:rPr>
+        <w:t xml:space="preserve">correlates with everything at −0.04 to −0.19</w:t>
+      </w:r>
+      <w:r>
+        <w:t xml:space="preserve"> </w:t>
+      </w:r>
+      <w:r>
+        <w:t xml:space="preserve">— renewable</w:t>
+      </w:r>
+      <w:r>
+        <w:t xml:space="preserve"> </w:t>
+      </w:r>
+      <w:r>
+        <w:rPr>
+          <w:iCs/>
+          <w:i/>
+        </w:rPr>
+        <w:t xml:space="preserve">availability</w:t>
+      </w:r>
+      <w:r>
+        <w:t xml:space="preserve"> </w:t>
+      </w:r>
+      <w:r>
+        <w:t xml:space="preserve">is essentially uncorrelated with (if anything, weakly opposed</w:t>
+      </w:r>
+      <w:r>
+        <w:t xml:space="preserve"> </w:t>
+      </w:r>
+      <w:r>
+        <w:t xml:space="preserve">to)</w:t>
+      </w:r>
+      <w:r>
+        <w:t xml:space="preserve"> </w:t>
+      </w:r>
+      <w:r>
+        <w:rPr>
+          <w:iCs/>
+          <w:i/>
+        </w:rPr>
         <w:t xml:space="preserve">use</w:t>
       </w:r>
       <w:r>
@@ -3766,8 +4482,8 @@
         <w:t xml:space="preserve">).</w:t>
       </w:r>
     </w:p>
-    <w:bookmarkEnd w:id="27"/>
-    <w:bookmarkStart w:id="31" w:name="r-mode-structure-among-variables"/>
+    <w:bookmarkEnd w:id="28"/>
+    <w:bookmarkStart w:id="32" w:name="r-mode-structure-among-variables"/>
     <w:p>
       <w:pPr>
         <w:pStyle w:val="Heading2"/>
@@ -4084,18 +4800,18 @@
           <wp:inline>
             <wp:extent cx="5334000" cy="3556000"/>
             <wp:effectExtent b="0" l="0" r="0" t="0"/>
-            <wp:docPr descr="R-mode loadings" title="" id="29" name="Picture"/>
+            <wp:docPr descr="R-mode loadings" title="" id="30" name="Picture"/>
             <a:graphic>
               <a:graphicData uri="http://schemas.openxmlformats.org/drawingml/2006/picture">
                 <pic:pic>
                   <pic:nvPicPr>
-                    <pic:cNvPr descr="figures/fig_rmode.png" id="30" name="Picture"/>
+                    <pic:cNvPr descr="figures/fig_rmode.png" id="31" name="Picture"/>
                     <pic:cNvPicPr>
                       <a:picLocks noChangeArrowheads="1" noChangeAspect="1"/>
                     </pic:cNvPicPr>
                   </pic:nvPicPr>
                   <pic:blipFill>
-                    <a:blip r:embed="rId28"/>
+                    <a:blip r:embed="rId29"/>
                     <a:stretch>
                       <a:fillRect/>
                     </a:stretch>
@@ -4130,8 +4846,8 @@
         <w:t xml:space="preserve">R-mode loadings</w:t>
       </w:r>
     </w:p>
-    <w:bookmarkEnd w:id="31"/>
-    <w:bookmarkStart w:id="35" w:name="q-mode-structure-among-samples"/>
+    <w:bookmarkEnd w:id="32"/>
+    <w:bookmarkStart w:id="36" w:name="q-mode-structure-among-samples"/>
     <w:p>
       <w:pPr>
         <w:pStyle w:val="Heading2"/>
@@ -4389,18 +5105,18 @@
           <wp:inline>
             <wp:extent cx="5334000" cy="3556000"/>
             <wp:effectExtent b="0" l="0" r="0" t="0"/>
-            <wp:docPr descr="Q-mode loadings" title="" id="33" name="Picture"/>
+            <wp:docPr descr="Q-mode loadings" title="" id="34" name="Picture"/>
             <a:graphic>
               <a:graphicData uri="http://schemas.openxmlformats.org/drawingml/2006/picture">
                 <pic:pic>
                   <pic:nvPicPr>
-                    <pic:cNvPr descr="figures/fig_qmode.png" id="34" name="Picture"/>
+                    <pic:cNvPr descr="figures/fig_qmode.png" id="35" name="Picture"/>
                     <pic:cNvPicPr>
                       <a:picLocks noChangeArrowheads="1" noChangeAspect="1"/>
                     </pic:cNvPicPr>
                   </pic:nvPicPr>
                   <pic:blipFill>
-                    <a:blip r:embed="rId32"/>
+                    <a:blip r:embed="rId33"/>
                     <a:stretch>
                       <a:fillRect/>
                     </a:stretch>
@@ -4435,8 +5151,8 @@
         <w:t xml:space="preserve">Q-mode loadings</w:t>
       </w:r>
     </w:p>
-    <w:bookmarkEnd w:id="35"/>
-    <w:bookmarkStart w:id="42" w:name="simultaneous-q-r-the-biplot"/>
+    <w:bookmarkEnd w:id="36"/>
+    <w:bookmarkStart w:id="43" w:name="simultaneous-q-r-the-biplot"/>
     <w:p>
       <w:pPr>
         <w:pStyle w:val="Heading2"/>
@@ -4548,18 +5264,18 @@
           <wp:inline>
             <wp:extent cx="5334000" cy="3556000"/>
             <wp:effectExtent b="0" l="0" r="0" t="0"/>
-            <wp:docPr descr="Simultaneous Q/R biplot" title="" id="37" name="Picture"/>
+            <wp:docPr descr="Simultaneous Q/R biplot" title="" id="38" name="Picture"/>
             <a:graphic>
               <a:graphicData uri="http://schemas.openxmlformats.org/drawingml/2006/picture">
                 <pic:pic>
                   <pic:nvPicPr>
-                    <pic:cNvPr descr="figures/fig_simultaneous.png" id="38" name="Picture"/>
+                    <pic:cNvPr descr="figures/fig_simultaneous.png" id="39" name="Picture"/>
                     <pic:cNvPicPr>
                       <a:picLocks noChangeArrowheads="1" noChangeAspect="1"/>
                     </pic:cNvPicPr>
                   </pic:nvPicPr>
                   <pic:blipFill>
-                    <a:blip r:embed="rId36"/>
+                    <a:blip r:embed="rId37"/>
                     <a:stretch>
                       <a:fillRect/>
                     </a:stretch>
@@ -4628,7 +5344,7 @@
       <w:pPr>
         <w:numPr>
           <w:ilvl w:val="0"/>
-          <w:numId w:val="1002"/>
+          <w:numId w:val="1004"/>
         </w:numPr>
         <w:pStyle w:val="Compact"/>
       </w:pPr>
@@ -4790,7 +5506,7 @@
       <w:pPr>
         <w:numPr>
           <w:ilvl w:val="0"/>
-          <w:numId w:val="1002"/>
+          <w:numId w:val="1004"/>
         </w:numPr>
         <w:pStyle w:val="Compact"/>
       </w:pPr>
@@ -4872,7 +5588,7 @@
       <w:pPr>
         <w:numPr>
           <w:ilvl w:val="0"/>
-          <w:numId w:val="1002"/>
+          <w:numId w:val="1004"/>
         </w:numPr>
         <w:pStyle w:val="Compact"/>
       </w:pPr>
@@ -4966,7 +5682,7 @@
       <w:pPr>
         <w:numPr>
           <w:ilvl w:val="0"/>
-          <w:numId w:val="1002"/>
+          <w:numId w:val="1004"/>
         </w:numPr>
         <w:pStyle w:val="Compact"/>
       </w:pPr>
@@ -5183,18 +5899,18 @@
           <wp:inline>
             <wp:extent cx="5334000" cy="3556000"/>
             <wp:effectExtent b="0" l="0" r="0" t="0"/>
-            <wp:docPr descr="Labelled by country" title="" id="40" name="Picture"/>
+            <wp:docPr descr="Labelled by country" title="" id="41" name="Picture"/>
             <a:graphic>
               <a:graphicData uri="http://schemas.openxmlformats.org/drawingml/2006/picture">
                 <pic:pic>
                   <pic:nvPicPr>
-                    <pic:cNvPr descr="figures/fig_labelled.png" id="41" name="Picture"/>
+                    <pic:cNvPr descr="figures/fig_labelled.png" id="42" name="Picture"/>
                     <pic:cNvPicPr>
                       <a:picLocks noChangeArrowheads="1" noChangeAspect="1"/>
                     </pic:cNvPicPr>
                   </pic:nvPicPr>
                   <pic:blipFill>
-                    <a:blip r:embed="rId39"/>
+                    <a:blip r:embed="rId40"/>
                     <a:stretch>
                       <a:fillRect/>
                     </a:stretch>
@@ -5229,8 +5945,8 @@
         <w:t xml:space="preserve">Labelled by country</w:t>
       </w:r>
     </w:p>
-    <w:bookmarkEnd w:id="42"/>
-    <w:bookmarkStart w:id="46" w:name="scores"/>
+    <w:bookmarkEnd w:id="43"/>
+    <w:bookmarkStart w:id="47" w:name="scores"/>
     <w:p>
       <w:pPr>
         <w:pStyle w:val="Heading2"/>
@@ -5525,18 +6241,18 @@
           <wp:inline>
             <wp:extent cx="5334000" cy="3556000"/>
             <wp:effectExtent b="0" l="0" r="0" t="0"/>
-            <wp:docPr descr="Scores, R and Q side by side" title="" id="44" name="Picture"/>
+            <wp:docPr descr="Scores, R and Q side by side" title="" id="45" name="Picture"/>
             <a:graphic>
               <a:graphicData uri="http://schemas.openxmlformats.org/drawingml/2006/picture">
                 <pic:pic>
                   <pic:nvPicPr>
-                    <pic:cNvPr descr="figures/fig_scores_qr.png" id="45" name="Picture"/>
+                    <pic:cNvPr descr="figures/fig_scores_qr.png" id="46" name="Picture"/>
                     <pic:cNvPicPr>
                       <a:picLocks noChangeArrowheads="1" noChangeAspect="1"/>
                     </pic:cNvPicPr>
                   </pic:nvPicPr>
                   <pic:blipFill>
-                    <a:blip r:embed="rId43"/>
+                    <a:blip r:embed="rId44"/>
                     <a:stretch>
                       <a:fillRect/>
                     </a:stretch>
@@ -5571,8 +6287,8 @@
         <w:t xml:space="preserve">Scores, R and Q side by side</w:t>
       </w:r>
     </w:p>
-    <w:bookmarkEnd w:id="46"/>
-    <w:bookmarkStart w:id="47" w:name="print-and-summary"/>
+    <w:bookmarkEnd w:id="47"/>
+    <w:bookmarkStart w:id="48" w:name="print-and-summary"/>
     <w:p>
       <w:pPr>
         <w:pStyle w:val="Heading2"/>
@@ -5776,8 +6492,8 @@
         <w:t xml:space="preserve">...</w:t>
       </w:r>
     </w:p>
-    <w:bookmarkEnd w:id="47"/>
-    <w:bookmarkStart w:id="48" w:name="scaling-the-single-most-important-choice"/>
+    <w:bookmarkEnd w:id="48"/>
+    <w:bookmarkStart w:id="49" w:name="scaling-the-single-most-important-choice"/>
     <w:p>
       <w:pPr>
         <w:pStyle w:val="Heading2"/>
@@ -6459,8 +7175,8 @@
         <w:t xml:space="preserve">— and always report which you used.</w:t>
       </w:r>
     </w:p>
-    <w:bookmarkEnd w:id="48"/>
-    <w:bookmarkStart w:id="52" w:name="transforming-skewed-variables"/>
+    <w:bookmarkEnd w:id="49"/>
+    <w:bookmarkStart w:id="53" w:name="transforming-skewed-variables"/>
     <w:p>
       <w:pPr>
         <w:pStyle w:val="Heading2"/>
@@ -6805,18 +7521,18 @@
           <wp:inline>
             <wp:extent cx="5334000" cy="3556000"/>
             <wp:effectExtent b="0" l="0" r="0" t="0"/>
-            <wp:docPr descr="Transformed model" title="" id="50" name="Picture"/>
+            <wp:docPr descr="Transformed model" title="" id="51" name="Picture"/>
             <a:graphic>
               <a:graphicData uri="http://schemas.openxmlformats.org/drawingml/2006/picture">
                 <pic:pic>
                   <pic:nvPicPr>
-                    <pic:cNvPr descr="figures/fig_transformed.png" id="51" name="Picture"/>
+                    <pic:cNvPr descr="figures/fig_transformed.png" id="52" name="Picture"/>
                     <pic:cNvPicPr>
                       <a:picLocks noChangeArrowheads="1" noChangeAspect="1"/>
                     </pic:cNvPicPr>
                   </pic:nvPicPr>
                   <pic:blipFill>
-                    <a:blip r:embed="rId49"/>
+                    <a:blip r:embed="rId50"/>
                     <a:stretch>
                       <a:fillRect/>
                     </a:stretch>
@@ -6851,8 +7567,8 @@
         <w:t xml:space="preserve">Transformed model</w:t>
       </w:r>
     </w:p>
-    <w:bookmarkEnd w:id="52"/>
-    <w:bookmarkStart w:id="56" w:name="principal-coordinate-analysis-pcoa"/>
+    <w:bookmarkEnd w:id="53"/>
+    <w:bookmarkStart w:id="57" w:name="principal-coordinate-analysis-pcoa"/>
     <w:p>
       <w:pPr>
         <w:pStyle w:val="Heading2"/>
@@ -7066,18 +7782,18 @@
           <wp:inline>
             <wp:extent cx="5334000" cy="3556000"/>
             <wp:effectExtent b="0" l="0" r="0" t="0"/>
-            <wp:docPr descr="Principal coordinate analysis" title="" id="54" name="Picture"/>
+            <wp:docPr descr="Principal coordinate analysis" title="" id="55" name="Picture"/>
             <a:graphic>
               <a:graphicData uri="http://schemas.openxmlformats.org/drawingml/2006/picture">
                 <pic:pic>
                   <pic:nvPicPr>
-                    <pic:cNvPr descr="figures/fig_pcoa.png" id="55" name="Picture"/>
+                    <pic:cNvPr descr="figures/fig_pcoa.png" id="56" name="Picture"/>
                     <pic:cNvPicPr>
                       <a:picLocks noChangeArrowheads="1" noChangeAspect="1"/>
                     </pic:cNvPicPr>
                   </pic:nvPicPr>
                   <pic:blipFill>
-                    <a:blip r:embed="rId53"/>
+                    <a:blip r:embed="rId54"/>
                     <a:stretch>
                       <a:fillRect/>
                     </a:stretch>
@@ -7112,8 +7828,8 @@
         <w:t xml:space="preserve">Principal coordinate analysis</w:t>
       </w:r>
     </w:p>
-    <w:bookmarkEnd w:id="56"/>
-    <w:bookmarkStart w:id="60" w:name="multidimensional-scaling-mds"/>
+    <w:bookmarkEnd w:id="57"/>
+    <w:bookmarkStart w:id="61" w:name="multidimensional-scaling-mds"/>
     <w:p>
       <w:pPr>
         <w:pStyle w:val="Heading2"/>
@@ -7327,18 +8043,18 @@
           <wp:inline>
             <wp:extent cx="5334000" cy="3556000"/>
             <wp:effectExtent b="0" l="0" r="0" t="0"/>
-            <wp:docPr descr="MDS" title="" id="58" name="Picture"/>
+            <wp:docPr descr="MDS" title="" id="59" name="Picture"/>
             <a:graphic>
               <a:graphicData uri="http://schemas.openxmlformats.org/drawingml/2006/picture">
                 <pic:pic>
                   <pic:nvPicPr>
-                    <pic:cNvPr descr="figures/fig_mds.png" id="59" name="Picture"/>
+                    <pic:cNvPr descr="figures/fig_mds.png" id="60" name="Picture"/>
                     <pic:cNvPicPr>
                       <a:picLocks noChangeArrowheads="1" noChangeAspect="1"/>
                     </pic:cNvPicPr>
                   </pic:nvPicPr>
                   <pic:blipFill>
-                    <a:blip r:embed="rId57"/>
+                    <a:blip r:embed="rId58"/>
                     <a:stretch>
                       <a:fillRect/>
                     </a:stretch>
@@ -7394,9 +8110,9 @@
         </w:pict>
       </w:r>
     </w:p>
-    <w:bookmarkEnd w:id="60"/>
     <w:bookmarkEnd w:id="61"/>
-    <w:bookmarkStart w:id="84" w:name="part-2-spatial-mode"/>
+    <w:bookmarkEnd w:id="62"/>
+    <w:bookmarkStart w:id="86" w:name="part-2-spatial-mode"/>
     <w:p>
       <w:pPr>
         <w:pStyle w:val="Heading1"/>
@@ -7405,7 +8121,7 @@
         <w:t xml:space="preserve">PART 2 — Spatial mode</w:t>
       </w:r>
     </w:p>
-    <w:bookmarkStart w:id="62" w:name="from-table-to-map"/>
+    <w:bookmarkStart w:id="63" w:name="from-table-to-map"/>
     <w:p>
       <w:pPr>
         <w:pStyle w:val="Heading2"/>
@@ -7468,8 +8184,8 @@
         <w:t xml:space="preserve">cluster back onto the map’s attribute table — ready to draw.</w:t>
       </w:r>
     </w:p>
-    <w:bookmarkEnd w:id="62"/>
-    <w:bookmarkStart w:id="63" w:name="reading-a-shapefile"/>
+    <w:bookmarkEnd w:id="63"/>
+    <w:bookmarkStart w:id="64" w:name="reading-a-shapefile"/>
     <w:p>
       <w:pPr>
         <w:pStyle w:val="Heading2"/>
@@ -7793,8 +8509,8 @@
         <w:t xml:space="preserve">for plotting — you do not have to manage that.</w:t>
       </w:r>
     </w:p>
-    <w:bookmarkEnd w:id="63"/>
-    <w:bookmarkStart w:id="64" w:name="X30b32d0f0bcc7c713af0298cceab9d165c2a9ed"/>
+    <w:bookmarkEnd w:id="64"/>
+    <w:bookmarkStart w:id="65" w:name="X30b32d0f0bcc7c713af0298cceab9d165c2a9ed"/>
     <w:p>
       <w:pPr>
         <w:pStyle w:val="Heading2"/>
@@ -8493,8 +9209,8 @@
         <w:t xml:space="preserve">.</w:t>
       </w:r>
     </w:p>
-    <w:bookmarkEnd w:id="64"/>
-    <w:bookmarkStart w:id="71" w:name="plotmap-the-choropleths"/>
+    <w:bookmarkEnd w:id="65"/>
+    <w:bookmarkStart w:id="72" w:name="plotmap-the-choropleths"/>
     <w:p>
       <w:pPr>
         <w:pStyle w:val="Heading2"/>
@@ -8600,18 +9316,18 @@
           <wp:inline>
             <wp:extent cx="5334000" cy="3556000"/>
             <wp:effectExtent b="0" l="0" r="0" t="0"/>
-            <wp:docPr descr="All variables" title="" id="66" name="Picture"/>
+            <wp:docPr descr="All variables" title="" id="67" name="Picture"/>
             <a:graphic>
               <a:graphicData uri="http://schemas.openxmlformats.org/drawingml/2006/picture">
                 <pic:pic>
                   <pic:nvPicPr>
-                    <pic:cNvPr descr="figures/fig_map_02.png" id="67" name="Picture"/>
+                    <pic:cNvPr descr="figures/fig_map_02.png" id="68" name="Picture"/>
                     <pic:cNvPicPr>
                       <a:picLocks noChangeArrowheads="1" noChangeAspect="1"/>
                     </pic:cNvPicPr>
                   </pic:nvPicPr>
                   <pic:blipFill>
-                    <a:blip r:embed="rId65"/>
+                    <a:blip r:embed="rId66"/>
                     <a:stretch>
                       <a:fillRect/>
                     </a:stretch>
@@ -8655,18 +9371,18 @@
           <wp:inline>
             <wp:extent cx="5334000" cy="3556000"/>
             <wp:effectExtent b="0" l="0" r="0" t="0"/>
-            <wp:docPr descr="Single-variable choropleth with labels" title="" id="69" name="Picture"/>
+            <wp:docPr descr="Single-variable choropleth with labels" title="" id="70" name="Picture"/>
             <a:graphic>
               <a:graphicData uri="http://schemas.openxmlformats.org/drawingml/2006/picture">
                 <pic:pic>
                   <pic:nvPicPr>
-                    <pic:cNvPr descr="figures/fig_map_08.png" id="70" name="Picture"/>
+                    <pic:cNvPr descr="figures/fig_map_08.png" id="71" name="Picture"/>
                     <pic:cNvPicPr>
                       <a:picLocks noChangeArrowheads="1" noChangeAspect="1"/>
                     </pic:cNvPicPr>
                   </pic:nvPicPr>
                   <pic:blipFill>
-                    <a:blip r:embed="rId68"/>
+                    <a:blip r:embed="rId69"/>
                     <a:stretch>
                       <a:fillRect/>
                     </a:stretch>
@@ -8701,8 +9417,8 @@
         <w:t xml:space="preserve">Single-variable choropleth with labels</w:t>
       </w:r>
     </w:p>
-    <w:bookmarkEnd w:id="71"/>
-    <w:bookmarkStart w:id="75" w:name="clustering-plotcluster-and-compare"/>
+    <w:bookmarkEnd w:id="72"/>
+    <w:bookmarkStart w:id="76" w:name="clustering-plotcluster-and-compare"/>
     <w:p>
       <w:pPr>
         <w:pStyle w:val="Heading2"/>
@@ -8865,18 +9581,18 @@
           <wp:inline>
             <wp:extent cx="5334000" cy="3556000"/>
             <wp:effectExtent b="0" l="0" r="0" t="0"/>
-            <wp:docPr descr="Cluster plot" title="" id="73" name="Picture"/>
+            <wp:docPr descr="Cluster plot" title="" id="74" name="Picture"/>
             <a:graphic>
               <a:graphicData uri="http://schemas.openxmlformats.org/drawingml/2006/picture">
                 <pic:pic>
                   <pic:nvPicPr>
-                    <pic:cNvPr descr="figures/fig_cluster_01.png" id="74" name="Picture"/>
+                    <pic:cNvPr descr="figures/fig_cluster_01.png" id="75" name="Picture"/>
                     <pic:cNvPicPr>
                       <a:picLocks noChangeArrowheads="1" noChangeAspect="1"/>
                     </pic:cNvPicPr>
                   </pic:nvPicPr>
                   <pic:blipFill>
-                    <a:blip r:embed="rId72"/>
+                    <a:blip r:embed="rId73"/>
                     <a:stretch>
                       <a:fillRect/>
                     </a:stretch>
@@ -8911,8 +9627,8 @@
         <w:t xml:space="preserve">Cluster plot</w:t>
       </w:r>
     </w:p>
-    <w:bookmarkEnd w:id="75"/>
-    <w:bookmarkStart w:id="76" w:name="X8f0dcda217518d79e1815faf49e7a8c3811960d"/>
+    <w:bookmarkEnd w:id="76"/>
+    <w:bookmarkStart w:id="77" w:name="X8f0dcda217518d79e1815faf49e7a8c3811960d"/>
     <w:p>
       <w:pPr>
         <w:pStyle w:val="Heading2"/>
@@ -9579,8 +10295,8 @@
         <w:t xml:space="preserve">policymaker can name and map.</w:t>
       </w:r>
     </w:p>
-    <w:bookmarkEnd w:id="76"/>
-    <w:bookmarkStart w:id="80" w:name="distributional-diagnostics-typediagnose"/>
+    <w:bookmarkEnd w:id="77"/>
+    <w:bookmarkStart w:id="81" w:name="distributional-diagnostics-typediagnose"/>
     <w:p>
       <w:pPr>
         <w:pStyle w:val="Heading2"/>
@@ -9689,18 +10405,18 @@
           <wp:inline>
             <wp:extent cx="5334000" cy="3556000"/>
             <wp:effectExtent b="0" l="0" r="0" t="0"/>
-            <wp:docPr descr="Diagnostic histograms" title="" id="78" name="Picture"/>
+            <wp:docPr descr="Diagnostic histograms" title="" id="79" name="Picture"/>
             <a:graphic>
               <a:graphicData uri="http://schemas.openxmlformats.org/drawingml/2006/picture">
                 <pic:pic>
                   <pic:nvPicPr>
-                    <pic:cNvPr descr="figures/fig_diagnose_02.png" id="79" name="Picture"/>
+                    <pic:cNvPr descr="figures/fig_diagnose_02.png" id="80" name="Picture"/>
                     <pic:cNvPicPr>
                       <a:picLocks noChangeArrowheads="1" noChangeAspect="1"/>
                     </pic:cNvPicPr>
                   </pic:nvPicPr>
                   <pic:blipFill>
-                    <a:blip r:embed="rId77"/>
+                    <a:blip r:embed="rId78"/>
                     <a:stretch>
                       <a:fillRect/>
                     </a:stretch>
@@ -9898,8 +10614,8 @@
         <w:t xml:space="preserve">.</w:t>
       </w:r>
     </w:p>
-    <w:bookmarkEnd w:id="80"/>
-    <w:bookmarkStart w:id="81" w:name="joining-a-csv-to-a-shapefile"/>
+    <w:bookmarkEnd w:id="81"/>
+    <w:bookmarkStart w:id="82" w:name="joining-a-csv-to-a-shapefile"/>
     <w:p>
       <w:pPr>
         <w:pStyle w:val="Heading2"/>
@@ -10115,8 +10831,8 @@
         <w:t xml:space="preserve">if the data had been in the shapefile all along.</w:t>
       </w:r>
     </w:p>
-    <w:bookmarkEnd w:id="81"/>
-    <w:bookmarkStart w:id="82" w:name="using-an-in-memory-spatial-object"/>
+    <w:bookmarkEnd w:id="82"/>
+    <w:bookmarkStart w:id="83" w:name="using-an-in-memory-spatial-object"/>
     <w:p>
       <w:pPr>
         <w:pStyle w:val="Heading2"/>
@@ -10300,8 +11016,8 @@
         <w:t xml:space="preserve">#&gt; [1] "qrfactor"</w:t>
       </w:r>
     </w:p>
-    <w:bookmarkEnd w:id="82"/>
-    <w:bookmarkStart w:id="83" w:name="b.-the-african-water-paradox-in-numbers"/>
+    <w:bookmarkEnd w:id="83"/>
+    <w:bookmarkStart w:id="84" w:name="b.-the-african-water-paradox-in-numbers"/>
     <w:p>
       <w:pPr>
         <w:pStyle w:val="Heading2"/>
@@ -10948,6 +11664,521 @@
         <w:t xml:space="preserve">locates the pattern; it does not explain it.</w:t>
       </w:r>
     </w:p>
+    <w:bookmarkEnd w:id="84"/>
+    <w:bookmarkStart w:id="85" w:name="c.-what-makes-qrfactor-robust"/>
+    <w:p>
+      <w:pPr>
+        <w:pStyle w:val="Heading2"/>
+      </w:pPr>
+      <w:r>
+        <w:t xml:space="preserve">24c. What makes qrfactor robust</w:t>
+      </w:r>
+    </w:p>
+    <w:p>
+      <w:pPr>
+        <w:pStyle w:val="FirstParagraph"/>
+      </w:pPr>
+      <w:r>
+        <w:t xml:space="preserve">The package is designed so an applied user rarely gets</w:t>
+      </w:r>
+      <w:r>
+        <w:t xml:space="preserve"> </w:t>
+      </w:r>
+      <w:r>
+        <w:rPr>
+          <w:iCs/>
+          <w:i/>
+        </w:rPr>
+        <w:t xml:space="preserve">stuck</w:t>
+      </w:r>
+      <w:r>
+        <w:t xml:space="preserve">:</w:t>
+      </w:r>
+    </w:p>
+    <w:p>
+      <w:pPr>
+        <w:numPr>
+          <w:ilvl w:val="0"/>
+          <w:numId w:val="1005"/>
+        </w:numPr>
+        <w:pStyle w:val="Compact"/>
+      </w:pPr>
+      <w:r>
+        <w:rPr>
+          <w:bCs/>
+          <w:b/>
+        </w:rPr>
+        <w:t xml:space="preserve">Pure-R core.</w:t>
+      </w:r>
+      <w:r>
+        <w:t xml:space="preserve"> </w:t>
+      </w:r>
+      <w:r>
+        <w:t xml:space="preserve">The whole analysis — correlation/covariance, eigen-solve,</w:t>
+      </w:r>
+      <w:r>
+        <w:t xml:space="preserve"> </w:t>
+      </w:r>
+      <w:r>
+        <w:t xml:space="preserve">loadings, scores, indices — is base R. No compiled code, no build tools, and</w:t>
+      </w:r>
+      <w:r>
+        <w:t xml:space="preserve"> </w:t>
+      </w:r>
+      <w:r>
+        <w:t xml:space="preserve">it installs and runs anywhere R does.</w:t>
+      </w:r>
+    </w:p>
+    <w:p>
+      <w:pPr>
+        <w:numPr>
+          <w:ilvl w:val="0"/>
+          <w:numId w:val="1005"/>
+        </w:numPr>
+        <w:pStyle w:val="Compact"/>
+      </w:pPr>
+      <w:r>
+        <w:rPr>
+          <w:bCs/>
+          <w:b/>
+        </w:rPr>
+        <w:t xml:space="preserve">Graceful degradation.</w:t>
+      </w:r>
+      <w:r>
+        <w:t xml:space="preserve"> </w:t>
+      </w:r>
+      <w:r>
+        <w:t xml:space="preserve">When a diagnostic can’t run — for example the</w:t>
+      </w:r>
+      <w:r>
+        <w:t xml:space="preserve"> </w:t>
+      </w:r>
+      <w:r>
+        <w:t xml:space="preserve">Mahalanobis/</w:t>
+      </w:r>
+      <w:r>
+        <w:rPr>
+          <w:rStyle w:val="VerbatimChar"/>
+        </w:rPr>
+        <w:t xml:space="preserve">mvoutlier</w:t>
+      </w:r>
+      <w:r>
+        <w:t xml:space="preserve"> </w:t>
+      </w:r>
+      <w:r>
+        <w:t xml:space="preserve">outlier panel on collinear data, where the covariance</w:t>
+      </w:r>
+      <w:r>
+        <w:t xml:space="preserve"> </w:t>
+      </w:r>
+      <w:r>
+        <w:t xml:space="preserve">matrix is singular — the plot method now</w:t>
+      </w:r>
+      <w:r>
+        <w:t xml:space="preserve"> </w:t>
+      </w:r>
+      <w:r>
+        <w:rPr>
+          <w:bCs/>
+          <w:b/>
+        </w:rPr>
+        <w:t xml:space="preserve">skips that one panel with a clear</w:t>
+      </w:r>
+      <w:r>
+        <w:rPr>
+          <w:bCs/>
+          <w:b/>
+        </w:rPr>
+        <w:t xml:space="preserve"> </w:t>
+      </w:r>
+      <w:r>
+        <w:rPr>
+          <w:bCs/>
+          <w:b/>
+        </w:rPr>
+        <w:t xml:space="preserve">warning and continues</w:t>
+      </w:r>
+      <w:r>
+        <w:t xml:space="preserve">, instead of aborting the whole figure (§22). You get</w:t>
+      </w:r>
+      <w:r>
+        <w:t xml:space="preserve"> </w:t>
+      </w:r>
+      <w:r>
+        <w:t xml:space="preserve">the histograms and the message, not a stack trace.</w:t>
+      </w:r>
+    </w:p>
+    <w:p>
+      <w:pPr>
+        <w:numPr>
+          <w:ilvl w:val="0"/>
+          <w:numId w:val="1005"/>
+        </w:numPr>
+        <w:pStyle w:val="Compact"/>
+      </w:pPr>
+      <w:r>
+        <w:rPr>
+          <w:bCs/>
+          <w:b/>
+        </w:rPr>
+        <w:t xml:space="preserve">Dependency resilience.</w:t>
+      </w:r>
+      <w:r>
+        <w:t xml:space="preserve"> </w:t>
+      </w:r>
+      <w:r>
+        <w:t xml:space="preserve">The spatial stack it originally relied on</w:t>
+      </w:r>
+      <w:r>
+        <w:t xml:space="preserve"> </w:t>
+      </w:r>
+      <w:r>
+        <w:t xml:space="preserve">(</w:t>
+      </w:r>
+      <w:r>
+        <w:rPr>
+          <w:rStyle w:val="VerbatimChar"/>
+        </w:rPr>
+        <w:t xml:space="preserve">rgdal</w:t>
+      </w:r>
+      <w:r>
+        <w:t xml:space="preserve">,</w:t>
+      </w:r>
+      <w:r>
+        <w:t xml:space="preserve"> </w:t>
+      </w:r>
+      <w:r>
+        <w:rPr>
+          <w:rStyle w:val="VerbatimChar"/>
+        </w:rPr>
+        <w:t xml:space="preserve">maptools</w:t>
+      </w:r>
+      <w:r>
+        <w:t xml:space="preserve">,</w:t>
+      </w:r>
+      <w:r>
+        <w:t xml:space="preserve"> </w:t>
+      </w:r>
+      <w:r>
+        <w:rPr>
+          <w:rStyle w:val="VerbatimChar"/>
+        </w:rPr>
+        <w:t xml:space="preserve">mgraph</w:t>
+      </w:r>
+      <w:r>
+        <w:t xml:space="preserve">) was retired from CRAN.</w:t>
+      </w:r>
+      <w:r>
+        <w:t xml:space="preserve"> </w:t>
+      </w:r>
+      <w:r>
+        <w:rPr>
+          <w:rStyle w:val="VerbatimChar"/>
+        </w:rPr>
+        <w:t xml:space="preserve">qrfactor</w:t>
+      </w:r>
+      <w:r>
+        <w:t xml:space="preserve"> </w:t>
+      </w:r>
+      <w:r>
+        <w:t xml:space="preserve">1.5 replaces</w:t>
+      </w:r>
+      <w:r>
+        <w:t xml:space="preserve"> </w:t>
+      </w:r>
+      <w:r>
+        <w:t xml:space="preserve">them with a thin</w:t>
+      </w:r>
+      <w:r>
+        <w:t xml:space="preserve"> </w:t>
+      </w:r>
+      <w:r>
+        <w:rPr>
+          <w:rStyle w:val="VerbatimChar"/>
+        </w:rPr>
+        <w:t xml:space="preserve">sf</w:t>
+      </w:r>
+      <w:r>
+        <w:t xml:space="preserve">/</w:t>
+      </w:r>
+      <w:r>
+        <w:rPr>
+          <w:rStyle w:val="VerbatimChar"/>
+        </w:rPr>
+        <w:t xml:space="preserve">sp</w:t>
+      </w:r>
+      <w:r>
+        <w:t xml:space="preserve"> </w:t>
+      </w:r>
+      <w:r>
+        <w:t xml:space="preserve">compatibility layer: shapefiles are read with</w:t>
+      </w:r>
+      <w:r>
+        <w:t xml:space="preserve"> </w:t>
+      </w:r>
+      <w:r>
+        <w:rPr>
+          <w:rStyle w:val="VerbatimChar"/>
+        </w:rPr>
+        <w:t xml:space="preserve">sf</w:t>
+      </w:r>
+      <w:r>
+        <w:t xml:space="preserve">,</w:t>
+      </w:r>
+      <w:r>
+        <w:t xml:space="preserve"> </w:t>
+      </w:r>
+      <w:r>
+        <w:t xml:space="preserve">drawn with</w:t>
+      </w:r>
+      <w:r>
+        <w:t xml:space="preserve"> </w:t>
+      </w:r>
+      <w:r>
+        <w:rPr>
+          <w:rStyle w:val="VerbatimChar"/>
+        </w:rPr>
+        <w:t xml:space="preserve">sp</w:t>
+      </w:r>
+      <w:r>
+        <w:t xml:space="preserve">, and the conversion is automatic — so the package survives the</w:t>
+      </w:r>
+      <w:r>
+        <w:t xml:space="preserve"> </w:t>
+      </w:r>
+      <w:r>
+        <w:t xml:space="preserve">modern R geospatial ecosystem rather than dying with its old dependencies.</w:t>
+      </w:r>
+    </w:p>
+    <w:p>
+      <w:pPr>
+        <w:numPr>
+          <w:ilvl w:val="0"/>
+          <w:numId w:val="1005"/>
+        </w:numPr>
+        <w:pStyle w:val="Compact"/>
+      </w:pPr>
+      <w:r>
+        <w:rPr>
+          <w:bCs/>
+          <w:b/>
+        </w:rPr>
+        <w:t xml:space="preserve">Five ways in, one analysis out.</w:t>
+      </w:r>
+      <w:r>
+        <w:t xml:space="preserve"> </w:t>
+      </w:r>
+      <w:r>
+        <w:t xml:space="preserve">Data frame, CSV/text file, ESRI</w:t>
+      </w:r>
+      <w:r>
+        <w:t xml:space="preserve"> </w:t>
+      </w:r>
+      <w:r>
+        <w:t xml:space="preserve">shapefile, an in-memory spatial object, or a live CSV↔shapefile join — the</w:t>
+      </w:r>
+      <w:r>
+        <w:t xml:space="preserve"> </w:t>
+      </w:r>
+      <w:r>
+        <w:rPr>
+          <w:iCs/>
+          <w:i/>
+        </w:rPr>
+        <w:t xml:space="preserve">same</w:t>
+      </w:r>
+      <w:r>
+        <w:t xml:space="preserve"> </w:t>
+      </w:r>
+      <w:r>
+        <w:t xml:space="preserve">method regardless of how your data arrives (§5, §17, §23, §24).</w:t>
+      </w:r>
+    </w:p>
+    <w:p>
+      <w:pPr>
+        <w:numPr>
+          <w:ilvl w:val="0"/>
+          <w:numId w:val="1005"/>
+        </w:numPr>
+        <w:pStyle w:val="Compact"/>
+      </w:pPr>
+      <w:r>
+        <w:rPr>
+          <w:bCs/>
+          <w:b/>
+        </w:rPr>
+        <w:t xml:space="preserve">One object, many views.</w:t>
+      </w:r>
+      <w:r>
+        <w:t xml:space="preserve"> </w:t>
+      </w:r>
+      <w:r>
+        <w:t xml:space="preserve">Every quantity is stored on the returned object</w:t>
+      </w:r>
+      <w:r>
+        <w:t xml:space="preserve"> </w:t>
+      </w:r>
+      <w:r>
+        <w:rPr>
+          <w:iCs/>
+          <w:i/>
+        </w:rPr>
+        <w:t xml:space="preserve">and</w:t>
+      </w:r>
+      <w:r>
+        <w:t xml:space="preserve">, for spatial input, written back onto the map’s attribute table (§18),</w:t>
+      </w:r>
+      <w:r>
+        <w:t xml:space="preserve"> </w:t>
+      </w:r>
+      <w:r>
+        <w:t xml:space="preserve">so downstream plots and maps never recompute the analysis.</w:t>
+      </w:r>
+    </w:p>
+    <w:p>
+      <w:pPr>
+        <w:numPr>
+          <w:ilvl w:val="0"/>
+          <w:numId w:val="1005"/>
+        </w:numPr>
+        <w:pStyle w:val="Compact"/>
+      </w:pPr>
+      <w:r>
+        <w:rPr>
+          <w:bCs/>
+          <w:b/>
+        </w:rPr>
+        <w:t xml:space="preserve">Modern-R hardened.</w:t>
+      </w:r>
+      <w:r>
+        <w:t xml:space="preserve"> </w:t>
+      </w:r>
+      <w:r>
+        <w:t xml:space="preserve">Under R ≥ 4.2 a logical condition of length &gt; 1 is an</w:t>
+      </w:r>
+      <w:r>
+        <w:t xml:space="preserve"> </w:t>
+      </w:r>
+      <w:r>
+        <w:t xml:space="preserve">error, not a silent first-element take. The constructor and the ~1700-line</w:t>
+      </w:r>
+      <w:r>
+        <w:t xml:space="preserve"> </w:t>
+      </w:r>
+      <w:r>
+        <w:t xml:space="preserve">plot method were swept for this, so documented argument forms — a vector of</w:t>
+      </w:r>
+      <w:r>
+        <w:t xml:space="preserve"> </w:t>
+      </w:r>
+      <w:r>
+        <w:t xml:space="preserve">variables in</w:t>
+      </w:r>
+      <w:r>
+        <w:t xml:space="preserve"> </w:t>
+      </w:r>
+      <w:r>
+        <w:rPr>
+          <w:rStyle w:val="VerbatimChar"/>
+        </w:rPr>
+        <w:t xml:space="preserve">t=</w:t>
+      </w:r>
+      <w:r>
+        <w:t xml:space="preserve">, a numeric</w:t>
+      </w:r>
+      <w:r>
+        <w:t xml:space="preserve"> </w:t>
+      </w:r>
+      <w:r>
+        <w:rPr>
+          <w:rStyle w:val="VerbatimChar"/>
+        </w:rPr>
+        <w:t xml:space="preserve">xlim</w:t>
+      </w:r>
+      <w:r>
+        <w:t xml:space="preserve">/</w:t>
+      </w:r>
+      <w:r>
+        <w:rPr>
+          <w:rStyle w:val="VerbatimChar"/>
+        </w:rPr>
+        <w:t xml:space="preserve">ylim</w:t>
+      </w:r>
+      <w:r>
+        <w:t xml:space="preserve">, string axis shortcuts, custom</w:t>
+      </w:r>
+      <w:r>
+        <w:t xml:space="preserve"> </w:t>
+      </w:r>
+      <w:r>
+        <w:rPr>
+          <w:rStyle w:val="VerbatimChar"/>
+        </w:rPr>
+        <w:t xml:space="preserve">abline</w:t>
+      </w:r>
+      <w:r>
+        <w:t xml:space="preserve"> </w:t>
+      </w:r>
+      <w:r>
+        <w:t xml:space="preserve">— all work instead of crashing.</w:t>
+      </w:r>
+    </w:p>
+    <w:p>
+      <w:pPr>
+        <w:pStyle w:val="FirstParagraph"/>
+      </w:pPr>
+      <w:r>
+        <w:t xml:space="preserve">None of this changes the statistics; it changes how often the statistics</w:t>
+      </w:r>
+      <w:r>
+        <w:t xml:space="preserve"> </w:t>
+      </w:r>
+      <w:r>
+        <w:t xml:space="preserve">actually reach you. That is what</w:t>
+      </w:r>
+      <w:r>
+        <w:t xml:space="preserve"> </w:t>
+      </w:r>
+      <w:r>
+        <w:t xml:space="preserve">“</w:t>
+      </w:r>
+      <w:r>
+        <w:t xml:space="preserve">robust</w:t>
+      </w:r>
+      <w:r>
+        <w:t xml:space="preserve">”</w:t>
+      </w:r>
+      <w:r>
+        <w:t xml:space="preserve"> </w:t>
+      </w:r>
+      <w:r>
+        <w:t xml:space="preserve">means here:</w:t>
+      </w:r>
+      <w:r>
+        <w:t xml:space="preserve"> </w:t>
+      </w:r>
+      <w:r>
+        <w:rPr>
+          <w:bCs/>
+          <w:b/>
+        </w:rPr>
+        <w:t xml:space="preserve">the method is classical;</w:t>
+      </w:r>
+      <w:r>
+        <w:rPr>
+          <w:bCs/>
+          <w:b/>
+        </w:rPr>
+        <w:t xml:space="preserve"> </w:t>
+      </w:r>
+      <w:r>
+        <w:rPr>
+          <w:bCs/>
+          <w:b/>
+        </w:rPr>
+        <w:t xml:space="preserve">the packaging is defensive.</w:t>
+      </w:r>
+    </w:p>
     <w:p>
       <w:r>
         <w:pict>
@@ -10955,9 +12186,9 @@
         </w:pict>
       </w:r>
     </w:p>
-    <w:bookmarkEnd w:id="83"/>
-    <w:bookmarkEnd w:id="84"/>
-    <w:bookmarkStart w:id="95" w:name="part-3-reference"/>
+    <w:bookmarkEnd w:id="85"/>
+    <w:bookmarkEnd w:id="86"/>
+    <w:bookmarkStart w:id="97" w:name="part-3-reference"/>
     <w:p>
       <w:pPr>
         <w:pStyle w:val="Heading1"/>
@@ -10966,7 +12197,7 @@
         <w:t xml:space="preserve">PART 3 — Reference</w:t>
       </w:r>
     </w:p>
-    <w:bookmarkStart w:id="85" w:name="qrfactor-argument-reference"/>
+    <w:bookmarkStart w:id="87" w:name="qrfactor-argument-reference"/>
     <w:p>
       <w:pPr>
         <w:pStyle w:val="Heading2"/>
@@ -11649,8 +12880,8 @@
         </w:tc>
       </w:tr>
     </w:tbl>
-    <w:bookmarkEnd w:id="85"/>
-    <w:bookmarkStart w:id="89" w:name="plot.qrfactor-argument-reference"/>
+    <w:bookmarkEnd w:id="87"/>
+    <w:bookmarkStart w:id="91" w:name="plot.qrfactor-argument-reference"/>
     <w:p>
       <w:pPr>
         <w:pStyle w:val="Heading2"/>
@@ -12070,9 +13301,8 @@
       <w:pPr>
         <w:numPr>
           <w:ilvl w:val="0"/>
-          <w:numId w:val="1003"/>
+          <w:numId w:val="1006"/>
         </w:numPr>
-        <w:pStyle w:val="Compact"/>
       </w:pPr>
       <w:r>
         <w:rPr>
@@ -12102,143 +13332,424 @@
         <w:t xml:space="preserve"> </w:t>
       </w:r>
       <w:r>
-        <w:t xml:space="preserve">to draw:</w:t>
-      </w:r>
-      <w:r>
-        <w:t xml:space="preserve"> </w:t>
-      </w:r>
-      <w:r>
-        <w:rPr>
-          <w:rStyle w:val="VerbatimChar"/>
-        </w:rPr>
-        <w:t xml:space="preserve">"loadings"</w:t>
-      </w:r>
-      <w:r>
-        <w:t xml:space="preserve"> </w:t>
-      </w:r>
-      <w:r>
-        <w:t xml:space="preserve">(default),</w:t>
-      </w:r>
-      <w:r>
-        <w:t xml:space="preserve"> </w:t>
-      </w:r>
-      <w:r>
-        <w:rPr>
-          <w:rStyle w:val="VerbatimChar"/>
-        </w:rPr>
-        <w:t xml:space="preserve">"scores"</w:t>
-      </w:r>
-      <w:r>
-        <w:t xml:space="preserve">,</w:t>
-      </w:r>
-      <w:r>
-        <w:t xml:space="preserve"> </w:t>
-      </w:r>
-      <w:r>
-        <w:rPr>
-          <w:rStyle w:val="VerbatimChar"/>
-        </w:rPr>
-        <w:t xml:space="preserve">"pca"</w:t>
-      </w:r>
-      <w:r>
-        <w:t xml:space="preserve"> </w:t>
-      </w:r>
-      <w:r>
-        <w:t xml:space="preserve">(</w:t>
-      </w:r>
-      <w:r>
-        <w:rPr>
-          <w:bCs/>
-          <w:b/>
-        </w:rPr>
-        <w:t xml:space="preserve">lowercase</w:t>
-      </w:r>
-      <w:r>
-        <w:t xml:space="preserve"> </w:t>
-      </w:r>
-      <w:r>
-        <w:t xml:space="preserve">—</w:t>
-      </w:r>
-      <w:r>
-        <w:t xml:space="preserve"> </w:t>
-      </w:r>
-      <w:r>
-        <w:rPr>
-          <w:rStyle w:val="VerbatimChar"/>
-        </w:rPr>
-        <w:t xml:space="preserve">"PCA"</w:t>
-      </w:r>
-      <w:r>
-        <w:t xml:space="preserve"> </w:t>
-      </w:r>
-      <w:r>
-        <w:t xml:space="preserve">falls through to the default biplot),</w:t>
-      </w:r>
-      <w:r>
-        <w:t xml:space="preserve"> </w:t>
-      </w:r>
-      <w:r>
-        <w:rPr>
-          <w:rStyle w:val="VerbatimChar"/>
-        </w:rPr>
-        <w:t xml:space="preserve">"coord"</w:t>
-      </w:r>
-      <w:r>
-        <w:t xml:space="preserve">/</w:t>
-      </w:r>
-      <w:r>
-        <w:rPr>
-          <w:rStyle w:val="VerbatimChar"/>
-        </w:rPr>
-        <w:t xml:space="preserve">"coordinate"</w:t>
-      </w:r>
-      <w:r>
-        <w:t xml:space="preserve">,</w:t>
-      </w:r>
-      <w:r>
-        <w:t xml:space="preserve"> </w:t>
-      </w:r>
-      <w:r>
-        <w:rPr>
-          <w:rStyle w:val="VerbatimChar"/>
-        </w:rPr>
-        <w:t xml:space="preserve">"mds"</w:t>
-      </w:r>
-      <w:r>
-        <w:t xml:space="preserve">,</w:t>
-      </w:r>
-      <w:r>
-        <w:t xml:space="preserve"> </w:t>
-      </w:r>
-      <w:r>
-        <w:rPr>
-          <w:rStyle w:val="VerbatimChar"/>
-        </w:rPr>
-        <w:t xml:space="preserve">"diagnose"</w:t>
-      </w:r>
-      <w:r>
-        <w:t xml:space="preserve">,</w:t>
-      </w:r>
-      <w:r>
-        <w:t xml:space="preserve"> </w:t>
-      </w:r>
-      <w:r>
-        <w:rPr>
-          <w:rStyle w:val="VerbatimChar"/>
-        </w:rPr>
-        <w:t xml:space="preserve">"cluster"</w:t>
-      </w:r>
-      <w:r>
-        <w:t xml:space="preserve">.</w:t>
-      </w:r>
-    </w:p>
+        <w:t xml:space="preserve">to draw. The full set:</w:t>
+      </w:r>
+    </w:p>
+    <w:tbl>
+      <w:tblPr>
+        <w:tblStyle w:val="Table"/>
+        <w:tblW w:type="pct" w:w="5000"/>
+        <w:tblLook w:firstRow="1" w:lastRow="0" w:firstColumn="0" w:lastColumn="0" w:noHBand="0" w:noVBand="0" w:val="0020"/>
+        <w:jc w:val="start"/>
+        <w:tblInd w:w="720" w:type="dxa"/>
+        <w:tblLayout w:type="fixed"/>
+      </w:tblPr>
+      <w:tblGrid>
+        <w:gridCol w:w="3960"/>
+        <w:gridCol w:w="3960"/>
+      </w:tblGrid>
+      <w:tr>
+        <w:trPr>
+          <w:tblHeader w:val="true"/>
+        </w:trPr>
+        <w:tc>
+          <w:tcPr/>
+          <w:p>
+            <w:pPr>
+              <w:pStyle w:val="Compact"/>
+              <w:jc w:val="left"/>
+            </w:pPr>
+            <w:r>
+              <w:rPr>
+                <w:rStyle w:val="VerbatimChar"/>
+              </w:rPr>
+              <w:t xml:space="preserve">type</w:t>
+            </w:r>
+          </w:p>
+        </w:tc>
+        <w:tc>
+          <w:tcPr/>
+          <w:p>
+            <w:pPr>
+              <w:pStyle w:val="Compact"/>
+              <w:jc w:val="left"/>
+            </w:pPr>
+            <w:r>
+              <w:t xml:space="preserve">Draws</w:t>
+            </w:r>
+          </w:p>
+        </w:tc>
+      </w:tr>
+      <w:tr>
+        <w:tc>
+          <w:tcPr/>
+          <w:p>
+            <w:pPr>
+              <w:pStyle w:val="Compact"/>
+              <w:jc w:val="left"/>
+            </w:pPr>
+            <w:r>
+              <w:rPr>
+                <w:rStyle w:val="VerbatimChar"/>
+              </w:rPr>
+              <w:t xml:space="preserve">"loadings"</w:t>
+            </w:r>
+            <w:r>
+              <w:t xml:space="preserve"> </w:t>
+            </w:r>
+            <w:r>
+              <w:t xml:space="preserve">(default)</w:t>
+            </w:r>
+          </w:p>
+        </w:tc>
+        <w:tc>
+          <w:tcPr/>
+          <w:p>
+            <w:pPr>
+              <w:pStyle w:val="Compact"/>
+              <w:jc w:val="left"/>
+            </w:pPr>
+            <w:r>
+              <w:t xml:space="preserve">the Q/R loadings biplot</w:t>
+            </w:r>
+          </w:p>
+        </w:tc>
+      </w:tr>
+      <w:tr>
+        <w:tc>
+          <w:tcPr/>
+          <w:p>
+            <w:pPr>
+              <w:pStyle w:val="Compact"/>
+              <w:jc w:val="left"/>
+            </w:pPr>
+            <w:r>
+              <w:rPr>
+                <w:rStyle w:val="VerbatimChar"/>
+              </w:rPr>
+              <w:t xml:space="preserve">"scores"</w:t>
+            </w:r>
+          </w:p>
+        </w:tc>
+        <w:tc>
+          <w:tcPr/>
+          <w:p>
+            <w:pPr>
+              <w:pStyle w:val="Compact"/>
+              <w:jc w:val="left"/>
+            </w:pPr>
+            <w:r>
+              <w:t xml:space="preserve">factor scores instead of loadings</w:t>
+            </w:r>
+          </w:p>
+        </w:tc>
+      </w:tr>
+      <w:tr>
+        <w:tc>
+          <w:tcPr/>
+          <w:p>
+            <w:pPr>
+              <w:pStyle w:val="Compact"/>
+              <w:jc w:val="left"/>
+            </w:pPr>
+            <w:r>
+              <w:rPr>
+                <w:rStyle w:val="VerbatimChar"/>
+              </w:rPr>
+              <w:t xml:space="preserve">"pca"</w:t>
+            </w:r>
+          </w:p>
+        </w:tc>
+        <w:tc>
+          <w:tcPr/>
+          <w:p>
+            <w:pPr>
+              <w:pStyle w:val="Compact"/>
+              <w:jc w:val="left"/>
+            </w:pPr>
+            <w:r>
+              <w:t xml:space="preserve">PCA (eigenvector) loadings —</w:t>
+            </w:r>
+            <w:r>
+              <w:t xml:space="preserve"> </w:t>
+            </w:r>
+            <w:r>
+              <w:rPr>
+                <w:bCs/>
+                <w:b/>
+              </w:rPr>
+              <w:t xml:space="preserve">lowercase</w:t>
+            </w:r>
+            <w:r>
+              <w:t xml:space="preserve">;</w:t>
+            </w:r>
+            <w:r>
+              <w:t xml:space="preserve"> </w:t>
+            </w:r>
+            <w:r>
+              <w:rPr>
+                <w:rStyle w:val="VerbatimChar"/>
+              </w:rPr>
+              <w:t xml:space="preserve">"PCA"</w:t>
+            </w:r>
+            <w:r>
+              <w:t xml:space="preserve"> </w:t>
+            </w:r>
+            <w:r>
+              <w:t xml:space="preserve">silently falls back to the default biplot</w:t>
+            </w:r>
+          </w:p>
+        </w:tc>
+      </w:tr>
+      <w:tr>
+        <w:tc>
+          <w:tcPr/>
+          <w:p>
+            <w:pPr>
+              <w:pStyle w:val="Compact"/>
+              <w:jc w:val="left"/>
+            </w:pPr>
+            <w:r>
+              <w:rPr>
+                <w:rStyle w:val="VerbatimChar"/>
+              </w:rPr>
+              <w:t xml:space="preserve">"coord"</w:t>
+            </w:r>
+            <w:r>
+              <w:t xml:space="preserve"> </w:t>
+            </w:r>
+            <w:r>
+              <w:t xml:space="preserve">/</w:t>
+            </w:r>
+            <w:r>
+              <w:t xml:space="preserve"> </w:t>
+            </w:r>
+            <w:r>
+              <w:rPr>
+                <w:rStyle w:val="VerbatimChar"/>
+              </w:rPr>
+              <w:t xml:space="preserve">"coordinate"</w:t>
+            </w:r>
+          </w:p>
+        </w:tc>
+        <w:tc>
+          <w:tcPr/>
+          <w:p>
+            <w:pPr>
+              <w:pStyle w:val="Compact"/>
+              <w:jc w:val="left"/>
+            </w:pPr>
+            <w:r>
+              <w:t xml:space="preserve">principal-coordinate view (≡ PCA on Euclidean data)</w:t>
+            </w:r>
+          </w:p>
+        </w:tc>
+      </w:tr>
+      <w:tr>
+        <w:tc>
+          <w:tcPr/>
+          <w:p>
+            <w:pPr>
+              <w:pStyle w:val="Compact"/>
+              <w:jc w:val="left"/>
+            </w:pPr>
+            <w:r>
+              <w:rPr>
+                <w:rStyle w:val="VerbatimChar"/>
+              </w:rPr>
+              <w:t xml:space="preserve">"mds"</w:t>
+            </w:r>
+          </w:p>
+        </w:tc>
+        <w:tc>
+          <w:tcPr/>
+          <w:p>
+            <w:pPr>
+              <w:pStyle w:val="Compact"/>
+              <w:jc w:val="left"/>
+            </w:pPr>
+            <w:r>
+              <w:t xml:space="preserve">multidimensional-scaling view (use with</w:t>
+            </w:r>
+            <w:r>
+              <w:t xml:space="preserve"> </w:t>
+            </w:r>
+            <w:r>
+              <w:rPr>
+                <w:rStyle w:val="VerbatimChar"/>
+              </w:rPr>
+              <w:t xml:space="preserve">scale="n"</w:t>
+            </w:r>
+            <w:r>
+              <w:t xml:space="preserve">)</w:t>
+            </w:r>
+          </w:p>
+        </w:tc>
+      </w:tr>
+      <w:tr>
+        <w:tc>
+          <w:tcPr/>
+          <w:p>
+            <w:pPr>
+              <w:pStyle w:val="Compact"/>
+              <w:jc w:val="left"/>
+            </w:pPr>
+            <w:r>
+              <w:rPr>
+                <w:rStyle w:val="VerbatimChar"/>
+              </w:rPr>
+              <w:t xml:space="preserve">"ca"</w:t>
+            </w:r>
+            <w:r>
+              <w:t xml:space="preserve"> </w:t>
+            </w:r>
+            <w:r>
+              <w:t xml:space="preserve">/</w:t>
+            </w:r>
+            <w:r>
+              <w:t xml:space="preserve"> </w:t>
+            </w:r>
+            <w:r>
+              <w:rPr>
+                <w:rStyle w:val="VerbatimChar"/>
+              </w:rPr>
+              <w:t xml:space="preserve">"correspondence"</w:t>
+            </w:r>
+          </w:p>
+        </w:tc>
+        <w:tc>
+          <w:tcPr/>
+          <w:p>
+            <w:pPr>
+              <w:pStyle w:val="Compact"/>
+              <w:jc w:val="left"/>
+            </w:pPr>
+            <w:r>
+              <w:t xml:space="preserve">eigen-biplot relabelled as</w:t>
+            </w:r>
+            <w:r>
+              <w:t xml:space="preserve"> </w:t>
+            </w:r>
+            <w:r>
+              <w:t xml:space="preserve">“</w:t>
+            </w:r>
+            <w:r>
+              <w:t xml:space="preserve">Correspondence Analysis</w:t>
+            </w:r>
+            <w:r>
+              <w:t xml:space="preserve">”</w:t>
+            </w:r>
+            <w:r>
+              <w:t xml:space="preserve"> </w:t>
+            </w:r>
+            <w:r>
+              <w:t xml:space="preserve">— a</w:t>
+            </w:r>
+            <w:r>
+              <w:t xml:space="preserve"> </w:t>
+            </w:r>
+            <w:r>
+              <w:rPr>
+                <w:iCs/>
+                <w:i/>
+              </w:rPr>
+              <w:t xml:space="preserve">view</w:t>
+            </w:r>
+            <w:r>
+              <w:t xml:space="preserve">, not true chi-square CA (§5b)</w:t>
+            </w:r>
+          </w:p>
+        </w:tc>
+      </w:tr>
+      <w:tr>
+        <w:tc>
+          <w:tcPr/>
+          <w:p>
+            <w:pPr>
+              <w:pStyle w:val="Compact"/>
+              <w:jc w:val="left"/>
+            </w:pPr>
+            <w:r>
+              <w:rPr>
+                <w:rStyle w:val="VerbatimChar"/>
+              </w:rPr>
+              <w:t xml:space="preserve">"diagnose"</w:t>
+            </w:r>
+          </w:p>
+        </w:tc>
+        <w:tc>
+          <w:tcPr/>
+          <w:p>
+            <w:pPr>
+              <w:pStyle w:val="Compact"/>
+              <w:jc w:val="left"/>
+            </w:pPr>
+            <w:r>
+              <w:t xml:space="preserve">histograms + Q–Q + multivariate outliers</w:t>
+            </w:r>
+          </w:p>
+        </w:tc>
+      </w:tr>
+      <w:tr>
+        <w:tc>
+          <w:tcPr/>
+          <w:p>
+            <w:pPr>
+              <w:pStyle w:val="Compact"/>
+              <w:jc w:val="left"/>
+            </w:pPr>
+            <w:r>
+              <w:rPr>
+                <w:rStyle w:val="VerbatimChar"/>
+              </w:rPr>
+              <w:t xml:space="preserve">"cluster"</w:t>
+            </w:r>
+          </w:p>
+        </w:tc>
+        <w:tc>
+          <w:tcPr/>
+          <w:p>
+            <w:pPr>
+              <w:pStyle w:val="Compact"/>
+              <w:jc w:val="left"/>
+            </w:pPr>
+            <w:r>
+              <w:rPr>
+                <w:rStyle w:val="VerbatimChar"/>
+              </w:rPr>
+              <w:t xml:space="preserve">clusplot</w:t>
+            </w:r>
+            <w:r>
+              <w:t xml:space="preserve"> </w:t>
+            </w:r>
+            <w:r>
+              <w:t xml:space="preserve">+</w:t>
+            </w:r>
+            <w:r>
+              <w:t xml:space="preserve"> </w:t>
+            </w:r>
+            <w:r>
+              <w:rPr>
+                <w:rStyle w:val="VerbatimChar"/>
+              </w:rPr>
+              <w:t xml:space="preserve">pvclust</w:t>
+            </w:r>
+            <w:r>
+              <w:t xml:space="preserve"> </w:t>
+            </w:r>
+            <w:r>
+              <w:t xml:space="preserve">cluster diagnostics</w:t>
+            </w:r>
+          </w:p>
+        </w:tc>
+      </w:tr>
+    </w:tbl>
     <w:p>
       <w:pPr>
         <w:numPr>
           <w:ilvl w:val="0"/>
-          <w:numId w:val="1003"/>
+          <w:numId w:val="1006"/>
         </w:numPr>
-        <w:pStyle w:val="Compact"/>
       </w:pPr>
       <w:r>
         <w:rPr>
@@ -12395,9 +13906,8 @@
       <w:pPr>
         <w:numPr>
           <w:ilvl w:val="0"/>
-          <w:numId w:val="1003"/>
+          <w:numId w:val="1006"/>
         </w:numPr>
-        <w:pStyle w:val="Compact"/>
       </w:pPr>
       <w:r>
         <w:rPr>
@@ -12439,9 +13949,8 @@
       <w:pPr>
         <w:numPr>
           <w:ilvl w:val="0"/>
-          <w:numId w:val="1003"/>
+          <w:numId w:val="1006"/>
         </w:numPr>
-        <w:pStyle w:val="Compact"/>
       </w:pPr>
       <w:r>
         <w:rPr>
@@ -12471,9 +13980,8 @@
       <w:pPr>
         <w:numPr>
           <w:ilvl w:val="0"/>
-          <w:numId w:val="1003"/>
+          <w:numId w:val="1006"/>
         </w:numPr>
-        <w:pStyle w:val="Compact"/>
       </w:pPr>
       <w:r>
         <w:rPr>
@@ -12494,9 +14002,8 @@
       <w:pPr>
         <w:numPr>
           <w:ilvl w:val="0"/>
-          <w:numId w:val="1003"/>
+          <w:numId w:val="1006"/>
         </w:numPr>
-        <w:pStyle w:val="Compact"/>
       </w:pPr>
       <w:r>
         <w:rPr>
@@ -12529,9 +14036,8 @@
       <w:pPr>
         <w:numPr>
           <w:ilvl w:val="0"/>
-          <w:numId w:val="1003"/>
+          <w:numId w:val="1006"/>
         </w:numPr>
-        <w:pStyle w:val="Compact"/>
       </w:pPr>
       <w:r>
         <w:rPr>
@@ -12624,9 +14130,8 @@
       <w:pPr>
         <w:numPr>
           <w:ilvl w:val="0"/>
-          <w:numId w:val="1003"/>
+          <w:numId w:val="1006"/>
         </w:numPr>
-        <w:pStyle w:val="Compact"/>
       </w:pPr>
       <w:r>
         <w:rPr>
@@ -13191,18 +14696,18 @@
           <wp:inline>
             <wp:extent cx="5334000" cy="3556000"/>
             <wp:effectExtent b="0" l="0" r="0" t="0"/>
-            <wp:docPr descr="Sized and annotated" title="" id="87" name="Picture"/>
+            <wp:docPr descr="Sized and annotated" title="" id="89" name="Picture"/>
             <a:graphic>
               <a:graphicData uri="http://schemas.openxmlformats.org/drawingml/2006/picture">
                 <pic:pic>
                   <pic:nvPicPr>
-                    <pic:cNvPr descr="figures/fig_cex_values.png" id="88" name="Picture"/>
+                    <pic:cNvPr descr="figures/fig_cex_values.png" id="90" name="Picture"/>
                     <pic:cNvPicPr>
                       <a:picLocks noChangeArrowheads="1" noChangeAspect="1"/>
                     </pic:cNvPicPr>
                   </pic:nvPicPr>
                   <pic:blipFill>
-                    <a:blip r:embed="rId86"/>
+                    <a:blip r:embed="rId88"/>
                     <a:stretch>
                       <a:fillRect/>
                     </a:stretch>
@@ -13237,8 +14742,8 @@
         <w:t xml:space="preserve">Sized and annotated</w:t>
       </w:r>
     </w:p>
-    <w:bookmarkEnd w:id="89"/>
-    <w:bookmarkStart w:id="90" w:name="the-objects-elements"/>
+    <w:bookmarkEnd w:id="91"/>
+    <w:bookmarkStart w:id="92" w:name="the-objects-elements"/>
     <w:p>
       <w:pPr>
         <w:pStyle w:val="Heading2"/>
@@ -14010,8 +15515,8 @@
         </w:tc>
       </w:tr>
     </w:tbl>
-    <w:bookmarkEnd w:id="90"/>
-    <w:bookmarkStart w:id="91" w:name="reproducing-the-figures"/>
+    <w:bookmarkEnd w:id="92"/>
+    <w:bookmarkStart w:id="93" w:name="reproducing-the-figures"/>
     <w:p>
       <w:pPr>
         <w:pStyle w:val="Heading2"/>
@@ -14149,8 +15654,8 @@
         <w:t xml:space="preserve">.</w:t>
       </w:r>
     </w:p>
-    <w:bookmarkEnd w:id="91"/>
-    <w:bookmarkStart w:id="92" w:name="honest-limits-and-caveats"/>
+    <w:bookmarkEnd w:id="93"/>
+    <w:bookmarkStart w:id="94" w:name="honest-limits-and-caveats"/>
     <w:p>
       <w:pPr>
         <w:pStyle w:val="Heading2"/>
@@ -14163,7 +15668,7 @@
       <w:pPr>
         <w:numPr>
           <w:ilvl w:val="0"/>
-          <w:numId w:val="1004"/>
+          <w:numId w:val="1007"/>
         </w:numPr>
         <w:pStyle w:val="Compact"/>
       </w:pPr>
@@ -14191,7 +15696,7 @@
       <w:pPr>
         <w:numPr>
           <w:ilvl w:val="0"/>
-          <w:numId w:val="1004"/>
+          <w:numId w:val="1007"/>
         </w:numPr>
         <w:pStyle w:val="Compact"/>
       </w:pPr>
@@ -14258,7 +15763,7 @@
       <w:pPr>
         <w:numPr>
           <w:ilvl w:val="0"/>
-          <w:numId w:val="1004"/>
+          <w:numId w:val="1007"/>
         </w:numPr>
         <w:pStyle w:val="Compact"/>
       </w:pPr>
@@ -14295,7 +15800,7 @@
       <w:pPr>
         <w:numPr>
           <w:ilvl w:val="0"/>
-          <w:numId w:val="1004"/>
+          <w:numId w:val="1007"/>
         </w:numPr>
         <w:pStyle w:val="Compact"/>
       </w:pPr>
@@ -14338,7 +15843,7 @@
       <w:pPr>
         <w:numPr>
           <w:ilvl w:val="0"/>
-          <w:numId w:val="1004"/>
+          <w:numId w:val="1007"/>
         </w:numPr>
         <w:pStyle w:val="Compact"/>
       </w:pPr>
@@ -14390,7 +15895,7 @@
       <w:pPr>
         <w:numPr>
           <w:ilvl w:val="0"/>
-          <w:numId w:val="1004"/>
+          <w:numId w:val="1007"/>
         </w:numPr>
         <w:pStyle w:val="Compact"/>
       </w:pPr>
@@ -14450,8 +15955,8 @@
         <w:t xml:space="preserve">them.</w:t>
       </w:r>
     </w:p>
-    <w:bookmarkEnd w:id="92"/>
-    <w:bookmarkStart w:id="93" w:name="glossary"/>
+    <w:bookmarkEnd w:id="94"/>
+    <w:bookmarkStart w:id="95" w:name="glossary"/>
     <w:p>
       <w:pPr>
         <w:pStyle w:val="Heading2"/>
@@ -14464,7 +15969,7 @@
       <w:pPr>
         <w:numPr>
           <w:ilvl w:val="0"/>
-          <w:numId w:val="1005"/>
+          <w:numId w:val="1008"/>
         </w:numPr>
         <w:pStyle w:val="Compact"/>
       </w:pPr>
@@ -14486,7 +15991,7 @@
       <w:pPr>
         <w:numPr>
           <w:ilvl w:val="0"/>
-          <w:numId w:val="1005"/>
+          <w:numId w:val="1008"/>
         </w:numPr>
         <w:pStyle w:val="Compact"/>
       </w:pPr>
@@ -14508,7 +16013,7 @@
       <w:pPr>
         <w:numPr>
           <w:ilvl w:val="0"/>
-          <w:numId w:val="1005"/>
+          <w:numId w:val="1008"/>
         </w:numPr>
         <w:pStyle w:val="Compact"/>
       </w:pPr>
@@ -14530,7 +16035,7 @@
       <w:pPr>
         <w:numPr>
           <w:ilvl w:val="0"/>
-          <w:numId w:val="1005"/>
+          <w:numId w:val="1008"/>
         </w:numPr>
         <w:pStyle w:val="Compact"/>
       </w:pPr>
@@ -14552,7 +16057,7 @@
       <w:pPr>
         <w:numPr>
           <w:ilvl w:val="0"/>
-          <w:numId w:val="1005"/>
+          <w:numId w:val="1008"/>
         </w:numPr>
         <w:pStyle w:val="Compact"/>
       </w:pPr>
@@ -14574,7 +16079,7 @@
       <w:pPr>
         <w:numPr>
           <w:ilvl w:val="0"/>
-          <w:numId w:val="1005"/>
+          <w:numId w:val="1008"/>
         </w:numPr>
         <w:pStyle w:val="Compact"/>
       </w:pPr>
@@ -14596,7 +16101,7 @@
       <w:pPr>
         <w:numPr>
           <w:ilvl w:val="0"/>
-          <w:numId w:val="1005"/>
+          <w:numId w:val="1008"/>
         </w:numPr>
         <w:pStyle w:val="Compact"/>
       </w:pPr>
@@ -14618,7 +16123,7 @@
       <w:pPr>
         <w:numPr>
           <w:ilvl w:val="0"/>
-          <w:numId w:val="1005"/>
+          <w:numId w:val="1008"/>
         </w:numPr>
         <w:pStyle w:val="Compact"/>
       </w:pPr>
@@ -14640,7 +16145,7 @@
       <w:pPr>
         <w:numPr>
           <w:ilvl w:val="0"/>
-          <w:numId w:val="1005"/>
+          <w:numId w:val="1008"/>
         </w:numPr>
         <w:pStyle w:val="Compact"/>
       </w:pPr>
@@ -14674,7 +16179,7 @@
       <w:pPr>
         <w:numPr>
           <w:ilvl w:val="0"/>
-          <w:numId w:val="1005"/>
+          <w:numId w:val="1008"/>
         </w:numPr>
         <w:pStyle w:val="Compact"/>
       </w:pPr>
@@ -14692,8 +16197,8 @@
         <w:t xml:space="preserve">— multivariate distance used for outlier detection.</w:t>
       </w:r>
     </w:p>
-    <w:bookmarkEnd w:id="93"/>
-    <w:bookmarkStart w:id="94" w:name="exercises"/>
+    <w:bookmarkEnd w:id="95"/>
+    <w:bookmarkStart w:id="96" w:name="exercises"/>
     <w:p>
       <w:pPr>
         <w:pStyle w:val="Heading2"/>
@@ -14706,7 +16211,7 @@
       <w:pPr>
         <w:numPr>
           <w:ilvl w:val="0"/>
-          <w:numId w:val="1006"/>
+          <w:numId w:val="1009"/>
         </w:numPr>
         <w:pStyle w:val="Compact"/>
       </w:pPr>
@@ -14756,7 +16261,7 @@
       <w:pPr>
         <w:numPr>
           <w:ilvl w:val="0"/>
-          <w:numId w:val="1006"/>
+          <w:numId w:val="1009"/>
         </w:numPr>
         <w:pStyle w:val="Compact"/>
       </w:pPr>
@@ -14832,7 +16337,7 @@
       <w:pPr>
         <w:numPr>
           <w:ilvl w:val="0"/>
-          <w:numId w:val="1006"/>
+          <w:numId w:val="1009"/>
         </w:numPr>
         <w:pStyle w:val="Compact"/>
       </w:pPr>
@@ -14935,7 +16440,7 @@
       <w:pPr>
         <w:numPr>
           <w:ilvl w:val="0"/>
-          <w:numId w:val="1006"/>
+          <w:numId w:val="1009"/>
         </w:numPr>
         <w:pStyle w:val="Compact"/>
       </w:pPr>
@@ -14990,7 +16495,7 @@
       <w:pPr>
         <w:numPr>
           <w:ilvl w:val="0"/>
-          <w:numId w:val="1006"/>
+          <w:numId w:val="1009"/>
         </w:numPr>
         <w:pStyle w:val="Compact"/>
       </w:pPr>
@@ -15134,8 +16639,8 @@
         <w:t xml:space="preserve">for the 1.5 change list.</w:t>
       </w:r>
     </w:p>
-    <w:bookmarkEnd w:id="94"/>
-    <w:bookmarkEnd w:id="95"/>
+    <w:bookmarkEnd w:id="96"/>
+    <w:bookmarkEnd w:id="97"/>
     <w:sectPr/>
   </w:body>
 </w:document>
@@ -15413,7 +16918,34 @@
     <w:abstractNumId w:val="991"/>
   </w:num>
   <w:num w:numId="1003">
-    <w:abstractNumId w:val="991"/>
+    <w:abstractNumId w:val="99411"/>
+    <w:lvlOverride w:ilvl="0">
+      <w:startOverride w:val="1"/>
+    </w:lvlOverride>
+    <w:lvlOverride w:ilvl="1">
+      <w:startOverride w:val="1"/>
+    </w:lvlOverride>
+    <w:lvlOverride w:ilvl="2">
+      <w:startOverride w:val="1"/>
+    </w:lvlOverride>
+    <w:lvlOverride w:ilvl="3">
+      <w:startOverride w:val="1"/>
+    </w:lvlOverride>
+    <w:lvlOverride w:ilvl="4">
+      <w:startOverride w:val="1"/>
+    </w:lvlOverride>
+    <w:lvlOverride w:ilvl="5">
+      <w:startOverride w:val="1"/>
+    </w:lvlOverride>
+    <w:lvlOverride w:ilvl="6">
+      <w:startOverride w:val="1"/>
+    </w:lvlOverride>
+    <w:lvlOverride w:ilvl="7">
+      <w:startOverride w:val="1"/>
+    </w:lvlOverride>
+    <w:lvlOverride w:ilvl="8">
+      <w:startOverride w:val="1"/>
+    </w:lvlOverride>
   </w:num>
   <w:num w:numId="1004">
     <w:abstractNumId w:val="991"/>
@@ -15422,6 +16954,15 @@
     <w:abstractNumId w:val="991"/>
   </w:num>
   <w:num w:numId="1006">
+    <w:abstractNumId w:val="991"/>
+  </w:num>
+  <w:num w:numId="1007">
+    <w:abstractNumId w:val="991"/>
+  </w:num>
+  <w:num w:numId="1008">
+    <w:abstractNumId w:val="991"/>
+  </w:num>
+  <w:num w:numId="1009">
     <w:abstractNumId w:val="99411"/>
     <w:lvlOverride w:ilvl="0">
       <w:startOverride w:val="1"/>

</xml_diff>